<commit_message>
Restore CV fonts and section dividers
</commit_message>
<xml_diff>
--- a/files/CV-Ziqian.docx
+++ b/files/CV-Ziqian.docx
@@ -126,170 +126,26 @@
     <w:p>
       <w:pPr>
         <w:pStyle w:val="Heading2"/>
+        <w:keepNext/>
         <w:ind w:left="-5"/>
       </w:pPr>
       <w:r>
+        <w:rPr>
+          <w:rFonts w:ascii="Trebuchet MS" w:hAnsi="Trebuchet MS" w:eastAsia="Trebuchet MS" w:cs="Trebuchet MS"/>
+          <w:b/>
+          <w:sz w:val="24"/>
+        </w:rPr>
         <w:t xml:space="preserve">EDUCATION </w:t>
       </w:r>
     </w:p>
     <w:p>
       <w:pPr>
         <w:spacing w:after="92"/>
-      </w:pPr>
-      <w:r>
-        <w:rPr>
-          <w:noProof/>
-        </w:rPr>
-        <mc:AlternateContent>
-          <mc:Choice Requires="wpg">
-            <w:drawing>
-              <wp:inline distT="0" distB="0" distL="0" distR="0" wp14:anchorId="5EFD0549" wp14:editId="2BC0BCB4">
-                <wp:extent cx="6857988" cy="13716"/>
-                <wp:effectExtent l="0" t="0" r="0" b="0"/>
-                <wp:docPr id="9745" name="Group 9745"/>
-                <wp:cNvGraphicFramePr/>
-                <a:graphic xmlns:a="http://schemas.openxmlformats.org/drawingml/2006/main">
-                  <a:graphicData uri="http://schemas.microsoft.com/office/word/2010/wordprocessingGroup">
-                    <wpg:wgp>
-                      <wpg:cNvGrpSpPr/>
-                      <wpg:grpSpPr>
-                        <a:xfrm>
-                          <a:off x="0" y="0"/>
-                          <a:ext cx="6857988" cy="13716"/>
-                          <a:chOff x="0" y="0"/>
-                          <a:chExt cx="6857988" cy="13716"/>
-                        </a:xfrm>
-                      </wpg:grpSpPr>
-                      <wps:wsp>
-                        <wps:cNvPr id="11116" name="Shape 11116"/>
-                        <wps:cNvSpPr/>
-                        <wps:spPr>
-                          <a:xfrm>
-                            <a:off x="0" y="0"/>
-                            <a:ext cx="5177790" cy="13716"/>
-                          </a:xfrm>
-                          <a:custGeom>
-                            <a:avLst/>
-                            <a:gdLst/>
-                            <a:ahLst/>
-                            <a:cxnLst/>
-                            <a:rect l="0" t="0" r="0" b="0"/>
-                            <a:pathLst>
-                              <a:path w="5177790" h="13716">
-                                <a:moveTo>
-                                  <a:pt x="0" y="0"/>
-                                </a:moveTo>
-                                <a:lnTo>
-                                  <a:pt x="5177790" y="0"/>
-                                </a:lnTo>
-                                <a:lnTo>
-                                  <a:pt x="5177790" y="13716"/>
-                                </a:lnTo>
-                                <a:lnTo>
-                                  <a:pt x="0" y="13716"/>
-                                </a:lnTo>
-                                <a:lnTo>
-                                  <a:pt x="0" y="0"/>
-                                </a:lnTo>
-                              </a:path>
-                            </a:pathLst>
-                          </a:custGeom>
-                          <a:ln w="0" cap="flat">
-                            <a:miter lim="127000"/>
-                          </a:ln>
-                        </wps:spPr>
-                        <wps:style>
-                          <a:lnRef idx="0">
-                            <a:srgbClr val="000000">
-                              <a:alpha val="0"/>
-                            </a:srgbClr>
-                          </a:lnRef>
-                          <a:fillRef idx="1">
-                            <a:srgbClr val="000000"/>
-                          </a:fillRef>
-                          <a:effectRef idx="0">
-                            <a:scrgbClr r="0" g="0" b="0"/>
-                          </a:effectRef>
-                          <a:fontRef idx="none"/>
-                        </wps:style>
-                        <wps:bodyPr/>
-                      </wps:wsp>
-                      <wps:wsp>
-                        <wps:cNvPr id="11117" name="Shape 11117"/>
-                        <wps:cNvSpPr/>
-                        <wps:spPr>
-                          <a:xfrm>
-                            <a:off x="5177778" y="0"/>
-                            <a:ext cx="1680210" cy="13716"/>
-                          </a:xfrm>
-                          <a:custGeom>
-                            <a:avLst/>
-                            <a:gdLst/>
-                            <a:ahLst/>
-                            <a:cxnLst/>
-                            <a:rect l="0" t="0" r="0" b="0"/>
-                            <a:pathLst>
-                              <a:path w="1680210" h="13716">
-                                <a:moveTo>
-                                  <a:pt x="0" y="0"/>
-                                </a:moveTo>
-                                <a:lnTo>
-                                  <a:pt x="1680210" y="0"/>
-                                </a:lnTo>
-                                <a:lnTo>
-                                  <a:pt x="1680210" y="13716"/>
-                                </a:lnTo>
-                                <a:lnTo>
-                                  <a:pt x="0" y="13716"/>
-                                </a:lnTo>
-                                <a:lnTo>
-                                  <a:pt x="0" y="0"/>
-                                </a:lnTo>
-                              </a:path>
-                            </a:pathLst>
-                          </a:custGeom>
-                          <a:ln w="0" cap="flat">
-                            <a:miter lim="127000"/>
-                          </a:ln>
-                        </wps:spPr>
-                        <wps:style>
-                          <a:lnRef idx="0">
-                            <a:srgbClr val="000000">
-                              <a:alpha val="0"/>
-                            </a:srgbClr>
-                          </a:lnRef>
-                          <a:fillRef idx="1">
-                            <a:srgbClr val="000000"/>
-                          </a:fillRef>
-                          <a:effectRef idx="0">
-                            <a:scrgbClr r="0" g="0" b="0"/>
-                          </a:effectRef>
-                          <a:fontRef idx="none"/>
-                        </wps:style>
-                        <wps:bodyPr/>
-                      </wps:wsp>
-                    </wpg:wgp>
-                  </a:graphicData>
-                </a:graphic>
-              </wp:inline>
-            </w:drawing>
-          </mc:Choice>
-          <mc:Fallback xmlns:a="http://schemas.openxmlformats.org/drawingml/2006/main">
-            <w:pict>
-              <v:group id="Group 9745" style="width:539.999pt;height:1.08002pt;mso-position-horizontal-relative:char;mso-position-vertical-relative:line" coordsize="68579,137">
-                <v:shape id="Shape 11118" style="position:absolute;width:51777;height:137;left:0;top:0;" coordsize="5177790,13716" path="m0,0l5177790,0l5177790,13716l0,13716l0,0">
-                  <v:stroke weight="0pt" endcap="flat" joinstyle="miter" miterlimit="10" on="false" color="#000000" opacity="0"/>
-                  <v:fill on="true" color="#000000"/>
-                </v:shape>
-                <v:shape id="Shape 11119" style="position:absolute;width:16802;height:137;left:51777;top:0;" coordsize="1680210,13716" path="m0,0l1680210,0l1680210,13716l0,13716l0,0">
-                  <v:stroke weight="0pt" endcap="flat" joinstyle="miter" miterlimit="10" on="false" color="#000000" opacity="0"/>
-                  <v:fill on="true" color="#000000"/>
-                </v:shape>
-              </v:group>
-            </w:pict>
-          </mc:Fallback>
-        </mc:AlternateContent>
-      </w:r>
+        <w:keepNext/>
+        <w:pBdr>
+          <w:bottom w:val="single" w:sz="8" w:space="0" w:color="000000"/>
+        </w:pBdr>
+      </w:pPr>
     </w:p>
     <w:p>
       <w:pPr>
@@ -1258,24 +1114,41 @@
     <w:p>
       <w:pPr>
         <w:pStyle w:val="Heading2"/>
+        <w:keepNext/>
         <w:tabs>
           <w:tab w:val="center" w:pos="3601"/>
         </w:tabs>
         <w:ind w:left="-15" w:firstLine="0"/>
       </w:pPr>
       <w:r>
+        <w:rPr>
+          <w:rFonts w:ascii="Trebuchet MS" w:hAnsi="Trebuchet MS" w:eastAsia="Trebuchet MS" w:cs="Trebuchet MS"/>
+          <w:b/>
+          <w:sz w:val="24"/>
+        </w:rPr>
         <w:t xml:space="preserve">LAB </w:t>
       </w:r>
       <w:r>
+        <w:rPr>
+          <w:rFonts w:ascii="Trebuchet MS" w:hAnsi="Trebuchet MS" w:eastAsia="Trebuchet MS" w:cs="Trebuchet MS"/>
+          <w:b/>
+          <w:sz w:val="24"/>
+        </w:rPr>
         <w:t>POSITIONS</w:t>
       </w:r>
       <w:r>
+        <w:rPr>
+          <w:rFonts w:ascii="Trebuchet MS" w:hAnsi="Trebuchet MS" w:eastAsia="Trebuchet MS" w:cs="Trebuchet MS"/>
+          <w:b/>
+          <w:sz w:val="24"/>
+        </w:rPr>
         <w:tab/>
       </w:r>
       <w:r>
         <w:rPr>
-          <w:b w:val="0"/>
-          <w:sz w:val="20"/>
+          <w:rFonts w:ascii="Trebuchet MS" w:hAnsi="Trebuchet MS" w:eastAsia="Trebuchet MS" w:cs="Trebuchet MS"/>
+          <w:b/>
+          <w:sz w:val="24"/>
         </w:rPr>
         <w:t xml:space="preserve"> </w:t>
       </w:r>
@@ -1283,162 +1156,11 @@
     <w:p>
       <w:pPr>
         <w:spacing w:after="107"/>
-      </w:pPr>
-      <w:r>
-        <w:rPr>
-          <w:noProof/>
-        </w:rPr>
-        <mc:AlternateContent>
-          <mc:Choice Requires="wpg">
-            <w:drawing>
-              <wp:inline distT="0" distB="0" distL="0" distR="0" wp14:anchorId="22AF5821" wp14:editId="3BD4ABB3">
-                <wp:extent cx="6857988" cy="13716"/>
-                <wp:effectExtent l="0" t="0" r="0" b="0"/>
-                <wp:docPr id="1749593443" name="Group 9746"/>
-                <wp:cNvGraphicFramePr/>
-                <a:graphic xmlns:a="http://schemas.openxmlformats.org/drawingml/2006/main">
-                  <a:graphicData uri="http://schemas.microsoft.com/office/word/2010/wordprocessingGroup">
-                    <wpg:wgp>
-                      <wpg:cNvGrpSpPr/>
-                      <wpg:grpSpPr>
-                        <a:xfrm>
-                          <a:off x="0" y="0"/>
-                          <a:ext cx="6857988" cy="13716"/>
-                          <a:chOff x="0" y="0"/>
-                          <a:chExt cx="6857988" cy="13716"/>
-                        </a:xfrm>
-                      </wpg:grpSpPr>
-                      <wps:wsp>
-                        <wps:cNvPr id="1854374331" name="Shape 11120"/>
-                        <wps:cNvSpPr/>
-                        <wps:spPr>
-                          <a:xfrm>
-                            <a:off x="0" y="0"/>
-                            <a:ext cx="5177790" cy="13716"/>
-                          </a:xfrm>
-                          <a:custGeom>
-                            <a:avLst/>
-                            <a:gdLst/>
-                            <a:ahLst/>
-                            <a:cxnLst/>
-                            <a:rect l="0" t="0" r="0" b="0"/>
-                            <a:pathLst>
-                              <a:path w="5177790" h="13716">
-                                <a:moveTo>
-                                  <a:pt x="0" y="0"/>
-                                </a:moveTo>
-                                <a:lnTo>
-                                  <a:pt x="5177790" y="0"/>
-                                </a:lnTo>
-                                <a:lnTo>
-                                  <a:pt x="5177790" y="13716"/>
-                                </a:lnTo>
-                                <a:lnTo>
-                                  <a:pt x="0" y="13716"/>
-                                </a:lnTo>
-                                <a:lnTo>
-                                  <a:pt x="0" y="0"/>
-                                </a:lnTo>
-                              </a:path>
-                            </a:pathLst>
-                          </a:custGeom>
-                          <a:ln w="0" cap="flat">
-                            <a:miter lim="127000"/>
-                          </a:ln>
-                        </wps:spPr>
-                        <wps:style>
-                          <a:lnRef idx="0">
-                            <a:srgbClr val="000000">
-                              <a:alpha val="0"/>
-                            </a:srgbClr>
-                          </a:lnRef>
-                          <a:fillRef idx="1">
-                            <a:srgbClr val="000000"/>
-                          </a:fillRef>
-                          <a:effectRef idx="0">
-                            <a:scrgbClr r="0" g="0" b="0"/>
-                          </a:effectRef>
-                          <a:fontRef idx="none"/>
-                        </wps:style>
-                        <wps:bodyPr/>
-                      </wps:wsp>
-                      <wps:wsp>
-                        <wps:cNvPr id="1164706997" name="Shape 11121"/>
-                        <wps:cNvSpPr/>
-                        <wps:spPr>
-                          <a:xfrm>
-                            <a:off x="5177778" y="0"/>
-                            <a:ext cx="1680210" cy="13716"/>
-                          </a:xfrm>
-                          <a:custGeom>
-                            <a:avLst/>
-                            <a:gdLst/>
-                            <a:ahLst/>
-                            <a:cxnLst/>
-                            <a:rect l="0" t="0" r="0" b="0"/>
-                            <a:pathLst>
-                              <a:path w="1680210" h="13716">
-                                <a:moveTo>
-                                  <a:pt x="0" y="0"/>
-                                </a:moveTo>
-                                <a:lnTo>
-                                  <a:pt x="1680210" y="0"/>
-                                </a:lnTo>
-                                <a:lnTo>
-                                  <a:pt x="1680210" y="13716"/>
-                                </a:lnTo>
-                                <a:lnTo>
-                                  <a:pt x="0" y="13716"/>
-                                </a:lnTo>
-                                <a:lnTo>
-                                  <a:pt x="0" y="0"/>
-                                </a:lnTo>
-                              </a:path>
-                            </a:pathLst>
-                          </a:custGeom>
-                          <a:ln w="0" cap="flat">
-                            <a:miter lim="127000"/>
-                          </a:ln>
-                        </wps:spPr>
-                        <wps:style>
-                          <a:lnRef idx="0">
-                            <a:srgbClr val="000000">
-                              <a:alpha val="0"/>
-                            </a:srgbClr>
-                          </a:lnRef>
-                          <a:fillRef idx="1">
-                            <a:srgbClr val="000000"/>
-                          </a:fillRef>
-                          <a:effectRef idx="0">
-                            <a:scrgbClr r="0" g="0" b="0"/>
-                          </a:effectRef>
-                          <a:fontRef idx="none"/>
-                        </wps:style>
-                        <wps:bodyPr/>
-                      </wps:wsp>
-                    </wpg:wgp>
-                  </a:graphicData>
-                </a:graphic>
-              </wp:inline>
-            </w:drawing>
-          </mc:Choice>
-          <mc:Fallback>
-            <w:pict>
-              <v:group w14:anchorId="28E0D6A4" id="Group 9746" o:spid="_x0000_s1026" style="width:540pt;height:1.1pt;mso-position-horizontal-relative:char;mso-position-vertical-relative:line" coordsize="68579,137" o:gfxdata="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">
-                <v:shape id="Shape 11120" o:spid="_x0000_s1027" style="position:absolute;width:51777;height:137;visibility:visible;mso-wrap-style:square;v-text-anchor:top" coordsize="5177790,13716" o:gfxdata="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" path="m,l5177790,r,13716l,13716,,e" fillcolor="black" stroked="f" strokeweight="0">
-                  <v:stroke miterlimit="83231f" joinstyle="miter"/>
-                  <v:path arrowok="t" textboxrect="0,0,5177790,13716"/>
-                </v:shape>
-                <v:shape id="Shape 11121" o:spid="_x0000_s1028" style="position:absolute;left:51777;width:16802;height:137;visibility:visible;mso-wrap-style:square;v-text-anchor:top" coordsize="1680210,13716" o:gfxdata="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" path="m,l1680210,r,13716l,13716,,e" fillcolor="black" stroked="f" strokeweight="0">
-                  <v:stroke miterlimit="83231f" joinstyle="miter"/>
-                  <v:path arrowok="t" textboxrect="0,0,1680210,13716"/>
-                </v:shape>
-                <w10:anchorlock/>
-              </v:group>
-            </w:pict>
-          </mc:Fallback>
-        </mc:AlternateContent>
-      </w:r>
+        <w:keepNext/>
+        <w:pBdr>
+          <w:bottom w:val="single" w:sz="8" w:space="0" w:color="000000"/>
+        </w:pBdr>
+      </w:pPr>
     </w:p>
     <w:p>
       <w:pPr>
@@ -2104,22 +1826,34 @@
     <w:p>
       <w:pPr>
         <w:pStyle w:val="Heading2"/>
+        <w:keepNext/>
         <w:tabs>
           <w:tab w:val="center" w:pos="3601"/>
         </w:tabs>
         <w:ind w:left="-15" w:firstLine="0"/>
       </w:pPr>
       <w:r>
+        <w:rPr>
+          <w:rFonts w:ascii="Trebuchet MS" w:hAnsi="Trebuchet MS" w:eastAsia="Trebuchet MS" w:cs="Trebuchet MS"/>
+          <w:b/>
+          <w:sz w:val="24"/>
+        </w:rPr>
         <w:lastRenderedPageBreak/>
         <w:t xml:space="preserve">RESEARCH INTERESTS </w:t>
       </w:r>
       <w:r>
+        <w:rPr>
+          <w:rFonts w:ascii="Trebuchet MS" w:hAnsi="Trebuchet MS" w:eastAsia="Trebuchet MS" w:cs="Trebuchet MS"/>
+          <w:b/>
+          <w:sz w:val="24"/>
+        </w:rPr>
         <w:tab/>
       </w:r>
       <w:r>
         <w:rPr>
-          <w:b w:val="0"/>
-          <w:sz w:val="20"/>
+          <w:rFonts w:ascii="Trebuchet MS" w:hAnsi="Trebuchet MS" w:eastAsia="Trebuchet MS" w:cs="Trebuchet MS"/>
+          <w:b/>
+          <w:sz w:val="24"/>
         </w:rPr>
         <w:t xml:space="preserve"> </w:t>
       </w:r>
@@ -2127,161 +1861,11 @@
     <w:p>
       <w:pPr>
         <w:spacing w:after="107"/>
-      </w:pPr>
-      <w:r>
-        <w:rPr>
-          <w:noProof/>
-        </w:rPr>
-        <mc:AlternateContent>
-          <mc:Choice Requires="wpg">
-            <w:drawing>
-              <wp:inline distT="0" distB="0" distL="0" distR="0" wp14:anchorId="1C14108C" wp14:editId="48CB8574">
-                <wp:extent cx="6857988" cy="13716"/>
-                <wp:effectExtent l="0" t="0" r="0" b="0"/>
-                <wp:docPr id="9746" name="Group 9746"/>
-                <wp:cNvGraphicFramePr/>
-                <a:graphic xmlns:a="http://schemas.openxmlformats.org/drawingml/2006/main">
-                  <a:graphicData uri="http://schemas.microsoft.com/office/word/2010/wordprocessingGroup">
-                    <wpg:wgp>
-                      <wpg:cNvGrpSpPr/>
-                      <wpg:grpSpPr>
-                        <a:xfrm>
-                          <a:off x="0" y="0"/>
-                          <a:ext cx="6857988" cy="13716"/>
-                          <a:chOff x="0" y="0"/>
-                          <a:chExt cx="6857988" cy="13716"/>
-                        </a:xfrm>
-                      </wpg:grpSpPr>
-                      <wps:wsp>
-                        <wps:cNvPr id="11120" name="Shape 11120"/>
-                        <wps:cNvSpPr/>
-                        <wps:spPr>
-                          <a:xfrm>
-                            <a:off x="0" y="0"/>
-                            <a:ext cx="5177790" cy="13716"/>
-                          </a:xfrm>
-                          <a:custGeom>
-                            <a:avLst/>
-                            <a:gdLst/>
-                            <a:ahLst/>
-                            <a:cxnLst/>
-                            <a:rect l="0" t="0" r="0" b="0"/>
-                            <a:pathLst>
-                              <a:path w="5177790" h="13716">
-                                <a:moveTo>
-                                  <a:pt x="0" y="0"/>
-                                </a:moveTo>
-                                <a:lnTo>
-                                  <a:pt x="5177790" y="0"/>
-                                </a:lnTo>
-                                <a:lnTo>
-                                  <a:pt x="5177790" y="13716"/>
-                                </a:lnTo>
-                                <a:lnTo>
-                                  <a:pt x="0" y="13716"/>
-                                </a:lnTo>
-                                <a:lnTo>
-                                  <a:pt x="0" y="0"/>
-                                </a:lnTo>
-                              </a:path>
-                            </a:pathLst>
-                          </a:custGeom>
-                          <a:ln w="0" cap="flat">
-                            <a:miter lim="127000"/>
-                          </a:ln>
-                        </wps:spPr>
-                        <wps:style>
-                          <a:lnRef idx="0">
-                            <a:srgbClr val="000000">
-                              <a:alpha val="0"/>
-                            </a:srgbClr>
-                          </a:lnRef>
-                          <a:fillRef idx="1">
-                            <a:srgbClr val="000000"/>
-                          </a:fillRef>
-                          <a:effectRef idx="0">
-                            <a:scrgbClr r="0" g="0" b="0"/>
-                          </a:effectRef>
-                          <a:fontRef idx="none"/>
-                        </wps:style>
-                        <wps:bodyPr/>
-                      </wps:wsp>
-                      <wps:wsp>
-                        <wps:cNvPr id="11121" name="Shape 11121"/>
-                        <wps:cNvSpPr/>
-                        <wps:spPr>
-                          <a:xfrm>
-                            <a:off x="5177778" y="0"/>
-                            <a:ext cx="1680210" cy="13716"/>
-                          </a:xfrm>
-                          <a:custGeom>
-                            <a:avLst/>
-                            <a:gdLst/>
-                            <a:ahLst/>
-                            <a:cxnLst/>
-                            <a:rect l="0" t="0" r="0" b="0"/>
-                            <a:pathLst>
-                              <a:path w="1680210" h="13716">
-                                <a:moveTo>
-                                  <a:pt x="0" y="0"/>
-                                </a:moveTo>
-                                <a:lnTo>
-                                  <a:pt x="1680210" y="0"/>
-                                </a:lnTo>
-                                <a:lnTo>
-                                  <a:pt x="1680210" y="13716"/>
-                                </a:lnTo>
-                                <a:lnTo>
-                                  <a:pt x="0" y="13716"/>
-                                </a:lnTo>
-                                <a:lnTo>
-                                  <a:pt x="0" y="0"/>
-                                </a:lnTo>
-                              </a:path>
-                            </a:pathLst>
-                          </a:custGeom>
-                          <a:ln w="0" cap="flat">
-                            <a:miter lim="127000"/>
-                          </a:ln>
-                        </wps:spPr>
-                        <wps:style>
-                          <a:lnRef idx="0">
-                            <a:srgbClr val="000000">
-                              <a:alpha val="0"/>
-                            </a:srgbClr>
-                          </a:lnRef>
-                          <a:fillRef idx="1">
-                            <a:srgbClr val="000000"/>
-                          </a:fillRef>
-                          <a:effectRef idx="0">
-                            <a:scrgbClr r="0" g="0" b="0"/>
-                          </a:effectRef>
-                          <a:fontRef idx="none"/>
-                        </wps:style>
-                        <wps:bodyPr/>
-                      </wps:wsp>
-                    </wpg:wgp>
-                  </a:graphicData>
-                </a:graphic>
-              </wp:inline>
-            </w:drawing>
-          </mc:Choice>
-          <mc:Fallback xmlns:a="http://schemas.openxmlformats.org/drawingml/2006/main">
-            <w:pict>
-              <v:group id="Group 9746" style="width:539.999pt;height:1.08002pt;mso-position-horizontal-relative:char;mso-position-vertical-relative:line" coordsize="68579,137">
-                <v:shape id="Shape 11122" style="position:absolute;width:51777;height:137;left:0;top:0;" coordsize="5177790,13716" path="m0,0l5177790,0l5177790,13716l0,13716l0,0">
-                  <v:stroke weight="0pt" endcap="flat" joinstyle="miter" miterlimit="10" on="false" color="#000000" opacity="0"/>
-                  <v:fill on="true" color="#000000"/>
-                </v:shape>
-                <v:shape id="Shape 11123" style="position:absolute;width:16802;height:137;left:51777;top:0;" coordsize="1680210,13716" path="m0,0l1680210,0l1680210,13716l0,13716l0,0">
-                  <v:stroke weight="0pt" endcap="flat" joinstyle="miter" miterlimit="10" on="false" color="#000000" opacity="0"/>
-                  <v:fill on="true" color="#000000"/>
-                </v:shape>
-              </v:group>
-            </w:pict>
-          </mc:Fallback>
-        </mc:AlternateContent>
-      </w:r>
+        <w:keepNext/>
+        <w:pBdr>
+          <w:bottom w:val="single" w:sz="8" w:space="0" w:color="000000"/>
+        </w:pBdr>
+      </w:pPr>
     </w:p>
     <w:p>
       <w:pPr>
@@ -2317,6 +1901,7 @@
     <w:p>
       <w:pPr>
         <w:pStyle w:val="Heading2"/>
+        <w:keepNext/>
         <w:tabs>
           <w:tab w:val="center" w:pos="3601"/>
           <w:tab w:val="center" w:pos="8155"/>
@@ -2324,12 +1909,18 @@
         <w:ind w:left="-15" w:firstLine="0"/>
       </w:pPr>
       <w:r>
+        <w:rPr>
+          <w:rFonts w:ascii="Trebuchet MS" w:hAnsi="Trebuchet MS" w:eastAsia="Trebuchet MS" w:cs="Trebuchet MS"/>
+          <w:b/>
+          <w:sz w:val="24"/>
+        </w:rPr>
         <w:t>PUBLICATIONS</w:t>
       </w:r>
       <w:r>
         <w:rPr>
-          <w:b w:val="0"/>
-          <w:sz w:val="20"/>
+          <w:rFonts w:ascii="Trebuchet MS" w:hAnsi="Trebuchet MS" w:eastAsia="Trebuchet MS" w:cs="Trebuchet MS"/>
+          <w:b/>
+          <w:sz w:val="24"/>
         </w:rPr>
         <w:tab/>
         <w:t xml:space="preserve"> </w:t>
@@ -2341,144 +1932,11 @@
         <w:rPr>
           <w:rFonts w:eastAsiaTheme="minorEastAsia"/>
         </w:rPr>
-      </w:pPr>
-      <w:r>
-        <w:rPr>
-          <w:noProof/>
-        </w:rPr>
-        <mc:AlternateContent>
-          <mc:Choice Requires="wpg">
-            <w:drawing>
-              <wp:inline distT="0" distB="0" distL="0" distR="0" wp14:anchorId="2FDB0967" wp14:editId="010476CF">
-                <wp:extent cx="6857988" cy="13716"/>
-                <wp:effectExtent l="0" t="0" r="0" b="0"/>
-                <wp:docPr id="11" name="Group 9747"/>
-                <wp:cNvGraphicFramePr/>
-                <a:graphic xmlns:a="http://schemas.openxmlformats.org/drawingml/2006/main">
-                  <a:graphicData uri="http://schemas.microsoft.com/office/word/2010/wordprocessingGroup">
-                    <wpg:wgp>
-                      <wpg:cNvGrpSpPr/>
-                      <wpg:grpSpPr>
-                        <a:xfrm>
-                          <a:off x="0" y="0"/>
-                          <a:ext cx="6857988" cy="13716"/>
-                          <a:chOff x="0" y="0"/>
-                          <a:chExt cx="6857988" cy="13716"/>
-                        </a:xfrm>
-                      </wpg:grpSpPr>
-                      <wps:wsp>
-                        <wps:cNvPr id="12" name="Shape 11124"/>
-                        <wps:cNvSpPr/>
-                        <wps:spPr>
-                          <a:xfrm>
-                            <a:off x="0" y="0"/>
-                            <a:ext cx="5177790" cy="13716"/>
-                          </a:xfrm>
-                          <a:custGeom>
-                            <a:avLst/>
-                            <a:gdLst/>
-                            <a:ahLst/>
-                            <a:cxnLst/>
-                            <a:rect l="0" t="0" r="0" b="0"/>
-                            <a:pathLst>
-                              <a:path w="5177790" h="13716">
-                                <a:moveTo>
-                                  <a:pt x="0" y="0"/>
-                                </a:moveTo>
-                                <a:lnTo>
-                                  <a:pt x="5177790" y="0"/>
-                                </a:lnTo>
-                                <a:lnTo>
-                                  <a:pt x="5177790" y="13716"/>
-                                </a:lnTo>
-                                <a:lnTo>
-                                  <a:pt x="0" y="13716"/>
-                                </a:lnTo>
-                                <a:lnTo>
-                                  <a:pt x="0" y="0"/>
-                                </a:lnTo>
-                              </a:path>
-                            </a:pathLst>
-                          </a:custGeom>
-                          <a:solidFill>
-                            <a:srgbClr val="000000"/>
-                          </a:solidFill>
-                          <a:ln w="0" cap="flat">
-                            <a:noFill/>
-                            <a:miter lim="127000"/>
-                          </a:ln>
-                          <a:effectLst/>
-                        </wps:spPr>
-                        <wps:bodyPr/>
-                      </wps:wsp>
-                      <wps:wsp>
-                        <wps:cNvPr id="13" name="Shape 11125"/>
-                        <wps:cNvSpPr/>
-                        <wps:spPr>
-                          <a:xfrm>
-                            <a:off x="5177778" y="0"/>
-                            <a:ext cx="1680210" cy="13716"/>
-                          </a:xfrm>
-                          <a:custGeom>
-                            <a:avLst/>
-                            <a:gdLst/>
-                            <a:ahLst/>
-                            <a:cxnLst/>
-                            <a:rect l="0" t="0" r="0" b="0"/>
-                            <a:pathLst>
-                              <a:path w="1680210" h="13716">
-                                <a:moveTo>
-                                  <a:pt x="0" y="0"/>
-                                </a:moveTo>
-                                <a:lnTo>
-                                  <a:pt x="1680210" y="0"/>
-                                </a:lnTo>
-                                <a:lnTo>
-                                  <a:pt x="1680210" y="13716"/>
-                                </a:lnTo>
-                                <a:lnTo>
-                                  <a:pt x="0" y="13716"/>
-                                </a:lnTo>
-                                <a:lnTo>
-                                  <a:pt x="0" y="0"/>
-                                </a:lnTo>
-                              </a:path>
-                            </a:pathLst>
-                          </a:custGeom>
-                          <a:solidFill>
-                            <a:srgbClr val="000000"/>
-                          </a:solidFill>
-                          <a:ln w="0" cap="flat">
-                            <a:noFill/>
-                            <a:miter lim="127000"/>
-                          </a:ln>
-                          <a:effectLst/>
-                        </wps:spPr>
-                        <wps:bodyPr/>
-                      </wps:wsp>
-                    </wpg:wgp>
-                  </a:graphicData>
-                </a:graphic>
-              </wp:inline>
-            </w:drawing>
-          </mc:Choice>
-          <mc:Fallback>
-            <w:pict>
-              <v:group w14:anchorId="43300E24" id="Group 9747" o:spid="_x0000_s1026" style="width:540pt;height:1.1pt;mso-position-horizontal-relative:char;mso-position-vertical-relative:line" coordsize="68579,137" o:gfxdata="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">
-                <v:shape id="Shape 11124" o:spid="_x0000_s1027" style="position:absolute;width:51777;height:137;visibility:visible;mso-wrap-style:square;v-text-anchor:top" coordsize="5177790,13716" o:gfxdata="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" path="m,l5177790,r,13716l,13716,,e" fillcolor="black" stroked="f" strokeweight="0">
-                  <v:stroke miterlimit="83231f" joinstyle="miter"/>
-                  <v:path arrowok="t" textboxrect="0,0,5177790,13716"/>
-                </v:shape>
-                <v:shape id="Shape 11125" o:spid="_x0000_s1028" style="position:absolute;left:51777;width:16802;height:137;visibility:visible;mso-wrap-style:square;v-text-anchor:top" coordsize="1680210,13716" o:gfxdata="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" path="m,l1680210,r,13716l,13716,,e" fillcolor="black" stroked="f" strokeweight="0">
-                  <v:stroke miterlimit="83231f" joinstyle="miter"/>
-                  <v:path arrowok="t" textboxrect="0,0,1680210,13716"/>
-                </v:shape>
-                <w10:anchorlock/>
-              </v:group>
-            </w:pict>
-          </mc:Fallback>
-        </mc:AlternateContent>
-      </w:r>
+        <w:keepNext/>
+        <w:pBdr>
+          <w:bottom w:val="single" w:sz="8" w:space="0" w:color="000000"/>
+        </w:pBdr>
+      </w:pPr>
     </w:p>
     <w:p>
       <w:pPr>
@@ -2494,10 +1952,10 @@
       </w:pPr>
       <w:r>
         <w:rPr>
-          <w:rFonts w:ascii="Arial" w:hAnsi="Arial"/>
+          <w:rFonts w:ascii="Calibri" w:hAnsi="Calibri" w:eastAsia="Calibri" w:cs="Calibri"/>
           <w:b/>
           <w:i/>
-          <w:sz w:val="20"/>
+          <w:sz w:val="22"/>
           <w:u w:val="none"/>
         </w:rPr>
         <w:t>Working Papers</w:t>
@@ -2519,79 +1977,79 @@
       </w:pPr>
       <w:r>
         <w:rPr>
-          <w:rFonts w:ascii="Arial" w:hAnsi="Arial"/>
+          <w:rFonts w:ascii="Calibri" w:hAnsi="Calibri" w:eastAsia="Calibri" w:cs="Calibri"/>
           <w:b w:val="0"/>
           <w:i w:val="0"/>
-          <w:sz w:val="20"/>
+          <w:sz w:val="22"/>
           <w:u w:val="none"/>
         </w:rPr>
       </w:r>
       <w:r>
         <w:rPr>
-          <w:rFonts w:ascii="Arial" w:hAnsi="Arial"/>
+          <w:rFonts w:ascii="Calibri" w:hAnsi="Calibri" w:eastAsia="Calibri" w:cs="Calibri"/>
           <w:b/>
           <w:i w:val="0"/>
-          <w:sz w:val="20"/>
+          <w:sz w:val="22"/>
           <w:u w:val="single"/>
         </w:rPr>
         <w:t>Xia, Z.</w:t>
       </w:r>
       <w:r>
         <w:rPr>
-          <w:rFonts w:ascii="Arial" w:hAnsi="Arial"/>
+          <w:rFonts w:ascii="Calibri" w:hAnsi="Calibri" w:eastAsia="Calibri" w:cs="Calibri"/>
           <w:b w:val="0"/>
           <w:i w:val="0"/>
-          <w:sz w:val="20"/>
+          <w:sz w:val="22"/>
           <w:u w:val="none"/>
         </w:rPr>
         <w:t>, Ding, J., Geiger, N., Ye, J., Zhang, C., ... &amp; Nielsen, K. S.</w:t>
       </w:r>
       <w:r>
         <w:rPr>
-          <w:rFonts w:ascii="Arial" w:hAnsi="Arial"/>
+          <w:rFonts w:ascii="Calibri" w:hAnsi="Calibri" w:eastAsia="Calibri" w:cs="Calibri"/>
           <w:b w:val="0"/>
           <w:i w:val="0"/>
-          <w:sz w:val="20"/>
+          <w:sz w:val="22"/>
           <w:u w:val="none"/>
         </w:rPr>
         <w:t xml:space="preserve"> (Working paper). </w:t>
       </w:r>
       <w:r>
         <w:rPr>
-          <w:rFonts w:ascii="Arial" w:hAnsi="Arial"/>
+          <w:rFonts w:ascii="Calibri" w:hAnsi="Calibri" w:eastAsia="Calibri" w:cs="Calibri"/>
           <w:b w:val="0"/>
           <w:i w:val="0"/>
-          <w:sz w:val="20"/>
+          <w:sz w:val="22"/>
           <w:u w:val="none"/>
         </w:rPr>
         <w:t xml:space="preserve">A meta-analysis of the real-world impact of sustainability labeling on consumer choices. </w:t>
       </w:r>
       <w:r>
         <w:rPr>
-          <w:rFonts w:ascii="Arial" w:hAnsi="Arial"/>
+          <w:rFonts w:ascii="Calibri" w:hAnsi="Calibri" w:eastAsia="Calibri" w:cs="Calibri"/>
           <w:b w:val="0"/>
           <w:i w:val="0"/>
-          <w:sz w:val="20"/>
+          <w:sz w:val="22"/>
           <w:u w:val="none"/>
         </w:rPr>
         <w:t xml:space="preserve">Under revision at </w:t>
       </w:r>
       <w:r>
         <w:rPr>
-          <w:rFonts w:ascii="Arial" w:hAnsi="Arial"/>
+          <w:rFonts w:ascii="Calibri" w:hAnsi="Calibri" w:eastAsia="Calibri" w:cs="Calibri"/>
           <w:b/>
           <w:i/>
-          <w:sz w:val="20"/>
+          <w:sz w:val="22"/>
           <w:u w:val="none"/>
         </w:rPr>
         <w:t>PNAS Nexus</w:t>
       </w:r>
       <w:r>
         <w:rPr>
-          <w:rFonts w:ascii="Arial" w:hAnsi="Arial"/>
+          <w:rFonts w:ascii="Calibri" w:hAnsi="Calibri" w:eastAsia="Calibri" w:cs="Calibri"/>
           <w:b w:val="0"/>
           <w:i w:val="0"/>
-          <w:sz w:val="20"/>
+          <w:sz w:val="22"/>
           <w:u w:val="none"/>
         </w:rPr>
         <w:t>.</w:t>
@@ -2613,79 +2071,79 @@
       </w:pPr>
       <w:r>
         <w:rPr>
-          <w:rFonts w:ascii="Arial" w:hAnsi="Arial"/>
+          <w:rFonts w:ascii="Calibri" w:hAnsi="Calibri" w:eastAsia="Calibri" w:cs="Calibri"/>
           <w:b w:val="0"/>
           <w:i w:val="0"/>
-          <w:sz w:val="20"/>
+          <w:sz w:val="22"/>
           <w:u w:val="none"/>
         </w:rPr>
       </w:r>
       <w:r>
         <w:rPr>
-          <w:rFonts w:ascii="Arial" w:hAnsi="Arial"/>
+          <w:rFonts w:ascii="Calibri" w:hAnsi="Calibri" w:eastAsia="Calibri" w:cs="Calibri"/>
           <w:b/>
           <w:i w:val="0"/>
-          <w:sz w:val="20"/>
+          <w:sz w:val="22"/>
           <w:u w:val="single"/>
         </w:rPr>
         <w:t>Xia, Z.</w:t>
       </w:r>
       <w:r>
         <w:rPr>
-          <w:rFonts w:ascii="Arial" w:hAnsi="Arial"/>
+          <w:rFonts w:ascii="Calibri" w:hAnsi="Calibri" w:eastAsia="Calibri" w:cs="Calibri"/>
           <w:b w:val="0"/>
           <w:i w:val="0"/>
-          <w:sz w:val="20"/>
+          <w:sz w:val="22"/>
           <w:u w:val="none"/>
         </w:rPr>
         <w:t>, Dubey, R., &amp; Constantino, S. M.</w:t>
       </w:r>
       <w:r>
         <w:rPr>
-          <w:rFonts w:ascii="Arial" w:hAnsi="Arial"/>
+          <w:rFonts w:ascii="Calibri" w:hAnsi="Calibri" w:eastAsia="Calibri" w:cs="Calibri"/>
           <w:b w:val="0"/>
           <w:i w:val="0"/>
-          <w:sz w:val="20"/>
+          <w:sz w:val="22"/>
           <w:u w:val="none"/>
         </w:rPr>
         <w:t xml:space="preserve"> (Working paper). </w:t>
       </w:r>
       <w:r>
         <w:rPr>
-          <w:rFonts w:ascii="Arial" w:hAnsi="Arial"/>
+          <w:rFonts w:ascii="Calibri" w:hAnsi="Calibri" w:eastAsia="Calibri" w:cs="Calibri"/>
           <w:b w:val="0"/>
           <w:i w:val="0"/>
-          <w:sz w:val="20"/>
+          <w:sz w:val="22"/>
           <w:u w:val="none"/>
         </w:rPr>
         <w:t xml:space="preserve">Public insensitivity to Paris temperature targets. </w:t>
       </w:r>
       <w:r>
         <w:rPr>
-          <w:rFonts w:ascii="Arial" w:hAnsi="Arial"/>
+          <w:rFonts w:ascii="Calibri" w:hAnsi="Calibri" w:eastAsia="Calibri" w:cs="Calibri"/>
           <w:b w:val="0"/>
           <w:i w:val="0"/>
-          <w:sz w:val="20"/>
+          <w:sz w:val="22"/>
           <w:u w:val="none"/>
         </w:rPr>
         <w:t xml:space="preserve">Under revision at </w:t>
       </w:r>
       <w:r>
         <w:rPr>
-          <w:rFonts w:ascii="Arial" w:hAnsi="Arial"/>
+          <w:rFonts w:ascii="Calibri" w:hAnsi="Calibri" w:eastAsia="Calibri" w:cs="Calibri"/>
           <w:b/>
           <w:i/>
-          <w:sz w:val="20"/>
+          <w:sz w:val="22"/>
           <w:u w:val="none"/>
         </w:rPr>
         <w:t>PNAS Nexus</w:t>
       </w:r>
       <w:r>
         <w:rPr>
-          <w:rFonts w:ascii="Arial" w:hAnsi="Arial"/>
+          <w:rFonts w:ascii="Calibri" w:hAnsi="Calibri" w:eastAsia="Calibri" w:cs="Calibri"/>
           <w:b w:val="0"/>
           <w:i w:val="0"/>
-          <w:sz w:val="20"/>
+          <w:sz w:val="22"/>
           <w:u w:val="none"/>
         </w:rPr>
         <w:t>.</w:t>
@@ -2705,10 +2163,10 @@
       </w:pPr>
       <w:r>
         <w:rPr>
-          <w:rFonts w:ascii="Arial" w:hAnsi="Arial"/>
+          <w:rFonts w:ascii="Calibri" w:hAnsi="Calibri" w:eastAsia="Calibri" w:cs="Calibri"/>
           <w:b/>
           <w:i/>
-          <w:sz w:val="20"/>
+          <w:sz w:val="22"/>
           <w:u w:val="none"/>
         </w:rPr>
         <w:t>Published Journal Papers (by Recency)</w:t>
@@ -2730,70 +2188,70 @@
       </w:pPr>
       <w:r>
         <w:rPr>
-          <w:rFonts w:ascii="Arial" w:hAnsi="Arial"/>
+          <w:rFonts w:ascii="Calibri" w:hAnsi="Calibri" w:eastAsia="Calibri" w:cs="Calibri"/>
           <w:b w:val="0"/>
           <w:i w:val="0"/>
-          <w:sz w:val="20"/>
+          <w:sz w:val="22"/>
           <w:u w:val="none"/>
         </w:rPr>
         <w:t xml:space="preserve">Li, M., Lenzen, M., Chen, B., Wang, P., Block, K., </w:t>
       </w:r>
       <w:r>
         <w:rPr>
-          <w:rFonts w:ascii="Arial" w:hAnsi="Arial"/>
+          <w:rFonts w:ascii="Calibri" w:hAnsi="Calibri" w:eastAsia="Calibri" w:cs="Calibri"/>
           <w:b/>
           <w:i w:val="0"/>
-          <w:sz w:val="20"/>
+          <w:sz w:val="22"/>
           <w:u w:val="single"/>
         </w:rPr>
         <w:t>Xia, Z.</w:t>
       </w:r>
       <w:r>
         <w:rPr>
-          <w:rFonts w:ascii="Arial" w:hAnsi="Arial"/>
+          <w:rFonts w:ascii="Calibri" w:hAnsi="Calibri" w:eastAsia="Calibri" w:cs="Calibri"/>
           <w:b w:val="0"/>
           <w:i w:val="0"/>
-          <w:sz w:val="20"/>
+          <w:sz w:val="22"/>
           <w:u w:val="none"/>
         </w:rPr>
         <w:t>, ... &amp; Wang, Y.</w:t>
       </w:r>
       <w:r>
         <w:rPr>
-          <w:rFonts w:ascii="Arial" w:hAnsi="Arial"/>
+          <w:rFonts w:ascii="Calibri" w:hAnsi="Calibri" w:eastAsia="Calibri" w:cs="Calibri"/>
           <w:b w:val="0"/>
           <w:i w:val="0"/>
-          <w:sz w:val="20"/>
+          <w:sz w:val="22"/>
           <w:u w:val="none"/>
         </w:rPr>
         <w:t xml:space="preserve"> (2026). </w:t>
       </w:r>
       <w:r>
         <w:rPr>
-          <w:rFonts w:ascii="Arial" w:hAnsi="Arial"/>
+          <w:rFonts w:ascii="Calibri" w:hAnsi="Calibri" w:eastAsia="Calibri" w:cs="Calibri"/>
           <w:b w:val="0"/>
           <w:i w:val="0"/>
-          <w:sz w:val="20"/>
+          <w:sz w:val="22"/>
           <w:u w:val="none"/>
         </w:rPr>
         <w:t xml:space="preserve">Behavioral feedbacks to climate mitigation under intensifying disasters. </w:t>
       </w:r>
       <w:r>
         <w:rPr>
-          <w:rFonts w:ascii="Arial" w:hAnsi="Arial"/>
+          <w:rFonts w:ascii="Calibri" w:hAnsi="Calibri" w:eastAsia="Calibri" w:cs="Calibri"/>
           <w:b/>
           <w:i/>
-          <w:sz w:val="20"/>
+          <w:sz w:val="22"/>
           <w:u w:val="none"/>
         </w:rPr>
         <w:t>iScience</w:t>
       </w:r>
       <w:r>
         <w:rPr>
-          <w:rFonts w:ascii="Arial" w:hAnsi="Arial"/>
+          <w:rFonts w:ascii="Calibri" w:hAnsi="Calibri" w:eastAsia="Calibri" w:cs="Calibri"/>
           <w:b w:val="0"/>
           <w:i w:val="0"/>
-          <w:sz w:val="20"/>
+          <w:sz w:val="22"/>
           <w:u w:val="none"/>
         </w:rPr>
         <w:t>, 29(8), 116010.</w:t>
@@ -2815,70 +2273,70 @@
       </w:pPr>
       <w:r>
         <w:rPr>
-          <w:rFonts w:ascii="Arial" w:hAnsi="Arial"/>
+          <w:rFonts w:ascii="Calibri" w:hAnsi="Calibri" w:eastAsia="Calibri" w:cs="Calibri"/>
           <w:b w:val="0"/>
           <w:i w:val="0"/>
-          <w:sz w:val="20"/>
+          <w:sz w:val="22"/>
           <w:u w:val="none"/>
         </w:rPr>
         <w:t xml:space="preserve">Tian, Z., </w:t>
       </w:r>
       <w:r>
         <w:rPr>
-          <w:rFonts w:ascii="Arial" w:hAnsi="Arial"/>
+          <w:rFonts w:ascii="Calibri" w:hAnsi="Calibri" w:eastAsia="Calibri" w:cs="Calibri"/>
           <w:b/>
           <w:i w:val="0"/>
-          <w:sz w:val="20"/>
+          <w:sz w:val="22"/>
           <w:u w:val="single"/>
         </w:rPr>
         <w:t>Xia, Z.</w:t>
       </w:r>
       <w:r>
         <w:rPr>
-          <w:rFonts w:ascii="Arial" w:hAnsi="Arial"/>
+          <w:rFonts w:ascii="Calibri" w:hAnsi="Calibri" w:eastAsia="Calibri" w:cs="Calibri"/>
           <w:b w:val="0"/>
           <w:i w:val="0"/>
-          <w:sz w:val="20"/>
+          <w:sz w:val="22"/>
           <w:u w:val="none"/>
         </w:rPr>
         <w:t>, Yagi, N., Mo, Z., &amp; Sakai, Y.</w:t>
       </w:r>
       <w:r>
         <w:rPr>
-          <w:rFonts w:ascii="Arial" w:hAnsi="Arial"/>
+          <w:rFonts w:ascii="Calibri" w:hAnsi="Calibri" w:eastAsia="Calibri" w:cs="Calibri"/>
           <w:b w:val="0"/>
           <w:i w:val="0"/>
-          <w:sz w:val="20"/>
+          <w:sz w:val="22"/>
           <w:u w:val="none"/>
         </w:rPr>
         <w:t xml:space="preserve"> (2026). </w:t>
       </w:r>
       <w:r>
         <w:rPr>
-          <w:rFonts w:ascii="Arial" w:hAnsi="Arial"/>
+          <w:rFonts w:ascii="Calibri" w:hAnsi="Calibri" w:eastAsia="Calibri" w:cs="Calibri"/>
           <w:b w:val="0"/>
           <w:i w:val="0"/>
-          <w:sz w:val="20"/>
+          <w:sz w:val="22"/>
           <w:u w:val="none"/>
         </w:rPr>
         <w:t xml:space="preserve">Transition to a circular economy in pearl aquaculture: Environmental impacts, consumer preferences, and willingness to pay. </w:t>
       </w:r>
       <w:r>
         <w:rPr>
-          <w:rFonts w:ascii="Arial" w:hAnsi="Arial"/>
+          <w:rFonts w:ascii="Calibri" w:hAnsi="Calibri" w:eastAsia="Calibri" w:cs="Calibri"/>
           <w:b/>
           <w:i/>
-          <w:sz w:val="20"/>
+          <w:sz w:val="22"/>
           <w:u w:val="none"/>
         </w:rPr>
         <w:t>Journal of Cleaner Production</w:t>
       </w:r>
       <w:r>
         <w:rPr>
-          <w:rFonts w:ascii="Arial" w:hAnsi="Arial"/>
+          <w:rFonts w:ascii="Calibri" w:hAnsi="Calibri" w:eastAsia="Calibri" w:cs="Calibri"/>
           <w:b w:val="0"/>
           <w:i w:val="0"/>
-          <w:sz w:val="20"/>
+          <w:sz w:val="22"/>
           <w:u w:val="none"/>
         </w:rPr>
         <w:t>, 572, 148898.</w:t>
@@ -2900,69 +2358,69 @@
       </w:pPr>
       <w:r>
         <w:rPr>
-          <w:rFonts w:ascii="Arial" w:hAnsi="Arial"/>
+          <w:rFonts w:ascii="Calibri" w:hAnsi="Calibri" w:eastAsia="Calibri" w:cs="Calibri"/>
           <w:b w:val="0"/>
           <w:i w:val="0"/>
-          <w:sz w:val="20"/>
+          <w:sz w:val="22"/>
           <w:u w:val="none"/>
         </w:rPr>
         <w:t xml:space="preserve">Kuang, Y., &amp; </w:t>
       </w:r>
       <w:r>
         <w:rPr>
-          <w:rFonts w:ascii="Arial" w:hAnsi="Arial"/>
+          <w:rFonts w:ascii="Calibri" w:hAnsi="Calibri" w:eastAsia="Calibri" w:cs="Calibri"/>
           <w:b/>
           <w:i w:val="0"/>
-          <w:sz w:val="20"/>
+          <w:sz w:val="22"/>
           <w:u w:val="single"/>
         </w:rPr>
         <w:t>Xia, Z.</w:t>
       </w:r>
       <w:r>
         <w:rPr>
-          <w:rFonts w:ascii="Arial" w:hAnsi="Arial"/>
+          <w:rFonts w:ascii="Calibri" w:hAnsi="Calibri" w:eastAsia="Calibri" w:cs="Calibri"/>
           <w:b w:val="0"/>
           <w:i w:val="0"/>
-          <w:sz w:val="20"/>
+          <w:sz w:val="22"/>
           <w:u w:val="none"/>
         </w:rPr>
       </w:r>
       <w:r>
         <w:rPr>
-          <w:rFonts w:ascii="Arial" w:hAnsi="Arial"/>
+          <w:rFonts w:ascii="Calibri" w:hAnsi="Calibri" w:eastAsia="Calibri" w:cs="Calibri"/>
           <w:b w:val="0"/>
           <w:i w:val="0"/>
-          <w:sz w:val="20"/>
+          <w:sz w:val="22"/>
           <w:u w:val="none"/>
         </w:rPr>
         <w:t xml:space="preserve"> (2026). </w:t>
       </w:r>
       <w:r>
         <w:rPr>
-          <w:rFonts w:ascii="Arial" w:hAnsi="Arial"/>
+          <w:rFonts w:ascii="Calibri" w:hAnsi="Calibri" w:eastAsia="Calibri" w:cs="Calibri"/>
           <w:b w:val="0"/>
           <w:i w:val="0"/>
-          <w:sz w:val="20"/>
+          <w:sz w:val="22"/>
           <w:u w:val="none"/>
         </w:rPr>
         <w:t xml:space="preserve">Wine’s warning for farming in climate change. </w:t>
       </w:r>
       <w:r>
         <w:rPr>
-          <w:rFonts w:ascii="Arial" w:hAnsi="Arial"/>
+          <w:rFonts w:ascii="Calibri" w:hAnsi="Calibri" w:eastAsia="Calibri" w:cs="Calibri"/>
           <w:b/>
           <w:i/>
-          <w:sz w:val="20"/>
+          <w:sz w:val="22"/>
           <w:u w:val="none"/>
         </w:rPr>
         <w:t>Science</w:t>
       </w:r>
       <w:r>
         <w:rPr>
-          <w:rFonts w:ascii="Arial" w:hAnsi="Arial"/>
+          <w:rFonts w:ascii="Calibri" w:hAnsi="Calibri" w:eastAsia="Calibri" w:cs="Calibri"/>
           <w:b w:val="0"/>
           <w:i w:val="0"/>
-          <w:sz w:val="20"/>
+          <w:sz w:val="22"/>
           <w:u w:val="none"/>
         </w:rPr>
         <w:t>, 392(6802), 1030.</w:t>
@@ -2984,70 +2442,70 @@
       </w:pPr>
       <w:r>
         <w:rPr>
-          <w:rFonts w:ascii="Arial" w:hAnsi="Arial"/>
+          <w:rFonts w:ascii="Calibri" w:hAnsi="Calibri" w:eastAsia="Calibri" w:cs="Calibri"/>
           <w:b w:val="0"/>
           <w:i w:val="0"/>
-          <w:sz w:val="20"/>
+          <w:sz w:val="22"/>
           <w:u w:val="none"/>
         </w:rPr>
         <w:t xml:space="preserve">He, P., Opilo, A. M., </w:t>
       </w:r>
       <w:r>
         <w:rPr>
-          <w:rFonts w:ascii="Arial" w:hAnsi="Arial"/>
+          <w:rFonts w:ascii="Calibri" w:hAnsi="Calibri" w:eastAsia="Calibri" w:cs="Calibri"/>
           <w:b/>
           <w:i w:val="0"/>
-          <w:sz w:val="20"/>
+          <w:sz w:val="22"/>
           <w:u w:val="single"/>
         </w:rPr>
         <w:t>Xia, Z.</w:t>
       </w:r>
       <w:r>
         <w:rPr>
-          <w:rFonts w:ascii="Arial" w:hAnsi="Arial"/>
+          <w:rFonts w:ascii="Calibri" w:hAnsi="Calibri" w:eastAsia="Calibri" w:cs="Calibri"/>
           <w:b w:val="0"/>
           <w:i w:val="0"/>
-          <w:sz w:val="20"/>
+          <w:sz w:val="22"/>
           <w:u w:val="none"/>
         </w:rPr>
         <w:t>, Song, J., Zhang, C., &amp; Chen, W. Q.</w:t>
       </w:r>
       <w:r>
         <w:rPr>
-          <w:rFonts w:ascii="Arial" w:hAnsi="Arial"/>
+          <w:rFonts w:ascii="Calibri" w:hAnsi="Calibri" w:eastAsia="Calibri" w:cs="Calibri"/>
           <w:b w:val="0"/>
           <w:i w:val="0"/>
-          <w:sz w:val="20"/>
+          <w:sz w:val="22"/>
           <w:u w:val="none"/>
         </w:rPr>
         <w:t xml:space="preserve"> (2026). </w:t>
       </w:r>
       <w:r>
         <w:rPr>
-          <w:rFonts w:ascii="Arial" w:hAnsi="Arial"/>
+          <w:rFonts w:ascii="Calibri" w:hAnsi="Calibri" w:eastAsia="Calibri" w:cs="Calibri"/>
           <w:b w:val="0"/>
           <w:i w:val="0"/>
-          <w:sz w:val="20"/>
+          <w:sz w:val="22"/>
           <w:u w:val="none"/>
         </w:rPr>
         <w:t xml:space="preserve">Gradient transfer of global solid waste trade: theories, facts and implications. </w:t>
       </w:r>
       <w:r>
         <w:rPr>
-          <w:rFonts w:ascii="Arial" w:hAnsi="Arial"/>
+          <w:rFonts w:ascii="Calibri" w:hAnsi="Calibri" w:eastAsia="Calibri" w:cs="Calibri"/>
           <w:b/>
           <w:i/>
-          <w:sz w:val="20"/>
+          <w:sz w:val="22"/>
           <w:u w:val="none"/>
         </w:rPr>
         <w:t>ENGINEERING Environment</w:t>
       </w:r>
       <w:r>
         <w:rPr>
-          <w:rFonts w:ascii="Arial" w:hAnsi="Arial"/>
+          <w:rFonts w:ascii="Calibri" w:hAnsi="Calibri" w:eastAsia="Calibri" w:cs="Calibri"/>
           <w:b w:val="0"/>
           <w:i w:val="0"/>
-          <w:sz w:val="20"/>
+          <w:sz w:val="22"/>
           <w:u w:val="none"/>
         </w:rPr>
         <w:t>, 20(7), 107.</w:t>
@@ -3069,70 +2527,70 @@
       </w:pPr>
       <w:r>
         <w:rPr>
-          <w:rFonts w:ascii="Arial" w:hAnsi="Arial"/>
+          <w:rFonts w:ascii="Calibri" w:hAnsi="Calibri" w:eastAsia="Calibri" w:cs="Calibri"/>
           <w:b w:val="0"/>
           <w:i w:val="0"/>
-          <w:sz w:val="20"/>
+          <w:sz w:val="22"/>
           <w:u w:val="none"/>
         </w:rPr>
         <w:t xml:space="preserve">Tian, X., Di, J., Peng, F., Hu, Z., Xie, J., Wei, G., </w:t>
       </w:r>
       <w:r>
         <w:rPr>
-          <w:rFonts w:ascii="Arial" w:hAnsi="Arial"/>
+          <w:rFonts w:ascii="Calibri" w:hAnsi="Calibri" w:eastAsia="Calibri" w:cs="Calibri"/>
           <w:b/>
           <w:i w:val="0"/>
-          <w:sz w:val="20"/>
+          <w:sz w:val="22"/>
           <w:u w:val="single"/>
         </w:rPr>
         <w:t>Xia, Z.</w:t>
       </w:r>
       <w:r>
         <w:rPr>
-          <w:rFonts w:ascii="Arial" w:hAnsi="Arial"/>
+          <w:rFonts w:ascii="Calibri" w:hAnsi="Calibri" w:eastAsia="Calibri" w:cs="Calibri"/>
           <w:b w:val="0"/>
           <w:i w:val="0"/>
-          <w:sz w:val="20"/>
+          <w:sz w:val="22"/>
           <w:u w:val="none"/>
         </w:rPr>
         <w:t>, Xiong, H., Khan, A., &amp; Liu, Y.</w:t>
       </w:r>
       <w:r>
         <w:rPr>
-          <w:rFonts w:ascii="Arial" w:hAnsi="Arial"/>
+          <w:rFonts w:ascii="Calibri" w:hAnsi="Calibri" w:eastAsia="Calibri" w:cs="Calibri"/>
           <w:b w:val="0"/>
           <w:i w:val="0"/>
-          <w:sz w:val="20"/>
+          <w:sz w:val="22"/>
           <w:u w:val="none"/>
         </w:rPr>
         <w:t xml:space="preserve"> (2026). </w:t>
       </w:r>
       <w:r>
         <w:rPr>
-          <w:rFonts w:ascii="Arial" w:hAnsi="Arial"/>
+          <w:rFonts w:ascii="Calibri" w:hAnsi="Calibri" w:eastAsia="Calibri" w:cs="Calibri"/>
           <w:b w:val="0"/>
           <w:i w:val="0"/>
-          <w:sz w:val="20"/>
+          <w:sz w:val="22"/>
           <w:u w:val="none"/>
         </w:rPr>
         <w:t xml:space="preserve">Comparative assessment of economic and environmental impacts across eight second-use scenarios for retired lithium iron phosphate batteries in China. </w:t>
       </w:r>
       <w:r>
         <w:rPr>
-          <w:rFonts w:ascii="Arial" w:hAnsi="Arial"/>
+          <w:rFonts w:ascii="Calibri" w:hAnsi="Calibri" w:eastAsia="Calibri" w:cs="Calibri"/>
           <w:b/>
           <w:i/>
-          <w:sz w:val="20"/>
+          <w:sz w:val="22"/>
           <w:u w:val="none"/>
         </w:rPr>
         <w:t>Environmental Impact Assessment Review</w:t>
       </w:r>
       <w:r>
         <w:rPr>
-          <w:rFonts w:ascii="Arial" w:hAnsi="Arial"/>
+          <w:rFonts w:ascii="Calibri" w:hAnsi="Calibri" w:eastAsia="Calibri" w:cs="Calibri"/>
           <w:b w:val="0"/>
           <w:i w:val="0"/>
-          <w:sz w:val="20"/>
+          <w:sz w:val="22"/>
           <w:u w:val="none"/>
         </w:rPr>
         <w:t>, 119, 108347.</w:t>
@@ -3154,59 +2612,65 @@
       </w:pPr>
       <w:r>
         <w:rPr>
-          <w:rFonts w:eastAsia="Times New Roman"/>
-          <w:b/>
-          <w:bCs/>
-          <w:kern w:val="0"/>
+          <w:rFonts w:eastAsia="Calibri" w:ascii="Calibri" w:hAnsi="Calibri" w:cs="Calibri"/>
+          <w:b/>
+          <w:bCs/>
+          <w:kern w:val="0"/>
+          <w:sz w:val="22"/>
           <w:u w:val="single"/>
         </w:rPr>
         <w:t>Xia, Z.</w:t>
       </w:r>
       <w:r>
         <w:rPr>
-          <w:rFonts w:eastAsia="Times New Roman" w:hint="eastAsia"/>
-          <w:b/>
-          <w:bCs/>
-          <w:kern w:val="0"/>
+          <w:rFonts w:eastAsia="Calibri" w:hint="eastAsia" w:ascii="Calibri" w:hAnsi="Calibri" w:cs="Calibri"/>
+          <w:b/>
+          <w:bCs/>
+          <w:kern w:val="0"/>
+          <w:sz w:val="22"/>
           <w:u w:val="single"/>
         </w:rPr>
         <w:t>*</w:t>
       </w:r>
       <w:r>
         <w:rPr>
-          <w:rFonts w:eastAsia="Times New Roman"/>
-          <w:kern w:val="0"/>
+          <w:rFonts w:eastAsia="Calibri" w:ascii="Calibri" w:hAnsi="Calibri" w:cs="Calibri"/>
+          <w:kern w:val="0"/>
+          <w:sz w:val="22"/>
         </w:rPr>
         <w:t>, Ye, J., Debnath, R., Dong, X., Xie, J., Xu, M., ... &amp; Liu, M. (2025). Growing climate change risk concerns with rising regional disparities in China. </w:t>
       </w:r>
       <w:proofErr w:type="spellStart"/>
       <w:r>
         <w:rPr>
-          <w:rFonts w:eastAsia="Times New Roman"/>
+          <w:rFonts w:eastAsia="Calibri" w:ascii="Calibri" w:hAnsi="Calibri" w:cs="Calibri"/>
           <w:b/>
           <w:bCs/>
           <w:i/>
           <w:iCs/>
           <w:kern w:val="0"/>
+          <w:sz w:val="22"/>
         </w:rPr>
         <w:t>npj</w:t>
       </w:r>
       <w:proofErr w:type="spellEnd"/>
       <w:r>
         <w:rPr>
-          <w:rFonts w:eastAsia="Times New Roman"/>
+          <w:rFonts w:eastAsia="Calibri" w:ascii="Calibri" w:hAnsi="Calibri" w:cs="Calibri"/>
           <w:b/>
           <w:bCs/>
           <w:i/>
           <w:iCs/>
           <w:kern w:val="0"/>
+          <w:sz w:val="22"/>
         </w:rPr>
         <w:t xml:space="preserve"> Climate Action</w:t>
       </w:r>
       <w:r>
         <w:rPr>
-          <w:rFonts w:eastAsia="Times New Roman"/>
-          <w:kern w:val="0"/>
+          <w:rFonts w:eastAsia="Calibri" w:ascii="Calibri" w:hAnsi="Calibri" w:cs="Calibri"/>
+          <w:kern w:val="0"/>
+          <w:sz w:val="22"/>
         </w:rPr>
         <w:t>, 4(1), 78.</w:t>
       </w:r>
@@ -3227,85 +2691,95 @@
       </w:pPr>
       <w:r>
         <w:rPr>
-          <w:rFonts w:eastAsia="Times New Roman"/>
-          <w:kern w:val="0"/>
+          <w:rFonts w:eastAsia="Calibri" w:ascii="Calibri" w:hAnsi="Calibri" w:cs="Calibri"/>
+          <w:kern w:val="0"/>
+          <w:sz w:val="22"/>
         </w:rPr>
         <w:t>Hu, B.</w:t>
       </w:r>
       <w:r>
         <w:rPr>
-          <w:rFonts w:eastAsia="Times New Roman" w:hint="eastAsia"/>
-          <w:kern w:val="0"/>
+          <w:rFonts w:eastAsia="Calibri" w:hint="eastAsia" w:ascii="Calibri" w:hAnsi="Calibri" w:cs="Calibri"/>
+          <w:kern w:val="0"/>
+          <w:sz w:val="22"/>
           <w:vertAlign w:val="superscript"/>
         </w:rPr>
         <w:t>#</w:t>
       </w:r>
       <w:r>
         <w:rPr>
-          <w:rFonts w:eastAsia="Times New Roman"/>
-          <w:kern w:val="0"/>
+          <w:rFonts w:eastAsia="Calibri" w:ascii="Calibri" w:hAnsi="Calibri" w:cs="Calibri"/>
+          <w:kern w:val="0"/>
+          <w:sz w:val="22"/>
         </w:rPr>
         <w:t xml:space="preserve">, </w:t>
       </w:r>
       <w:r>
         <w:rPr>
-          <w:rFonts w:eastAsia="Times New Roman"/>
-          <w:b/>
-          <w:bCs/>
-          <w:kern w:val="0"/>
+          <w:rFonts w:eastAsia="Calibri" w:ascii="Calibri" w:hAnsi="Calibri" w:cs="Calibri"/>
+          <w:b/>
+          <w:bCs/>
+          <w:kern w:val="0"/>
+          <w:sz w:val="22"/>
           <w:u w:val="single"/>
         </w:rPr>
         <w:t>Xia, Z</w:t>
       </w:r>
       <w:r>
         <w:rPr>
-          <w:rFonts w:ascii="SimSun" w:eastAsia="SimSun" w:hAnsi="SimSun" w:cs="SimSun" w:hint="eastAsia"/>
-          <w:b/>
-          <w:bCs/>
-          <w:kern w:val="0"/>
+          <w:rFonts w:ascii="Calibri" w:eastAsia="Calibri" w:hAnsi="Calibri" w:cs="Calibri" w:hint="eastAsia"/>
+          <w:b/>
+          <w:bCs/>
+          <w:kern w:val="0"/>
+          <w:sz w:val="22"/>
           <w:u w:val="single"/>
         </w:rPr>
         <w:t>.</w:t>
       </w:r>
       <w:r>
         <w:rPr>
-          <w:rFonts w:eastAsia="Times New Roman" w:hint="eastAsia"/>
-          <w:b/>
-          <w:bCs/>
-          <w:kern w:val="0"/>
+          <w:rFonts w:eastAsia="Calibri" w:hint="eastAsia" w:ascii="Calibri" w:hAnsi="Calibri" w:cs="Calibri"/>
+          <w:b/>
+          <w:bCs/>
+          <w:kern w:val="0"/>
+          <w:sz w:val="22"/>
           <w:vertAlign w:val="superscript"/>
         </w:rPr>
         <w:t>#</w:t>
       </w:r>
       <w:r>
         <w:rPr>
-          <w:rFonts w:eastAsia="Times New Roman"/>
-          <w:kern w:val="0"/>
+          <w:rFonts w:eastAsia="Calibri" w:ascii="Calibri" w:hAnsi="Calibri" w:cs="Calibri"/>
+          <w:kern w:val="0"/>
+          <w:sz w:val="22"/>
         </w:rPr>
         <w:t xml:space="preserve">, Guo, Q., Lu, C., Constantino, S. M., &amp; Ju, X. (2025). Assessing Nudge Impact: A Comprehensive Second‐Order Meta‐Analysis. </w:t>
       </w:r>
       <w:r>
         <w:rPr>
-          <w:rFonts w:eastAsia="Times New Roman"/>
+          <w:rFonts w:eastAsia="Calibri" w:ascii="Calibri" w:hAnsi="Calibri" w:cs="Calibri"/>
           <w:b/>
           <w:bCs/>
           <w:i/>
           <w:iCs/>
           <w:kern w:val="0"/>
+          <w:sz w:val="22"/>
         </w:rPr>
         <w:t>Journal of Behavioral Decision Making</w:t>
       </w:r>
       <w:r>
         <w:rPr>
-          <w:rFonts w:eastAsia="Times New Roman"/>
-          <w:kern w:val="0"/>
+          <w:rFonts w:eastAsia="Calibri" w:ascii="Calibri" w:hAnsi="Calibri" w:cs="Calibri"/>
+          <w:kern w:val="0"/>
+          <w:sz w:val="22"/>
         </w:rPr>
         <w:t xml:space="preserve">, 38(5), e70053. </w:t>
       </w:r>
       <w:r>
         <w:rPr>
-          <w:rFonts w:eastAsia="Times New Roman"/>
-          <w:kern w:val="0"/>
+          <w:rFonts w:eastAsia="Calibri" w:ascii="Calibri" w:hAnsi="Calibri" w:cs="Calibri"/>
+          <w:kern w:val="0"/>
+          <w:sz w:val="22"/>
         </w:rPr>
         <w:t>(Co-first author)</w:t>
       </w:r>
@@ -3326,46 +2800,51 @@
       </w:pPr>
       <w:r>
         <w:rPr>
-          <w:rFonts w:eastAsia="Times New Roman"/>
-          <w:b/>
-          <w:bCs/>
-          <w:kern w:val="0"/>
+          <w:rFonts w:eastAsia="Calibri" w:ascii="Calibri" w:hAnsi="Calibri" w:cs="Calibri"/>
+          <w:b/>
+          <w:bCs/>
+          <w:kern w:val="0"/>
+          <w:sz w:val="22"/>
           <w:u w:val="single"/>
         </w:rPr>
         <w:t>Xia, Z.</w:t>
       </w:r>
       <w:r>
         <w:rPr>
-          <w:rFonts w:eastAsia="Times New Roman" w:hint="eastAsia"/>
-          <w:b/>
-          <w:bCs/>
-          <w:kern w:val="0"/>
+          <w:rFonts w:eastAsia="Calibri" w:hint="eastAsia" w:ascii="Calibri" w:hAnsi="Calibri" w:cs="Calibri"/>
+          <w:b/>
+          <w:bCs/>
+          <w:kern w:val="0"/>
+          <w:sz w:val="22"/>
           <w:u w:val="single"/>
         </w:rPr>
         <w:t>*</w:t>
       </w:r>
       <w:r>
         <w:rPr>
-          <w:rFonts w:eastAsia="Times New Roman"/>
-          <w:kern w:val="0"/>
+          <w:rFonts w:eastAsia="Calibri" w:ascii="Calibri" w:hAnsi="Calibri" w:cs="Calibri"/>
+          <w:kern w:val="0"/>
+          <w:sz w:val="22"/>
         </w:rPr>
         <w:t>, Liu, K., Li, J., Gu, Y., Hu, B., Zhong, Y., ... &amp; Lam, K. L. (2025). Evaluating carbon footprint calculators: a comprehensive assessment framework. </w:t>
       </w:r>
       <w:r>
         <w:rPr>
-          <w:rFonts w:eastAsia="Times New Roman"/>
+          <w:rFonts w:eastAsia="Calibri" w:ascii="Calibri" w:hAnsi="Calibri" w:cs="Calibri"/>
           <w:b/>
           <w:bCs/>
           <w:i/>
           <w:iCs/>
           <w:kern w:val="0"/>
+          <w:sz w:val="22"/>
         </w:rPr>
         <w:t>Clean Technologies and Environmental Policy</w:t>
       </w:r>
       <w:r>
         <w:rPr>
-          <w:rFonts w:eastAsia="Times New Roman"/>
-          <w:kern w:val="0"/>
+          <w:rFonts w:eastAsia="Calibri" w:ascii="Calibri" w:hAnsi="Calibri" w:cs="Calibri"/>
+          <w:kern w:val="0"/>
+          <w:sz w:val="22"/>
         </w:rPr>
         <w:t>, 1–12.</w:t>
       </w:r>
@@ -3386,52 +2865,58 @@
       </w:pPr>
       <w:r>
         <w:rPr>
-          <w:rFonts w:eastAsia="Times New Roman"/>
-          <w:kern w:val="0"/>
+          <w:rFonts w:eastAsia="Calibri" w:ascii="Calibri" w:hAnsi="Calibri" w:cs="Calibri"/>
+          <w:kern w:val="0"/>
+          <w:sz w:val="22"/>
         </w:rPr>
         <w:t>Shi, K.</w:t>
       </w:r>
       <w:r>
         <w:rPr>
-          <w:rFonts w:eastAsia="Times New Roman" w:hint="eastAsia"/>
-          <w:kern w:val="0"/>
+          <w:rFonts w:eastAsia="Calibri" w:hint="eastAsia" w:ascii="Calibri" w:hAnsi="Calibri" w:cs="Calibri"/>
+          <w:kern w:val="0"/>
+          <w:sz w:val="22"/>
           <w:vertAlign w:val="superscript"/>
         </w:rPr>
         <w:t>#</w:t>
       </w:r>
       <w:r>
         <w:rPr>
-          <w:rFonts w:eastAsia="Times New Roman"/>
-          <w:kern w:val="0"/>
+          <w:rFonts w:eastAsia="Calibri" w:ascii="Calibri" w:hAnsi="Calibri" w:cs="Calibri"/>
+          <w:kern w:val="0"/>
+          <w:sz w:val="22"/>
         </w:rPr>
         <w:t>, </w:t>
       </w:r>
       <w:r>
         <w:rPr>
-          <w:rFonts w:eastAsia="Times New Roman"/>
-          <w:b/>
-          <w:bCs/>
-          <w:kern w:val="0"/>
+          <w:rFonts w:eastAsia="Calibri" w:ascii="Calibri" w:hAnsi="Calibri" w:cs="Calibri"/>
+          <w:b/>
+          <w:bCs/>
+          <w:kern w:val="0"/>
+          <w:sz w:val="22"/>
           <w:u w:val="single"/>
         </w:rPr>
         <w:t>Xia, Z.</w:t>
       </w:r>
       <w:r>
         <w:rPr>
-          <w:rFonts w:eastAsia="Times New Roman" w:hint="eastAsia"/>
-          <w:b/>
-          <w:bCs/>
-          <w:kern w:val="0"/>
+          <w:rFonts w:eastAsia="Calibri" w:hint="eastAsia" w:ascii="Calibri" w:hAnsi="Calibri" w:cs="Calibri"/>
+          <w:b/>
+          <w:bCs/>
+          <w:kern w:val="0"/>
+          <w:sz w:val="22"/>
           <w:u w:val="single"/>
         </w:rPr>
         <w:t>*</w:t>
       </w:r>
       <w:r>
         <w:rPr>
-          <w:rFonts w:eastAsia="Times New Roman" w:hint="eastAsia"/>
-          <w:b/>
-          <w:bCs/>
-          <w:kern w:val="0"/>
+          <w:rFonts w:eastAsia="Calibri" w:hint="eastAsia" w:ascii="Calibri" w:hAnsi="Calibri" w:cs="Calibri"/>
+          <w:b/>
+          <w:bCs/>
+          <w:kern w:val="0"/>
+          <w:sz w:val="22"/>
           <w:u w:val="single"/>
           <w:vertAlign w:val="superscript"/>
         </w:rPr>
@@ -3439,26 +2924,29 @@
       </w:r>
       <w:r>
         <w:rPr>
-          <w:rFonts w:eastAsia="Times New Roman"/>
-          <w:kern w:val="0"/>
+          <w:rFonts w:eastAsia="Calibri" w:ascii="Calibri" w:hAnsi="Calibri" w:cs="Calibri"/>
+          <w:kern w:val="0"/>
+          <w:sz w:val="22"/>
         </w:rPr>
         <w:t>, Gu, H., &amp; Nisa, C. (2025). Promoting plant-based diet in China: Testing health, environmental and animal welfare motivational messages. </w:t>
       </w:r>
       <w:r>
         <w:rPr>
-          <w:rFonts w:eastAsia="Times New Roman"/>
+          <w:rFonts w:eastAsia="Calibri" w:ascii="Calibri" w:hAnsi="Calibri" w:cs="Calibri"/>
           <w:b/>
           <w:bCs/>
           <w:i/>
           <w:iCs/>
           <w:kern w:val="0"/>
+          <w:sz w:val="22"/>
         </w:rPr>
         <w:t>Sustainable Production and Consumption</w:t>
       </w:r>
       <w:r>
         <w:rPr>
-          <w:rFonts w:eastAsia="Times New Roman"/>
-          <w:kern w:val="0"/>
+          <w:rFonts w:eastAsia="Calibri" w:ascii="Calibri" w:hAnsi="Calibri" w:cs="Calibri"/>
+          <w:kern w:val="0"/>
+          <w:sz w:val="22"/>
         </w:rPr>
         <w:t>. (Co-first author)</w:t>
       </w:r>
@@ -3479,59 +2967,66 @@
       </w:pPr>
       <w:r>
         <w:rPr>
-          <w:rFonts w:eastAsia="Times New Roman"/>
-          <w:kern w:val="0"/>
+          <w:rFonts w:eastAsia="Calibri" w:ascii="Calibri" w:hAnsi="Calibri" w:cs="Calibri"/>
+          <w:kern w:val="0"/>
+          <w:sz w:val="22"/>
         </w:rPr>
         <w:t>Li, X., Zhang, C., Yang, X., </w:t>
       </w:r>
       <w:r>
         <w:rPr>
-          <w:rFonts w:eastAsia="Times New Roman"/>
-          <w:b/>
-          <w:bCs/>
-          <w:kern w:val="0"/>
+          <w:rFonts w:eastAsia="Calibri" w:ascii="Calibri" w:hAnsi="Calibri" w:cs="Calibri"/>
+          <w:b/>
+          <w:bCs/>
+          <w:kern w:val="0"/>
+          <w:sz w:val="22"/>
           <w:u w:val="single"/>
         </w:rPr>
         <w:t>Xia, Z.</w:t>
       </w:r>
       <w:r>
         <w:rPr>
-          <w:rFonts w:eastAsia="Times New Roman"/>
-          <w:kern w:val="0"/>
+          <w:rFonts w:eastAsia="Calibri" w:ascii="Calibri" w:hAnsi="Calibri" w:cs="Calibri"/>
+          <w:kern w:val="0"/>
+          <w:sz w:val="22"/>
         </w:rPr>
         <w:t xml:space="preserve">, Cao, Z., Wang, P., ... &amp; Chen, W. Q. (2025). Hybrid multi-stage steel </w:t>
       </w:r>
       <w:proofErr w:type="spellStart"/>
       <w:r>
         <w:rPr>
-          <w:rFonts w:eastAsia="Times New Roman"/>
-          <w:kern w:val="0"/>
+          <w:rFonts w:eastAsia="Calibri" w:ascii="Calibri" w:hAnsi="Calibri" w:cs="Calibri"/>
+          <w:kern w:val="0"/>
+          <w:sz w:val="22"/>
         </w:rPr>
         <w:t>footprinting</w:t>
       </w:r>
       <w:proofErr w:type="spellEnd"/>
       <w:r>
         <w:rPr>
-          <w:rFonts w:eastAsia="Times New Roman"/>
-          <w:kern w:val="0"/>
+          <w:rFonts w:eastAsia="Calibri" w:ascii="Calibri" w:hAnsi="Calibri" w:cs="Calibri"/>
+          <w:kern w:val="0"/>
+          <w:sz w:val="22"/>
         </w:rPr>
         <w:t xml:space="preserve"> unveils a more interdependent material foundation of the global economy. </w:t>
       </w:r>
       <w:r>
         <w:rPr>
-          <w:rFonts w:eastAsia="Times New Roman"/>
+          <w:rFonts w:eastAsia="Calibri" w:ascii="Calibri" w:hAnsi="Calibri" w:cs="Calibri"/>
           <w:b/>
           <w:bCs/>
           <w:i/>
           <w:iCs/>
           <w:kern w:val="0"/>
+          <w:sz w:val="22"/>
         </w:rPr>
         <w:t>Ecological Economics</w:t>
       </w:r>
       <w:r>
         <w:rPr>
-          <w:rFonts w:eastAsia="Times New Roman"/>
-          <w:kern w:val="0"/>
+          <w:rFonts w:eastAsia="Calibri" w:ascii="Calibri" w:hAnsi="Calibri" w:cs="Calibri"/>
+          <w:kern w:val="0"/>
+          <w:sz w:val="22"/>
         </w:rPr>
         <w:t>, 227, 108408.</w:t>
       </w:r>
@@ -3552,43 +3047,48 @@
       </w:pPr>
       <w:r>
         <w:rPr>
-          <w:rFonts w:eastAsia="Times New Roman"/>
-          <w:kern w:val="0"/>
+          <w:rFonts w:eastAsia="Calibri" w:ascii="Calibri" w:hAnsi="Calibri" w:cs="Calibri"/>
+          <w:kern w:val="0"/>
+          <w:sz w:val="22"/>
         </w:rPr>
         <w:t>Lee, C. C., Li, J., </w:t>
       </w:r>
       <w:r>
         <w:rPr>
-          <w:rFonts w:eastAsia="Times New Roman"/>
-          <w:b/>
-          <w:bCs/>
-          <w:kern w:val="0"/>
+          <w:rFonts w:eastAsia="Calibri" w:ascii="Calibri" w:hAnsi="Calibri" w:cs="Calibri"/>
+          <w:b/>
+          <w:bCs/>
+          <w:kern w:val="0"/>
+          <w:sz w:val="22"/>
           <w:u w:val="single"/>
         </w:rPr>
         <w:t>Xia, Z.</w:t>
       </w:r>
       <w:r>
         <w:rPr>
-          <w:rFonts w:eastAsia="Times New Roman"/>
-          <w:kern w:val="0"/>
+          <w:rFonts w:eastAsia="Calibri" w:ascii="Calibri" w:hAnsi="Calibri" w:cs="Calibri"/>
+          <w:kern w:val="0"/>
+          <w:sz w:val="22"/>
         </w:rPr>
         <w:t>, &amp; Xie, L. (2025). Elderly population migration and urban energy consumption: Voluntary relocation or forced displacement? </w:t>
       </w:r>
       <w:r>
         <w:rPr>
-          <w:rFonts w:eastAsia="Times New Roman"/>
+          <w:rFonts w:eastAsia="Calibri" w:ascii="Calibri" w:hAnsi="Calibri" w:cs="Calibri"/>
           <w:b/>
           <w:bCs/>
           <w:i/>
           <w:iCs/>
           <w:kern w:val="0"/>
+          <w:sz w:val="22"/>
         </w:rPr>
         <w:t>Energy Economics</w:t>
       </w:r>
       <w:r>
         <w:rPr>
-          <w:rFonts w:eastAsia="Times New Roman"/>
-          <w:kern w:val="0"/>
+          <w:rFonts w:eastAsia="Calibri" w:ascii="Calibri" w:hAnsi="Calibri" w:cs="Calibri"/>
+          <w:kern w:val="0"/>
+          <w:sz w:val="22"/>
         </w:rPr>
         <w:t>, 108725.</w:t>
       </w:r>
@@ -3609,43 +3109,48 @@
       </w:pPr>
       <w:r>
         <w:rPr>
-          <w:rFonts w:eastAsia="Times New Roman"/>
-          <w:kern w:val="0"/>
+          <w:rFonts w:eastAsia="Calibri" w:ascii="Calibri" w:hAnsi="Calibri" w:cs="Calibri"/>
+          <w:kern w:val="0"/>
+          <w:sz w:val="22"/>
         </w:rPr>
         <w:t>Hu, B., Gao, J., Feng, Y., </w:t>
       </w:r>
       <w:r>
         <w:rPr>
-          <w:rFonts w:eastAsia="Times New Roman"/>
-          <w:b/>
-          <w:bCs/>
-          <w:kern w:val="0"/>
+          <w:rFonts w:eastAsia="Calibri" w:ascii="Calibri" w:hAnsi="Calibri" w:cs="Calibri"/>
+          <w:b/>
+          <w:bCs/>
+          <w:kern w:val="0"/>
+          <w:sz w:val="22"/>
           <w:u w:val="single"/>
         </w:rPr>
         <w:t>Xia, Z.</w:t>
       </w:r>
       <w:r>
         <w:rPr>
-          <w:rFonts w:eastAsia="Times New Roman"/>
-          <w:kern w:val="0"/>
+          <w:rFonts w:eastAsia="Calibri" w:ascii="Calibri" w:hAnsi="Calibri" w:cs="Calibri"/>
+          <w:kern w:val="0"/>
+          <w:sz w:val="22"/>
         </w:rPr>
         <w:t>, Wang, K., &amp; Geng, L. (2025). Predicting adolescents’ environmental action: From individual to national-level factors using an explainable machine learning approach. </w:t>
       </w:r>
       <w:r>
         <w:rPr>
-          <w:rFonts w:eastAsia="Times New Roman"/>
+          <w:rFonts w:eastAsia="Calibri" w:ascii="Calibri" w:hAnsi="Calibri" w:cs="Calibri"/>
           <w:b/>
           <w:bCs/>
           <w:i/>
           <w:iCs/>
           <w:kern w:val="0"/>
+          <w:sz w:val="22"/>
         </w:rPr>
         <w:t>Journal of Environmental Management</w:t>
       </w:r>
       <w:r>
         <w:rPr>
-          <w:rFonts w:eastAsia="Times New Roman"/>
-          <w:kern w:val="0"/>
+          <w:rFonts w:eastAsia="Calibri" w:ascii="Calibri" w:hAnsi="Calibri" w:cs="Calibri"/>
+          <w:kern w:val="0"/>
+          <w:sz w:val="22"/>
         </w:rPr>
         <w:t>, 390, 126398.</w:t>
       </w:r>
@@ -3666,43 +3171,48 @@
       </w:pPr>
       <w:r>
         <w:rPr>
-          <w:rFonts w:eastAsia="Times New Roman"/>
-          <w:kern w:val="0"/>
+          <w:rFonts w:eastAsia="Calibri" w:ascii="Calibri" w:hAnsi="Calibri" w:cs="Calibri"/>
+          <w:kern w:val="0"/>
+          <w:sz w:val="22"/>
         </w:rPr>
         <w:t>Hu, B., Wang, C., </w:t>
       </w:r>
       <w:r>
         <w:rPr>
-          <w:rFonts w:eastAsia="Times New Roman"/>
-          <w:b/>
-          <w:bCs/>
-          <w:kern w:val="0"/>
+          <w:rFonts w:eastAsia="Calibri" w:ascii="Calibri" w:hAnsi="Calibri" w:cs="Calibri"/>
+          <w:b/>
+          <w:bCs/>
+          <w:kern w:val="0"/>
+          <w:sz w:val="22"/>
           <w:u w:val="single"/>
         </w:rPr>
         <w:t>Xia, Z.</w:t>
       </w:r>
       <w:r>
         <w:rPr>
-          <w:rFonts w:eastAsia="Times New Roman"/>
-          <w:kern w:val="0"/>
+          <w:rFonts w:eastAsia="Calibri" w:ascii="Calibri" w:hAnsi="Calibri" w:cs="Calibri"/>
+          <w:kern w:val="0"/>
+          <w:sz w:val="22"/>
         </w:rPr>
         <w:t>, Lu, C., &amp; Ju, X. (2025). Environmental education in low-income and middle-income countries: A systematic review and meta-analysis. </w:t>
       </w:r>
       <w:r>
         <w:rPr>
-          <w:rFonts w:eastAsia="Times New Roman"/>
+          <w:rFonts w:eastAsia="Calibri" w:ascii="Calibri" w:hAnsi="Calibri" w:cs="Calibri"/>
           <w:b/>
           <w:bCs/>
           <w:i/>
           <w:iCs/>
           <w:kern w:val="0"/>
+          <w:sz w:val="22"/>
         </w:rPr>
         <w:t>Journal of Environmental Psychology</w:t>
       </w:r>
       <w:r>
         <w:rPr>
-          <w:rFonts w:eastAsia="Times New Roman"/>
-          <w:kern w:val="0"/>
+          <w:rFonts w:eastAsia="Calibri" w:ascii="Calibri" w:hAnsi="Calibri" w:cs="Calibri"/>
+          <w:kern w:val="0"/>
+          <w:sz w:val="22"/>
         </w:rPr>
         <w:t>, 102613.</w:t>
       </w:r>
@@ -3723,72 +3233,80 @@
       </w:pPr>
       <w:r>
         <w:rPr>
-          <w:rFonts w:eastAsia="Times New Roman"/>
-          <w:kern w:val="0"/>
+          <w:rFonts w:eastAsia="Calibri" w:ascii="Calibri" w:hAnsi="Calibri" w:cs="Calibri"/>
+          <w:kern w:val="0"/>
+          <w:sz w:val="22"/>
         </w:rPr>
         <w:t>Cologna, V., Mede, N. G., …, </w:t>
       </w:r>
       <w:r>
         <w:rPr>
-          <w:rFonts w:eastAsia="Times New Roman"/>
-          <w:b/>
-          <w:bCs/>
-          <w:kern w:val="0"/>
+          <w:rFonts w:eastAsia="Calibri" w:ascii="Calibri" w:hAnsi="Calibri" w:cs="Calibri"/>
+          <w:b/>
+          <w:bCs/>
+          <w:kern w:val="0"/>
+          <w:sz w:val="22"/>
           <w:u w:val="single"/>
         </w:rPr>
         <w:t>Xia, Z.</w:t>
       </w:r>
       <w:r>
         <w:rPr>
-          <w:rFonts w:eastAsia="Times New Roman"/>
-          <w:kern w:val="0"/>
+          <w:rFonts w:eastAsia="Calibri" w:ascii="Calibri" w:hAnsi="Calibri" w:cs="Calibri"/>
+          <w:kern w:val="0"/>
+          <w:sz w:val="22"/>
         </w:rPr>
         <w:t xml:space="preserve">, … &amp; </w:t>
       </w:r>
       <w:proofErr w:type="spellStart"/>
       <w:r>
         <w:rPr>
-          <w:rFonts w:eastAsia="Times New Roman"/>
-          <w:kern w:val="0"/>
+          <w:rFonts w:eastAsia="Calibri" w:ascii="Calibri" w:hAnsi="Calibri" w:cs="Calibri"/>
+          <w:kern w:val="0"/>
+          <w:sz w:val="22"/>
         </w:rPr>
         <w:t>Metag</w:t>
       </w:r>
       <w:proofErr w:type="spellEnd"/>
       <w:r>
         <w:rPr>
-          <w:rFonts w:eastAsia="Times New Roman"/>
-          <w:kern w:val="0"/>
+          <w:rFonts w:eastAsia="Calibri" w:ascii="Calibri" w:hAnsi="Calibri" w:cs="Calibri"/>
+          <w:kern w:val="0"/>
+          <w:sz w:val="22"/>
         </w:rPr>
         <w:t>, J. (2025). Trust in scientists and their role in society across 68 countries. </w:t>
       </w:r>
       <w:r>
         <w:rPr>
-          <w:rFonts w:eastAsia="Times New Roman"/>
+          <w:rFonts w:eastAsia="Calibri" w:ascii="Calibri" w:hAnsi="Calibri" w:cs="Calibri"/>
           <w:b/>
           <w:bCs/>
           <w:i/>
           <w:iCs/>
           <w:kern w:val="0"/>
+          <w:sz w:val="22"/>
         </w:rPr>
         <w:t xml:space="preserve">Nature Human </w:t>
       </w:r>
       <w:proofErr w:type="spellStart"/>
       <w:r>
         <w:rPr>
-          <w:rFonts w:eastAsia="Times New Roman"/>
+          <w:rFonts w:eastAsia="Calibri" w:ascii="Calibri" w:hAnsi="Calibri" w:cs="Calibri"/>
           <w:b/>
           <w:bCs/>
           <w:i/>
           <w:iCs/>
           <w:kern w:val="0"/>
+          <w:sz w:val="22"/>
         </w:rPr>
         <w:t>Behaviour</w:t>
       </w:r>
       <w:proofErr w:type="spellEnd"/>
       <w:r>
         <w:rPr>
-          <w:rFonts w:eastAsia="Times New Roman"/>
-          <w:kern w:val="0"/>
+          <w:rFonts w:eastAsia="Calibri" w:ascii="Calibri" w:hAnsi="Calibri" w:cs="Calibri"/>
+          <w:kern w:val="0"/>
+          <w:sz w:val="22"/>
         </w:rPr>
         <w:t>, 9(4), 713–730.</w:t>
       </w:r>
@@ -3809,60 +3327,67 @@
       </w:pPr>
       <w:r>
         <w:rPr>
-          <w:rFonts w:eastAsia="Times New Roman"/>
-          <w:kern w:val="0"/>
+          <w:rFonts w:eastAsia="Calibri" w:ascii="Calibri" w:hAnsi="Calibri" w:cs="Calibri"/>
+          <w:kern w:val="0"/>
+          <w:sz w:val="22"/>
         </w:rPr>
         <w:lastRenderedPageBreak/>
         <w:t>Mede, N. G., Cologna, V., …, </w:t>
       </w:r>
       <w:r>
         <w:rPr>
-          <w:rFonts w:eastAsia="Times New Roman"/>
-          <w:b/>
-          <w:bCs/>
-          <w:kern w:val="0"/>
+          <w:rFonts w:eastAsia="Calibri" w:ascii="Calibri" w:hAnsi="Calibri" w:cs="Calibri"/>
+          <w:b/>
+          <w:bCs/>
+          <w:kern w:val="0"/>
+          <w:sz w:val="22"/>
           <w:u w:val="single"/>
         </w:rPr>
         <w:t>Xia, Z.</w:t>
       </w:r>
       <w:r>
         <w:rPr>
-          <w:rFonts w:eastAsia="Times New Roman"/>
-          <w:kern w:val="0"/>
+          <w:rFonts w:eastAsia="Calibri" w:ascii="Calibri" w:hAnsi="Calibri" w:cs="Calibri"/>
+          <w:kern w:val="0"/>
+          <w:sz w:val="22"/>
         </w:rPr>
         <w:t xml:space="preserve">, … &amp; </w:t>
       </w:r>
       <w:proofErr w:type="spellStart"/>
       <w:r>
         <w:rPr>
-          <w:rFonts w:eastAsia="Times New Roman"/>
-          <w:kern w:val="0"/>
+          <w:rFonts w:eastAsia="Calibri" w:ascii="Calibri" w:hAnsi="Calibri" w:cs="Calibri"/>
+          <w:kern w:val="0"/>
+          <w:sz w:val="22"/>
         </w:rPr>
         <w:t>Metag</w:t>
       </w:r>
       <w:proofErr w:type="spellEnd"/>
       <w:r>
         <w:rPr>
-          <w:rFonts w:eastAsia="Times New Roman"/>
-          <w:kern w:val="0"/>
+          <w:rFonts w:eastAsia="Calibri" w:ascii="Calibri" w:hAnsi="Calibri" w:cs="Calibri"/>
+          <w:kern w:val="0"/>
+          <w:sz w:val="22"/>
         </w:rPr>
         <w:t>, J. (2025). Perceptions of science, science communication, and climate change attitudes in 68 countries–the TISP dataset. </w:t>
       </w:r>
       <w:r>
         <w:rPr>
-          <w:rFonts w:eastAsia="Times New Roman"/>
+          <w:rFonts w:eastAsia="Calibri" w:ascii="Calibri" w:hAnsi="Calibri" w:cs="Calibri"/>
           <w:b/>
           <w:bCs/>
           <w:i/>
           <w:iCs/>
           <w:kern w:val="0"/>
+          <w:sz w:val="22"/>
         </w:rPr>
         <w:t>Scientific Data</w:t>
       </w:r>
       <w:r>
         <w:rPr>
-          <w:rFonts w:eastAsia="Times New Roman"/>
-          <w:kern w:val="0"/>
+          <w:rFonts w:eastAsia="Calibri" w:ascii="Calibri" w:hAnsi="Calibri" w:cs="Calibri"/>
+          <w:kern w:val="0"/>
+          <w:sz w:val="22"/>
         </w:rPr>
         <w:t>, 12(1), 114.</w:t>
       </w:r>
@@ -3883,57 +3408,64 @@
       </w:pPr>
       <w:r>
         <w:rPr>
-          <w:rFonts w:eastAsia="Times New Roman"/>
-          <w:kern w:val="0"/>
+          <w:rFonts w:eastAsia="Calibri" w:ascii="Calibri" w:hAnsi="Calibri" w:cs="Calibri"/>
+          <w:kern w:val="0"/>
+          <w:sz w:val="22"/>
         </w:rPr>
         <w:t>Yang, J., …, </w:t>
       </w:r>
       <w:r>
         <w:rPr>
-          <w:rFonts w:eastAsia="Times New Roman"/>
-          <w:b/>
-          <w:bCs/>
-          <w:kern w:val="0"/>
+          <w:rFonts w:eastAsia="Calibri" w:ascii="Calibri" w:hAnsi="Calibri" w:cs="Calibri"/>
+          <w:b/>
+          <w:bCs/>
+          <w:kern w:val="0"/>
+          <w:sz w:val="22"/>
           <w:u w:val="single"/>
         </w:rPr>
         <w:t>Xia, Z.</w:t>
       </w:r>
       <w:r>
         <w:rPr>
-          <w:rFonts w:eastAsia="Times New Roman"/>
-          <w:kern w:val="0"/>
+          <w:rFonts w:eastAsia="Calibri" w:ascii="Calibri" w:hAnsi="Calibri" w:cs="Calibri"/>
+          <w:kern w:val="0"/>
+          <w:sz w:val="22"/>
         </w:rPr>
         <w:t>, …, Bi, J. et al. (</w:t>
       </w:r>
       <w:r>
         <w:rPr>
-          <w:rFonts w:eastAsia="Times New Roman" w:hint="eastAsia"/>
-          <w:kern w:val="0"/>
+          <w:rFonts w:eastAsia="Calibri" w:hint="eastAsia" w:ascii="Calibri" w:hAnsi="Calibri" w:cs="Calibri"/>
+          <w:kern w:val="0"/>
+          <w:sz w:val="22"/>
         </w:rPr>
         <w:t>2025</w:t>
       </w:r>
       <w:r>
         <w:rPr>
-          <w:rFonts w:eastAsia="Times New Roman"/>
-          <w:kern w:val="0"/>
+          <w:rFonts w:eastAsia="Calibri" w:ascii="Calibri" w:hAnsi="Calibri" w:cs="Calibri"/>
+          <w:kern w:val="0"/>
+          <w:sz w:val="22"/>
         </w:rPr>
         <w:t>). Measuring climate change perception in China using mental images: A nationwide open-ended survey. </w:t>
       </w:r>
       <w:r>
         <w:rPr>
-          <w:rFonts w:eastAsia="Times New Roman"/>
+          <w:rFonts w:eastAsia="Calibri" w:ascii="Calibri" w:hAnsi="Calibri" w:cs="Calibri"/>
           <w:b/>
           <w:bCs/>
           <w:i/>
           <w:iCs/>
           <w:kern w:val="0"/>
+          <w:sz w:val="22"/>
         </w:rPr>
         <w:t>Risk Analysis</w:t>
       </w:r>
       <w:r>
         <w:rPr>
-          <w:rFonts w:eastAsia="Times New Roman"/>
-          <w:kern w:val="0"/>
+          <w:rFonts w:eastAsia="Calibri" w:ascii="Calibri" w:hAnsi="Calibri" w:cs="Calibri"/>
+          <w:kern w:val="0"/>
+          <w:sz w:val="22"/>
         </w:rPr>
         <w:t>.</w:t>
       </w:r>
@@ -3954,81 +3486,91 @@
       </w:pPr>
       <w:r>
         <w:rPr>
-          <w:rFonts w:eastAsia="Times New Roman"/>
-          <w:kern w:val="0"/>
+          <w:rFonts w:eastAsia="Calibri" w:ascii="Calibri" w:hAnsi="Calibri" w:cs="Calibri"/>
+          <w:kern w:val="0"/>
+          <w:sz w:val="22"/>
         </w:rPr>
         <w:t xml:space="preserve">Morrison, K., Pottier, </w:t>
       </w:r>
       <w:r>
         <w:rPr>
-          <w:rFonts w:eastAsia="Times New Roman"/>
-          <w:kern w:val="0"/>
+          <w:rFonts w:eastAsia="Calibri" w:ascii="Calibri" w:hAnsi="Calibri" w:cs="Calibri"/>
+          <w:kern w:val="0"/>
+          <w:sz w:val="22"/>
         </w:rPr>
         <w:t>…</w:t>
       </w:r>
       <w:r>
         <w:rPr>
-          <w:rFonts w:eastAsia="Times New Roman"/>
-          <w:kern w:val="0"/>
+          <w:rFonts w:eastAsia="Calibri" w:ascii="Calibri" w:hAnsi="Calibri" w:cs="Calibri"/>
+          <w:kern w:val="0"/>
+          <w:sz w:val="22"/>
         </w:rPr>
         <w:t>,</w:t>
       </w:r>
       <w:r>
         <w:rPr>
-          <w:rFonts w:eastAsia="Times New Roman" w:hint="eastAsia"/>
-          <w:kern w:val="0"/>
+          <w:rFonts w:eastAsia="Calibri" w:hint="eastAsia" w:ascii="Calibri" w:hAnsi="Calibri" w:cs="Calibri"/>
+          <w:kern w:val="0"/>
+          <w:sz w:val="22"/>
         </w:rPr>
         <w:t xml:space="preserve"> </w:t>
       </w:r>
       <w:r>
         <w:rPr>
-          <w:rFonts w:eastAsia="Times New Roman" w:hint="eastAsia"/>
-          <w:b/>
-          <w:bCs/>
-          <w:kern w:val="0"/>
+          <w:rFonts w:eastAsia="Calibri" w:hint="eastAsia" w:ascii="Calibri" w:hAnsi="Calibri" w:cs="Calibri"/>
+          <w:b/>
+          <w:bCs/>
+          <w:kern w:val="0"/>
+          <w:sz w:val="22"/>
           <w:u w:val="single"/>
         </w:rPr>
         <w:t>Xia, Z</w:t>
       </w:r>
       <w:r>
         <w:rPr>
-          <w:rFonts w:eastAsia="Times New Roman" w:hint="eastAsia"/>
-          <w:b/>
-          <w:bCs/>
-          <w:kern w:val="0"/>
+          <w:rFonts w:eastAsia="Calibri" w:hint="eastAsia" w:ascii="Calibri" w:hAnsi="Calibri" w:cs="Calibri"/>
+          <w:b/>
+          <w:bCs/>
+          <w:kern w:val="0"/>
+          <w:sz w:val="22"/>
           <w:u w:val="single"/>
         </w:rPr>
         <w:t>.</w:t>
       </w:r>
       <w:r>
         <w:rPr>
-          <w:rFonts w:eastAsia="Times New Roman" w:hint="eastAsia"/>
-          <w:kern w:val="0"/>
+          <w:rFonts w:eastAsia="Calibri" w:hint="eastAsia" w:ascii="Calibri" w:hAnsi="Calibri" w:cs="Calibri"/>
+          <w:kern w:val="0"/>
+          <w:sz w:val="22"/>
         </w:rPr>
         <w:t>,</w:t>
       </w:r>
       <w:r>
         <w:rPr>
-          <w:rFonts w:eastAsia="Times New Roman"/>
-          <w:kern w:val="0"/>
+          <w:rFonts w:eastAsia="Calibri" w:ascii="Calibri" w:hAnsi="Calibri" w:cs="Calibri"/>
+          <w:kern w:val="0"/>
+          <w:sz w:val="22"/>
         </w:rPr>
         <w:t xml:space="preserve"> ... &amp; Nakagawa, S. (2025). MATES: A tool for appraising the completeness with which a meta-analysis has been reported. </w:t>
       </w:r>
       <w:r>
         <w:rPr>
-          <w:rFonts w:eastAsia="Times New Roman"/>
+          <w:rFonts w:eastAsia="Calibri" w:ascii="Calibri" w:hAnsi="Calibri" w:cs="Calibri"/>
           <w:b/>
           <w:bCs/>
           <w:i/>
           <w:iCs/>
           <w:kern w:val="0"/>
+          <w:sz w:val="22"/>
         </w:rPr>
         <w:t>Environment International</w:t>
       </w:r>
       <w:r>
         <w:rPr>
-          <w:rFonts w:eastAsia="Times New Roman"/>
-          <w:kern w:val="0"/>
+          <w:rFonts w:eastAsia="Calibri" w:ascii="Calibri" w:hAnsi="Calibri" w:cs="Calibri"/>
+          <w:kern w:val="0"/>
+          <w:sz w:val="22"/>
         </w:rPr>
         <w:t>, 109935.</w:t>
       </w:r>
@@ -4049,43 +3591,48 @@
       </w:pPr>
       <w:r>
         <w:rPr>
-          <w:rFonts w:eastAsia="Times New Roman"/>
-          <w:kern w:val="0"/>
+          <w:rFonts w:eastAsia="Calibri" w:ascii="Calibri" w:hAnsi="Calibri" w:cs="Calibri"/>
+          <w:kern w:val="0"/>
+          <w:sz w:val="22"/>
         </w:rPr>
         <w:t xml:space="preserve">Tian, X., Yuan, K., Wen, H., </w:t>
       </w:r>
       <w:r>
         <w:rPr>
-          <w:rFonts w:eastAsia="Times New Roman"/>
-          <w:b/>
-          <w:bCs/>
-          <w:kern w:val="0"/>
+          <w:rFonts w:eastAsia="Calibri" w:ascii="Calibri" w:hAnsi="Calibri" w:cs="Calibri"/>
+          <w:b/>
+          <w:bCs/>
+          <w:kern w:val="0"/>
+          <w:sz w:val="22"/>
           <w:u w:val="single"/>
         </w:rPr>
         <w:t>Xia, Z.</w:t>
       </w:r>
       <w:r>
         <w:rPr>
-          <w:rFonts w:eastAsia="Times New Roman"/>
-          <w:kern w:val="0"/>
+          <w:rFonts w:eastAsia="Calibri" w:ascii="Calibri" w:hAnsi="Calibri" w:cs="Calibri"/>
+          <w:kern w:val="0"/>
+          <w:sz w:val="22"/>
         </w:rPr>
         <w:t xml:space="preserve">, Peng, F., Men, D., ... &amp; Liu, Y. (2025). IoT-based analysis reveals behavioral differences in public participation in low-value recyclables collection. </w:t>
       </w:r>
       <w:r>
         <w:rPr>
-          <w:rFonts w:eastAsia="Times New Roman"/>
+          <w:rFonts w:eastAsia="Calibri" w:ascii="Calibri" w:hAnsi="Calibri" w:cs="Calibri"/>
           <w:b/>
           <w:bCs/>
           <w:i/>
           <w:iCs/>
           <w:kern w:val="0"/>
+          <w:sz w:val="22"/>
         </w:rPr>
         <w:t>Humanities and Social Sciences Communications</w:t>
       </w:r>
       <w:r>
         <w:rPr>
-          <w:rFonts w:eastAsia="Times New Roman"/>
-          <w:kern w:val="0"/>
+          <w:rFonts w:eastAsia="Calibri" w:ascii="Calibri" w:hAnsi="Calibri" w:cs="Calibri"/>
+          <w:kern w:val="0"/>
+          <w:sz w:val="22"/>
         </w:rPr>
         <w:t>, 12(1), 1-15.</w:t>
       </w:r>
@@ -4106,43 +3653,48 @@
       </w:pPr>
       <w:r>
         <w:rPr>
-          <w:rFonts w:eastAsia="Times New Roman"/>
-          <w:kern w:val="0"/>
+          <w:rFonts w:eastAsia="Calibri" w:ascii="Calibri" w:hAnsi="Calibri" w:cs="Calibri"/>
+          <w:kern w:val="0"/>
+          <w:sz w:val="22"/>
         </w:rPr>
         <w:t xml:space="preserve">Zhong, Y., Yan, H., &amp; </w:t>
       </w:r>
       <w:r>
         <w:rPr>
-          <w:rFonts w:eastAsia="Times New Roman"/>
-          <w:b/>
-          <w:bCs/>
-          <w:kern w:val="0"/>
+          <w:rFonts w:eastAsia="Calibri" w:ascii="Calibri" w:hAnsi="Calibri" w:cs="Calibri"/>
+          <w:b/>
+          <w:bCs/>
+          <w:kern w:val="0"/>
+          <w:sz w:val="22"/>
           <w:u w:val="single"/>
         </w:rPr>
         <w:t>Xia, Z.</w:t>
       </w:r>
       <w:r>
         <w:rPr>
-          <w:rFonts w:eastAsia="Times New Roman"/>
-          <w:kern w:val="0"/>
+          <w:rFonts w:eastAsia="Calibri" w:ascii="Calibri" w:hAnsi="Calibri" w:cs="Calibri"/>
+          <w:kern w:val="0"/>
+          <w:sz w:val="22"/>
         </w:rPr>
         <w:t xml:space="preserve"> (2025). Who is lifting the green veil? Climate physical risks and supply chain spillovers of corporate carbon greenwashing. </w:t>
       </w:r>
       <w:r>
         <w:rPr>
-          <w:rFonts w:eastAsia="Times New Roman"/>
+          <w:rFonts w:eastAsia="Calibri" w:ascii="Calibri" w:hAnsi="Calibri" w:cs="Calibri"/>
           <w:b/>
           <w:bCs/>
           <w:i/>
           <w:iCs/>
           <w:kern w:val="0"/>
+          <w:sz w:val="22"/>
         </w:rPr>
         <w:t>Technology in Society</w:t>
       </w:r>
       <w:r>
         <w:rPr>
-          <w:rFonts w:eastAsia="Times New Roman"/>
-          <w:kern w:val="0"/>
+          <w:rFonts w:eastAsia="Calibri" w:ascii="Calibri" w:hAnsi="Calibri" w:cs="Calibri"/>
+          <w:kern w:val="0"/>
+          <w:sz w:val="22"/>
         </w:rPr>
         <w:t>, 103203.</w:t>
       </w:r>
@@ -4163,57 +3715,64 @@
       </w:pPr>
       <w:r>
         <w:rPr>
-          <w:rFonts w:eastAsia="Times New Roman"/>
-          <w:kern w:val="0"/>
+          <w:rFonts w:eastAsia="Calibri" w:ascii="Calibri" w:hAnsi="Calibri" w:cs="Calibri"/>
+          <w:kern w:val="0"/>
+          <w:sz w:val="22"/>
         </w:rPr>
         <w:t>Xu, D., Bai, T., …, </w:t>
       </w:r>
       <w:r>
         <w:rPr>
-          <w:rFonts w:eastAsia="Times New Roman"/>
-          <w:b/>
-          <w:bCs/>
-          <w:kern w:val="0"/>
+          <w:rFonts w:eastAsia="Calibri" w:ascii="Calibri" w:hAnsi="Calibri" w:cs="Calibri"/>
+          <w:b/>
+          <w:bCs/>
+          <w:kern w:val="0"/>
+          <w:sz w:val="22"/>
           <w:u w:val="single"/>
         </w:rPr>
         <w:t>Xia, Z.</w:t>
       </w:r>
       <w:r>
         <w:rPr>
-          <w:rFonts w:eastAsia="Times New Roman"/>
-          <w:kern w:val="0"/>
+          <w:rFonts w:eastAsia="Calibri" w:ascii="Calibri" w:hAnsi="Calibri" w:cs="Calibri"/>
+          <w:kern w:val="0"/>
+          <w:sz w:val="22"/>
         </w:rPr>
         <w:t>, …, Cui, Y. et al. (</w:t>
       </w:r>
       <w:r>
         <w:rPr>
-          <w:rFonts w:eastAsia="Times New Roman" w:hint="eastAsia"/>
-          <w:kern w:val="0"/>
+          <w:rFonts w:eastAsia="Calibri" w:hint="eastAsia" w:ascii="Calibri" w:hAnsi="Calibri" w:cs="Calibri"/>
+          <w:kern w:val="0"/>
+          <w:sz w:val="22"/>
         </w:rPr>
         <w:t>2024</w:t>
       </w:r>
       <w:r>
         <w:rPr>
-          <w:rFonts w:eastAsia="Times New Roman"/>
-          <w:kern w:val="0"/>
+          <w:rFonts w:eastAsia="Calibri" w:ascii="Calibri" w:hAnsi="Calibri" w:cs="Calibri"/>
+          <w:kern w:val="0"/>
+          <w:sz w:val="22"/>
         </w:rPr>
         <w:t>). Reassessing the climate mitigation potential of Chinese ecological restoration: the undiscovered potential of urban areas. </w:t>
       </w:r>
       <w:r>
         <w:rPr>
-          <w:rFonts w:eastAsia="Times New Roman"/>
+          <w:rFonts w:eastAsia="Calibri" w:ascii="Calibri" w:hAnsi="Calibri" w:cs="Calibri"/>
           <w:b/>
           <w:bCs/>
           <w:i/>
           <w:iCs/>
           <w:kern w:val="0"/>
+          <w:sz w:val="22"/>
         </w:rPr>
         <w:t>The Innovation Geoscience</w:t>
       </w:r>
       <w:r>
         <w:rPr>
-          <w:rFonts w:eastAsia="Times New Roman"/>
-          <w:kern w:val="0"/>
+          <w:rFonts w:eastAsia="Calibri" w:ascii="Calibri" w:hAnsi="Calibri" w:cs="Calibri"/>
+          <w:kern w:val="0"/>
+          <w:sz w:val="22"/>
         </w:rPr>
         <w:t>.</w:t>
       </w:r>
@@ -4234,27 +3793,30 @@
       </w:pPr>
       <w:r>
         <w:rPr>
-          <w:rFonts w:eastAsia="Times New Roman"/>
-          <w:kern w:val="0"/>
+          <w:rFonts w:eastAsia="Calibri" w:ascii="Calibri" w:hAnsi="Calibri" w:cs="Calibri"/>
+          <w:kern w:val="0"/>
+          <w:sz w:val="22"/>
         </w:rPr>
         <w:t>Gu, Y., </w:t>
       </w:r>
       <w:r>
         <w:rPr>
-          <w:rFonts w:eastAsia="Times New Roman"/>
-          <w:b/>
-          <w:bCs/>
-          <w:kern w:val="0"/>
+          <w:rFonts w:eastAsia="Calibri" w:ascii="Calibri" w:hAnsi="Calibri" w:cs="Calibri"/>
+          <w:b/>
+          <w:bCs/>
+          <w:kern w:val="0"/>
+          <w:sz w:val="22"/>
           <w:u w:val="single"/>
         </w:rPr>
         <w:t>Xia, Z.</w:t>
       </w:r>
       <w:r>
         <w:rPr>
-          <w:rFonts w:eastAsia="Times New Roman" w:hint="eastAsia"/>
-          <w:b/>
-          <w:bCs/>
-          <w:kern w:val="0"/>
+          <w:rFonts w:eastAsia="Calibri" w:hint="eastAsia" w:ascii="Calibri" w:hAnsi="Calibri" w:cs="Calibri"/>
+          <w:b/>
+          <w:bCs/>
+          <w:kern w:val="0"/>
+          <w:sz w:val="22"/>
           <w:u w:val="single"/>
           <w:vertAlign w:val="superscript"/>
         </w:rPr>
@@ -4262,26 +3824,29 @@
       </w:r>
       <w:r>
         <w:rPr>
-          <w:rFonts w:eastAsia="Times New Roman"/>
-          <w:kern w:val="0"/>
+          <w:rFonts w:eastAsia="Calibri" w:ascii="Calibri" w:hAnsi="Calibri" w:cs="Calibri"/>
+          <w:kern w:val="0"/>
+          <w:sz w:val="22"/>
         </w:rPr>
         <w:t>, Tian, X., Xie, J., &amp; Liu, Y. (2024). Factors determining reuse behavior: A meta-analysis. </w:t>
       </w:r>
       <w:r>
         <w:rPr>
-          <w:rFonts w:eastAsia="Times New Roman"/>
+          <w:rFonts w:eastAsia="Calibri" w:ascii="Calibri" w:hAnsi="Calibri" w:cs="Calibri"/>
           <w:b/>
           <w:bCs/>
           <w:i/>
           <w:iCs/>
           <w:kern w:val="0"/>
+          <w:sz w:val="22"/>
         </w:rPr>
         <w:t>Cleaner and Responsible Consumption</w:t>
       </w:r>
       <w:r>
         <w:rPr>
-          <w:rFonts w:eastAsia="Times New Roman"/>
-          <w:kern w:val="0"/>
+          <w:rFonts w:eastAsia="Calibri" w:ascii="Calibri" w:hAnsi="Calibri" w:cs="Calibri"/>
+          <w:kern w:val="0"/>
+          <w:sz w:val="22"/>
         </w:rPr>
         <w:t>, 14, 100213. (Co-first author)</w:t>
       </w:r>
@@ -4302,43 +3867,48 @@
       </w:pPr>
       <w:r>
         <w:rPr>
-          <w:rFonts w:eastAsia="Times New Roman"/>
-          <w:kern w:val="0"/>
+          <w:rFonts w:eastAsia="Calibri" w:ascii="Calibri" w:hAnsi="Calibri" w:cs="Calibri"/>
+          <w:kern w:val="0"/>
+          <w:sz w:val="22"/>
         </w:rPr>
         <w:t>Fan, J. C., </w:t>
       </w:r>
       <w:r>
         <w:rPr>
-          <w:rFonts w:eastAsia="Times New Roman"/>
-          <w:b/>
-          <w:bCs/>
-          <w:kern w:val="0"/>
+          <w:rFonts w:eastAsia="Calibri" w:ascii="Calibri" w:hAnsi="Calibri" w:cs="Calibri"/>
+          <w:b/>
+          <w:bCs/>
+          <w:kern w:val="0"/>
+          <w:sz w:val="22"/>
           <w:u w:val="single"/>
         </w:rPr>
         <w:t>Xia, Z.</w:t>
       </w:r>
       <w:r>
         <w:rPr>
-          <w:rFonts w:eastAsia="Times New Roman"/>
-          <w:kern w:val="0"/>
+          <w:rFonts w:eastAsia="Calibri" w:ascii="Calibri" w:hAnsi="Calibri" w:cs="Calibri"/>
+          <w:kern w:val="0"/>
+          <w:sz w:val="22"/>
         </w:rPr>
         <w:t>, &amp; Yang, X. (2024). Export stability and air pollution: evidence from 56 major exporting countries. </w:t>
       </w:r>
       <w:r>
         <w:rPr>
-          <w:rFonts w:eastAsia="Times New Roman"/>
+          <w:rFonts w:eastAsia="Calibri" w:ascii="Calibri" w:hAnsi="Calibri" w:cs="Calibri"/>
           <w:b/>
           <w:bCs/>
           <w:i/>
           <w:iCs/>
           <w:kern w:val="0"/>
+          <w:sz w:val="22"/>
         </w:rPr>
         <w:t>Applied Economics Letters</w:t>
       </w:r>
       <w:r>
         <w:rPr>
-          <w:rFonts w:eastAsia="Times New Roman"/>
-          <w:kern w:val="0"/>
+          <w:rFonts w:eastAsia="Calibri" w:ascii="Calibri" w:hAnsi="Calibri" w:cs="Calibri"/>
+          <w:kern w:val="0"/>
+          <w:sz w:val="22"/>
         </w:rPr>
         <w:t>, 1–5.</w:t>
       </w:r>
@@ -4359,43 +3929,48 @@
       </w:pPr>
       <w:r>
         <w:rPr>
-          <w:rFonts w:eastAsia="Times New Roman"/>
-          <w:kern w:val="0"/>
+          <w:rFonts w:eastAsia="Calibri" w:ascii="Calibri" w:hAnsi="Calibri" w:cs="Calibri"/>
+          <w:kern w:val="0"/>
+          <w:sz w:val="22"/>
         </w:rPr>
         <w:t>Yan, H., Li, Y., Zhong, Y., &amp; </w:t>
       </w:r>
       <w:r>
         <w:rPr>
-          <w:rFonts w:eastAsia="Times New Roman"/>
-          <w:b/>
-          <w:bCs/>
-          <w:kern w:val="0"/>
+          <w:rFonts w:eastAsia="Calibri" w:ascii="Calibri" w:hAnsi="Calibri" w:cs="Calibri"/>
+          <w:b/>
+          <w:bCs/>
+          <w:kern w:val="0"/>
+          <w:sz w:val="22"/>
           <w:u w:val="single"/>
         </w:rPr>
         <w:t>Xia, Z.</w:t>
       </w:r>
       <w:r>
         <w:rPr>
-          <w:rFonts w:eastAsia="Times New Roman"/>
-          <w:kern w:val="0"/>
+          <w:rFonts w:eastAsia="Calibri" w:ascii="Calibri" w:hAnsi="Calibri" w:cs="Calibri"/>
+          <w:kern w:val="0"/>
+          <w:sz w:val="22"/>
         </w:rPr>
         <w:t> (2024). Will the ‘government-court coordination’ of corporate bankruptcy disposal improve ESG performance? Evidence from China. </w:t>
       </w:r>
       <w:r>
         <w:rPr>
-          <w:rFonts w:eastAsia="Times New Roman"/>
+          <w:rFonts w:eastAsia="Calibri" w:ascii="Calibri" w:hAnsi="Calibri" w:cs="Calibri"/>
           <w:b/>
           <w:bCs/>
           <w:i/>
           <w:iCs/>
           <w:kern w:val="0"/>
+          <w:sz w:val="22"/>
         </w:rPr>
         <w:t>Applied Economics Letters</w:t>
       </w:r>
       <w:r>
         <w:rPr>
-          <w:rFonts w:eastAsia="Times New Roman"/>
-          <w:kern w:val="0"/>
+          <w:rFonts w:eastAsia="Calibri" w:ascii="Calibri" w:hAnsi="Calibri" w:cs="Calibri"/>
+          <w:kern w:val="0"/>
+          <w:sz w:val="22"/>
         </w:rPr>
         <w:t>, 1–5.</w:t>
       </w:r>
@@ -4416,43 +3991,48 @@
       </w:pPr>
       <w:r>
         <w:rPr>
-          <w:rFonts w:eastAsia="Times New Roman"/>
-          <w:kern w:val="0"/>
+          <w:rFonts w:eastAsia="Calibri" w:ascii="Calibri" w:hAnsi="Calibri" w:cs="Calibri"/>
+          <w:kern w:val="0"/>
+          <w:sz w:val="22"/>
         </w:rPr>
         <w:t>Yang, X., Zhang, C., …, </w:t>
       </w:r>
       <w:r>
         <w:rPr>
-          <w:rFonts w:eastAsia="Times New Roman"/>
-          <w:b/>
-          <w:bCs/>
-          <w:kern w:val="0"/>
+          <w:rFonts w:eastAsia="Calibri" w:ascii="Calibri" w:hAnsi="Calibri" w:cs="Calibri"/>
+          <w:b/>
+          <w:bCs/>
+          <w:kern w:val="0"/>
+          <w:sz w:val="22"/>
           <w:u w:val="single"/>
         </w:rPr>
         <w:t>Xia, Z.</w:t>
       </w:r>
       <w:r>
         <w:rPr>
-          <w:rFonts w:eastAsia="Times New Roman"/>
-          <w:kern w:val="0"/>
+          <w:rFonts w:eastAsia="Calibri" w:ascii="Calibri" w:hAnsi="Calibri" w:cs="Calibri"/>
+          <w:kern w:val="0"/>
+          <w:sz w:val="22"/>
         </w:rPr>
         <w:t>, ... &amp; Chen, W. Q. (2024). Multinational dynamic steel cycle analysis reveals sequential decoupling between material use and economic growth. </w:t>
       </w:r>
       <w:r>
         <w:rPr>
-          <w:rFonts w:eastAsia="Times New Roman"/>
+          <w:rFonts w:eastAsia="Calibri" w:ascii="Calibri" w:hAnsi="Calibri" w:cs="Calibri"/>
           <w:b/>
           <w:bCs/>
           <w:i/>
           <w:iCs/>
           <w:kern w:val="0"/>
+          <w:sz w:val="22"/>
         </w:rPr>
         <w:t>Ecological Economics</w:t>
       </w:r>
       <w:r>
         <w:rPr>
-          <w:rFonts w:eastAsia="Times New Roman"/>
-          <w:kern w:val="0"/>
+          <w:rFonts w:eastAsia="Calibri" w:ascii="Calibri" w:hAnsi="Calibri" w:cs="Calibri"/>
+          <w:kern w:val="0"/>
+          <w:sz w:val="22"/>
         </w:rPr>
         <w:t>, 217, 108092.</w:t>
       </w:r>
@@ -4473,43 +4053,48 @@
       </w:pPr>
       <w:r>
         <w:rPr>
-          <w:rFonts w:eastAsia="Times New Roman"/>
-          <w:kern w:val="0"/>
+          <w:rFonts w:eastAsia="Calibri" w:ascii="Calibri" w:hAnsi="Calibri" w:cs="Calibri"/>
+          <w:kern w:val="0"/>
+          <w:sz w:val="22"/>
         </w:rPr>
         <w:t>Xu, D., Bai, T., …, </w:t>
       </w:r>
       <w:r>
         <w:rPr>
-          <w:rFonts w:eastAsia="Times New Roman"/>
-          <w:b/>
-          <w:bCs/>
-          <w:kern w:val="0"/>
+          <w:rFonts w:eastAsia="Calibri" w:ascii="Calibri" w:hAnsi="Calibri" w:cs="Calibri"/>
+          <w:b/>
+          <w:bCs/>
+          <w:kern w:val="0"/>
+          <w:sz w:val="22"/>
           <w:u w:val="single"/>
         </w:rPr>
         <w:t>Xia, Z.</w:t>
       </w:r>
       <w:r>
         <w:rPr>
-          <w:rFonts w:eastAsia="Times New Roman"/>
-          <w:kern w:val="0"/>
+          <w:rFonts w:eastAsia="Calibri" w:ascii="Calibri" w:hAnsi="Calibri" w:cs="Calibri"/>
+          <w:kern w:val="0"/>
+          <w:sz w:val="22"/>
         </w:rPr>
         <w:t>, …, Ciais, P. (2024). Quantifying the Cooling Effect of Urban Greening Driven by Ecological Restoration Projects in China. </w:t>
       </w:r>
       <w:r>
         <w:rPr>
-          <w:rFonts w:eastAsia="Times New Roman"/>
+          <w:rFonts w:eastAsia="Calibri" w:ascii="Calibri" w:hAnsi="Calibri" w:cs="Calibri"/>
           <w:b/>
           <w:bCs/>
           <w:i/>
           <w:iCs/>
           <w:kern w:val="0"/>
+          <w:sz w:val="22"/>
         </w:rPr>
         <w:t>Environmental Science &amp; Technology</w:t>
       </w:r>
       <w:r>
         <w:rPr>
-          <w:rFonts w:eastAsia="Times New Roman"/>
-          <w:kern w:val="0"/>
+          <w:rFonts w:eastAsia="Calibri" w:ascii="Calibri" w:hAnsi="Calibri" w:cs="Calibri"/>
+          <w:kern w:val="0"/>
+          <w:sz w:val="22"/>
         </w:rPr>
         <w:t>.</w:t>
       </w:r>
@@ -4530,43 +4115,48 @@
       </w:pPr>
       <w:r>
         <w:rPr>
-          <w:rFonts w:eastAsia="Times New Roman"/>
-          <w:kern w:val="0"/>
+          <w:rFonts w:eastAsia="Calibri" w:ascii="Calibri" w:hAnsi="Calibri" w:cs="Calibri"/>
+          <w:kern w:val="0"/>
+          <w:sz w:val="22"/>
         </w:rPr>
         <w:t>Tian, X., Ma, Q., Xie, J., </w:t>
       </w:r>
       <w:r>
         <w:rPr>
-          <w:rFonts w:eastAsia="Times New Roman"/>
-          <w:b/>
-          <w:bCs/>
-          <w:kern w:val="0"/>
+          <w:rFonts w:eastAsia="Calibri" w:ascii="Calibri" w:hAnsi="Calibri" w:cs="Calibri"/>
+          <w:b/>
+          <w:bCs/>
+          <w:kern w:val="0"/>
+          <w:sz w:val="22"/>
           <w:u w:val="single"/>
         </w:rPr>
         <w:t>Xia, Z.</w:t>
       </w:r>
       <w:r>
         <w:rPr>
-          <w:rFonts w:eastAsia="Times New Roman"/>
-          <w:kern w:val="0"/>
+          <w:rFonts w:eastAsia="Calibri" w:ascii="Calibri" w:hAnsi="Calibri" w:cs="Calibri"/>
+          <w:kern w:val="0"/>
+          <w:sz w:val="22"/>
         </w:rPr>
         <w:t>, &amp; Liu, Y. (2024). Environmental impact and economic assessment of recycling lithium iron phosphate battery cathodes: Comparison of major processes in China. </w:t>
       </w:r>
       <w:r>
         <w:rPr>
-          <w:rFonts w:eastAsia="Times New Roman"/>
+          <w:rFonts w:eastAsia="Calibri" w:ascii="Calibri" w:hAnsi="Calibri" w:cs="Calibri"/>
           <w:b/>
           <w:bCs/>
           <w:i/>
           <w:iCs/>
           <w:kern w:val="0"/>
+          <w:sz w:val="22"/>
         </w:rPr>
         <w:t>Resources, Conservation and Recycling</w:t>
       </w:r>
       <w:r>
         <w:rPr>
-          <w:rFonts w:eastAsia="Times New Roman"/>
-          <w:kern w:val="0"/>
+          <w:rFonts w:eastAsia="Calibri" w:ascii="Calibri" w:hAnsi="Calibri" w:cs="Calibri"/>
+          <w:kern w:val="0"/>
+          <w:sz w:val="22"/>
         </w:rPr>
         <w:t>, 203, 107449.</w:t>
       </w:r>
@@ -4587,43 +4177,48 @@
       </w:pPr>
       <w:r>
         <w:rPr>
-          <w:rFonts w:eastAsia="Times New Roman"/>
-          <w:kern w:val="0"/>
+          <w:rFonts w:eastAsia="Calibri" w:ascii="Calibri" w:hAnsi="Calibri" w:cs="Calibri"/>
+          <w:kern w:val="0"/>
+          <w:sz w:val="22"/>
         </w:rPr>
         <w:t>Xie, J., Feng, Y., …, </w:t>
       </w:r>
       <w:r>
         <w:rPr>
-          <w:rFonts w:eastAsia="Times New Roman"/>
-          <w:b/>
-          <w:bCs/>
-          <w:kern w:val="0"/>
+          <w:rFonts w:eastAsia="Calibri" w:ascii="Calibri" w:hAnsi="Calibri" w:cs="Calibri"/>
+          <w:b/>
+          <w:bCs/>
+          <w:kern w:val="0"/>
+          <w:sz w:val="22"/>
           <w:u w:val="single"/>
         </w:rPr>
         <w:t>Xia, Z.</w:t>
       </w:r>
       <w:r>
         <w:rPr>
-          <w:rFonts w:eastAsia="Times New Roman"/>
-          <w:kern w:val="0"/>
+          <w:rFonts w:eastAsia="Calibri" w:ascii="Calibri" w:hAnsi="Calibri" w:cs="Calibri"/>
+          <w:kern w:val="0"/>
+          <w:sz w:val="22"/>
         </w:rPr>
         <w:t>, …, Li, N. (2024). Transparent and open-source aluminum life cycle inventory dataset for China. </w:t>
       </w:r>
       <w:r>
         <w:rPr>
-          <w:rFonts w:eastAsia="Times New Roman"/>
+          <w:rFonts w:eastAsia="Calibri" w:ascii="Calibri" w:hAnsi="Calibri" w:cs="Calibri"/>
           <w:b/>
           <w:bCs/>
           <w:i/>
           <w:iCs/>
           <w:kern w:val="0"/>
+          <w:sz w:val="22"/>
         </w:rPr>
         <w:t>Resources, Conservation and Recycling</w:t>
       </w:r>
       <w:r>
         <w:rPr>
-          <w:rFonts w:eastAsia="Times New Roman"/>
-          <w:kern w:val="0"/>
+          <w:rFonts w:eastAsia="Calibri" w:ascii="Calibri" w:hAnsi="Calibri" w:cs="Calibri"/>
+          <w:kern w:val="0"/>
+          <w:sz w:val="22"/>
         </w:rPr>
         <w:t>, 207, 107666.</w:t>
       </w:r>
@@ -4644,36 +4239,40 @@
       </w:pPr>
       <w:r>
         <w:rPr>
-          <w:rFonts w:eastAsia="Times New Roman"/>
-          <w:b/>
-          <w:bCs/>
-          <w:kern w:val="0"/>
+          <w:rFonts w:eastAsia="Calibri" w:ascii="Calibri" w:hAnsi="Calibri" w:cs="Calibri"/>
+          <w:b/>
+          <w:bCs/>
+          <w:kern w:val="0"/>
+          <w:sz w:val="22"/>
           <w:u w:val="single"/>
         </w:rPr>
         <w:t>Xia, Z.</w:t>
       </w:r>
       <w:r>
         <w:rPr>
-          <w:rFonts w:eastAsia="Times New Roman"/>
-          <w:kern w:val="0"/>
+          <w:rFonts w:eastAsia="Calibri" w:ascii="Calibri" w:hAnsi="Calibri" w:cs="Calibri"/>
+          <w:kern w:val="0"/>
+          <w:sz w:val="22"/>
         </w:rPr>
         <w:t>, Li, J., Gu, Y., …, Tian, X., &amp; Zhang, C. (2023). Do Behavioral Interventions Enhance Waste Recycling Practices? Evidence from an extended meta-analysis. </w:t>
       </w:r>
       <w:r>
         <w:rPr>
-          <w:rFonts w:eastAsia="Times New Roman"/>
+          <w:rFonts w:eastAsia="Calibri" w:ascii="Calibri" w:hAnsi="Calibri" w:cs="Calibri"/>
           <w:b/>
           <w:bCs/>
           <w:i/>
           <w:iCs/>
           <w:kern w:val="0"/>
+          <w:sz w:val="22"/>
         </w:rPr>
         <w:t>Journal of Cleaner Production</w:t>
       </w:r>
       <w:r>
         <w:rPr>
-          <w:rFonts w:eastAsia="Times New Roman"/>
-          <w:kern w:val="0"/>
+          <w:rFonts w:eastAsia="Calibri" w:ascii="Calibri" w:hAnsi="Calibri" w:cs="Calibri"/>
+          <w:kern w:val="0"/>
+          <w:sz w:val="22"/>
         </w:rPr>
         <w:t>.</w:t>
       </w:r>
@@ -4694,43 +4293,48 @@
       </w:pPr>
       <w:r>
         <w:rPr>
-          <w:rFonts w:eastAsia="Times New Roman"/>
-          <w:kern w:val="0"/>
+          <w:rFonts w:eastAsia="Calibri" w:ascii="Calibri" w:hAnsi="Calibri" w:cs="Calibri"/>
+          <w:kern w:val="0"/>
+          <w:sz w:val="22"/>
         </w:rPr>
         <w:t>Zhang, S., </w:t>
       </w:r>
       <w:r>
         <w:rPr>
-          <w:rFonts w:eastAsia="Times New Roman"/>
-          <w:b/>
-          <w:bCs/>
-          <w:kern w:val="0"/>
+          <w:rFonts w:eastAsia="Calibri" w:ascii="Calibri" w:hAnsi="Calibri" w:cs="Calibri"/>
+          <w:b/>
+          <w:bCs/>
+          <w:kern w:val="0"/>
+          <w:sz w:val="22"/>
           <w:u w:val="single"/>
         </w:rPr>
         <w:t>Xia, Z.</w:t>
       </w:r>
       <w:r>
         <w:rPr>
-          <w:rFonts w:eastAsia="Times New Roman"/>
-          <w:kern w:val="0"/>
+          <w:rFonts w:eastAsia="Calibri" w:ascii="Calibri" w:hAnsi="Calibri" w:cs="Calibri"/>
+          <w:kern w:val="0"/>
+          <w:sz w:val="22"/>
         </w:rPr>
         <w:t>, Zhang, C., &amp; Tian, X. (2023). Green Illusions in Self-Reporting? Reassessing the Intention-Behavior Gap in Waste Recycling Behaviors. </w:t>
       </w:r>
       <w:r>
         <w:rPr>
-          <w:rFonts w:eastAsia="Times New Roman"/>
+          <w:rFonts w:eastAsia="Calibri" w:ascii="Calibri" w:hAnsi="Calibri" w:cs="Calibri"/>
           <w:b/>
           <w:bCs/>
           <w:i/>
           <w:iCs/>
           <w:kern w:val="0"/>
+          <w:sz w:val="22"/>
         </w:rPr>
         <w:t>Waste Management</w:t>
       </w:r>
       <w:r>
         <w:rPr>
-          <w:rFonts w:eastAsia="Times New Roman"/>
-          <w:kern w:val="0"/>
+          <w:rFonts w:eastAsia="Calibri" w:ascii="Calibri" w:hAnsi="Calibri" w:cs="Calibri"/>
+          <w:kern w:val="0"/>
+          <w:sz w:val="22"/>
         </w:rPr>
         <w:t>. (Co-first author)</w:t>
       </w:r>
@@ -4751,43 +4355,48 @@
       </w:pPr>
       <w:r>
         <w:rPr>
-          <w:rFonts w:eastAsia="Times New Roman"/>
-          <w:kern w:val="0"/>
+          <w:rFonts w:eastAsia="Calibri" w:ascii="Calibri" w:hAnsi="Calibri" w:cs="Calibri"/>
+          <w:kern w:val="0"/>
+          <w:sz w:val="22"/>
         </w:rPr>
         <w:t>Xie, J., </w:t>
       </w:r>
       <w:r>
         <w:rPr>
-          <w:rFonts w:eastAsia="Times New Roman"/>
-          <w:b/>
-          <w:bCs/>
-          <w:kern w:val="0"/>
+          <w:rFonts w:eastAsia="Calibri" w:ascii="Calibri" w:hAnsi="Calibri" w:cs="Calibri"/>
+          <w:b/>
+          <w:bCs/>
+          <w:kern w:val="0"/>
+          <w:sz w:val="22"/>
           <w:u w:val="single"/>
         </w:rPr>
         <w:t>Xia, Z.</w:t>
       </w:r>
       <w:r>
         <w:rPr>
-          <w:rFonts w:eastAsia="Times New Roman"/>
-          <w:kern w:val="0"/>
+          <w:rFonts w:eastAsia="Calibri" w:ascii="Calibri" w:hAnsi="Calibri" w:cs="Calibri"/>
+          <w:kern w:val="0"/>
+          <w:sz w:val="22"/>
         </w:rPr>
         <w:t>, …, Tian, X. (2023). Nexus and synergy between the low-carbon economy and circular economy: A systematic review. </w:t>
       </w:r>
       <w:r>
         <w:rPr>
-          <w:rFonts w:eastAsia="Times New Roman"/>
+          <w:rFonts w:eastAsia="Calibri" w:ascii="Calibri" w:hAnsi="Calibri" w:cs="Calibri"/>
           <w:b/>
           <w:bCs/>
           <w:i/>
           <w:iCs/>
           <w:kern w:val="0"/>
+          <w:sz w:val="22"/>
         </w:rPr>
         <w:t>Environmental Impact Assessment Review</w:t>
       </w:r>
       <w:r>
         <w:rPr>
-          <w:rFonts w:eastAsia="Times New Roman"/>
-          <w:kern w:val="0"/>
+          <w:rFonts w:eastAsia="Calibri" w:ascii="Calibri" w:hAnsi="Calibri" w:cs="Calibri"/>
+          <w:kern w:val="0"/>
+          <w:sz w:val="22"/>
         </w:rPr>
         <w:t>.</w:t>
       </w:r>
@@ -4808,44 +4417,49 @@
       </w:pPr>
       <w:r>
         <w:rPr>
-          <w:rFonts w:eastAsia="Times New Roman"/>
-          <w:kern w:val="0"/>
+          <w:rFonts w:eastAsia="Calibri" w:ascii="Calibri" w:hAnsi="Calibri" w:cs="Calibri"/>
+          <w:kern w:val="0"/>
+          <w:sz w:val="22"/>
         </w:rPr>
         <w:lastRenderedPageBreak/>
         <w:t>Tian, X., …, </w:t>
       </w:r>
       <w:r>
         <w:rPr>
-          <w:rFonts w:eastAsia="Times New Roman"/>
-          <w:b/>
-          <w:bCs/>
-          <w:kern w:val="0"/>
+          <w:rFonts w:eastAsia="Calibri" w:ascii="Calibri" w:hAnsi="Calibri" w:cs="Calibri"/>
+          <w:b/>
+          <w:bCs/>
+          <w:kern w:val="0"/>
+          <w:sz w:val="22"/>
           <w:u w:val="single"/>
         </w:rPr>
         <w:t>Xia, Z.</w:t>
       </w:r>
       <w:r>
         <w:rPr>
-          <w:rFonts w:eastAsia="Times New Roman"/>
-          <w:kern w:val="0"/>
+          <w:rFonts w:eastAsia="Calibri" w:ascii="Calibri" w:hAnsi="Calibri" w:cs="Calibri"/>
+          <w:kern w:val="0"/>
+          <w:sz w:val="22"/>
         </w:rPr>
         <w:t> et al. (2023). Design and Simulation of a Cross-regional Collaborative Recycling System for Secondary Resources: A Case of Lead-acid Batteries. </w:t>
       </w:r>
       <w:r>
         <w:rPr>
-          <w:rFonts w:eastAsia="Times New Roman"/>
+          <w:rFonts w:eastAsia="Calibri" w:ascii="Calibri" w:hAnsi="Calibri" w:cs="Calibri"/>
           <w:b/>
           <w:bCs/>
           <w:i/>
           <w:iCs/>
           <w:kern w:val="0"/>
+          <w:sz w:val="22"/>
         </w:rPr>
         <w:t>Journal of Environmental Management</w:t>
       </w:r>
       <w:r>
         <w:rPr>
-          <w:rFonts w:eastAsia="Times New Roman"/>
-          <w:kern w:val="0"/>
+          <w:rFonts w:eastAsia="Calibri" w:ascii="Calibri" w:hAnsi="Calibri" w:cs="Calibri"/>
+          <w:kern w:val="0"/>
+          <w:sz w:val="22"/>
         </w:rPr>
         <w:t>.</w:t>
       </w:r>
@@ -4866,46 +4480,51 @@
       </w:pPr>
       <w:r>
         <w:rPr>
-          <w:rFonts w:eastAsia="Times New Roman"/>
-          <w:b/>
-          <w:bCs/>
-          <w:kern w:val="0"/>
+          <w:rFonts w:eastAsia="Calibri" w:ascii="Calibri" w:hAnsi="Calibri" w:cs="Calibri"/>
+          <w:b/>
+          <w:bCs/>
+          <w:kern w:val="0"/>
+          <w:sz w:val="22"/>
           <w:u w:val="single"/>
         </w:rPr>
         <w:t>Xia, Z.</w:t>
       </w:r>
       <w:r>
         <w:rPr>
-          <w:rFonts w:eastAsia="Times New Roman" w:hint="eastAsia"/>
-          <w:b/>
-          <w:bCs/>
-          <w:kern w:val="0"/>
+          <w:rFonts w:eastAsia="Calibri" w:hint="eastAsia" w:ascii="Calibri" w:hAnsi="Calibri" w:cs="Calibri"/>
+          <w:b/>
+          <w:bCs/>
+          <w:kern w:val="0"/>
+          <w:sz w:val="22"/>
           <w:u w:val="single"/>
         </w:rPr>
         <w:t>*</w:t>
       </w:r>
       <w:r>
         <w:rPr>
-          <w:rFonts w:eastAsia="Times New Roman"/>
-          <w:kern w:val="0"/>
+          <w:rFonts w:eastAsia="Calibri" w:ascii="Calibri" w:hAnsi="Calibri" w:cs="Calibri"/>
+          <w:kern w:val="0"/>
+          <w:sz w:val="22"/>
         </w:rPr>
         <w:t> (2022). Digital Interventions for A Sustainable Future. </w:t>
       </w:r>
       <w:r>
         <w:rPr>
-          <w:rFonts w:eastAsia="Times New Roman"/>
+          <w:rFonts w:eastAsia="Calibri" w:ascii="Calibri" w:hAnsi="Calibri" w:cs="Calibri"/>
           <w:b/>
           <w:bCs/>
           <w:i/>
           <w:iCs/>
           <w:kern w:val="0"/>
+          <w:sz w:val="22"/>
         </w:rPr>
         <w:t>Nature Reviews Psychology</w:t>
       </w:r>
       <w:r>
         <w:rPr>
-          <w:rFonts w:eastAsia="Times New Roman"/>
-          <w:kern w:val="0"/>
+          <w:rFonts w:eastAsia="Calibri" w:ascii="Calibri" w:hAnsi="Calibri" w:cs="Calibri"/>
+          <w:kern w:val="0"/>
+          <w:sz w:val="22"/>
         </w:rPr>
         <w:t>. (Commentary)</w:t>
       </w:r>
@@ -4926,36 +4545,40 @@
       </w:pPr>
       <w:r>
         <w:rPr>
-          <w:rFonts w:eastAsia="Times New Roman"/>
-          <w:b/>
-          <w:bCs/>
-          <w:kern w:val="0"/>
+          <w:rFonts w:eastAsia="Calibri" w:ascii="Calibri" w:hAnsi="Calibri" w:cs="Calibri"/>
+          <w:b/>
+          <w:bCs/>
+          <w:kern w:val="0"/>
+          <w:sz w:val="22"/>
           <w:u w:val="single"/>
         </w:rPr>
         <w:t>Xia, Z.</w:t>
       </w:r>
       <w:r>
         <w:rPr>
-          <w:rFonts w:eastAsia="Times New Roman"/>
-          <w:kern w:val="0"/>
+          <w:rFonts w:eastAsia="Calibri" w:ascii="Calibri" w:hAnsi="Calibri" w:cs="Calibri"/>
+          <w:kern w:val="0"/>
+          <w:sz w:val="22"/>
         </w:rPr>
         <w:t>, Ye, J., Chou, Y., …, Zhang, C. (2022). Meta-analysis of Climate Change Experience and Climate Change Perception. </w:t>
       </w:r>
       <w:r>
         <w:rPr>
-          <w:rFonts w:eastAsia="Times New Roman"/>
+          <w:rFonts w:eastAsia="Calibri" w:ascii="Calibri" w:hAnsi="Calibri" w:cs="Calibri"/>
           <w:b/>
           <w:bCs/>
           <w:i/>
           <w:iCs/>
           <w:kern w:val="0"/>
+          <w:sz w:val="22"/>
         </w:rPr>
         <w:t>Environmental Research Communication</w:t>
       </w:r>
       <w:r>
         <w:rPr>
-          <w:rFonts w:eastAsia="Times New Roman"/>
-          <w:kern w:val="0"/>
+          <w:rFonts w:eastAsia="Calibri" w:ascii="Calibri" w:hAnsi="Calibri" w:cs="Calibri"/>
+          <w:kern w:val="0"/>
+          <w:sz w:val="22"/>
         </w:rPr>
         <w:t>.</w:t>
       </w:r>
@@ -4976,42 +4599,47 @@
       </w:pPr>
       <w:r>
         <w:rPr>
-          <w:rFonts w:eastAsia="Times New Roman"/>
-          <w:kern w:val="0"/>
+          <w:rFonts w:eastAsia="Calibri" w:ascii="Calibri" w:hAnsi="Calibri" w:cs="Calibri"/>
+          <w:kern w:val="0"/>
+          <w:sz w:val="22"/>
         </w:rPr>
         <w:t>Tian, X.</w:t>
       </w:r>
       <w:r>
         <w:rPr>
-          <w:rFonts w:eastAsia="Times New Roman" w:hint="eastAsia"/>
-          <w:kern w:val="0"/>
+          <w:rFonts w:eastAsia="Calibri" w:hint="eastAsia" w:ascii="Calibri" w:hAnsi="Calibri" w:cs="Calibri"/>
+          <w:kern w:val="0"/>
+          <w:sz w:val="22"/>
           <w:vertAlign w:val="superscript"/>
         </w:rPr>
         <w:t>#</w:t>
       </w:r>
       <w:r>
         <w:rPr>
-          <w:rFonts w:eastAsia="Times New Roman"/>
-          <w:kern w:val="0"/>
+          <w:rFonts w:eastAsia="Calibri" w:ascii="Calibri" w:hAnsi="Calibri" w:cs="Calibri"/>
+          <w:kern w:val="0"/>
+          <w:sz w:val="22"/>
         </w:rPr>
         <w:t>, </w:t>
       </w:r>
       <w:r>
         <w:rPr>
-          <w:rFonts w:eastAsia="Times New Roman"/>
-          <w:b/>
-          <w:bCs/>
-          <w:kern w:val="0"/>
+          <w:rFonts w:eastAsia="Calibri" w:ascii="Calibri" w:hAnsi="Calibri" w:cs="Calibri"/>
+          <w:b/>
+          <w:bCs/>
+          <w:kern w:val="0"/>
+          <w:sz w:val="22"/>
           <w:u w:val="single"/>
         </w:rPr>
         <w:t>Xia, Z.</w:t>
       </w:r>
       <w:r>
         <w:rPr>
-          <w:rFonts w:eastAsia="Times New Roman" w:hint="eastAsia"/>
-          <w:b/>
-          <w:bCs/>
-          <w:kern w:val="0"/>
+          <w:rFonts w:eastAsia="Calibri" w:hint="eastAsia" w:ascii="Calibri" w:hAnsi="Calibri" w:cs="Calibri"/>
+          <w:b/>
+          <w:bCs/>
+          <w:kern w:val="0"/>
+          <w:sz w:val="22"/>
           <w:u w:val="single"/>
           <w:vertAlign w:val="superscript"/>
         </w:rPr>
@@ -5019,26 +4647,29 @@
       </w:r>
       <w:r>
         <w:rPr>
-          <w:rFonts w:eastAsia="Times New Roman"/>
-          <w:kern w:val="0"/>
+          <w:rFonts w:eastAsia="Calibri" w:ascii="Calibri" w:hAnsi="Calibri" w:cs="Calibri"/>
+          <w:kern w:val="0"/>
+          <w:sz w:val="22"/>
         </w:rPr>
         <w:t>, …, Xu, M. (2022). A meta-analytical review of intervention experiments to reduce food waste. </w:t>
       </w:r>
       <w:r>
         <w:rPr>
-          <w:rFonts w:eastAsia="Times New Roman"/>
+          <w:rFonts w:eastAsia="Calibri" w:ascii="Calibri" w:hAnsi="Calibri" w:cs="Calibri"/>
           <w:b/>
           <w:bCs/>
           <w:i/>
           <w:iCs/>
           <w:kern w:val="0"/>
+          <w:sz w:val="22"/>
         </w:rPr>
         <w:t>Environmental Research Letters</w:t>
       </w:r>
       <w:r>
         <w:rPr>
-          <w:rFonts w:eastAsia="Times New Roman"/>
-          <w:kern w:val="0"/>
+          <w:rFonts w:eastAsia="Calibri" w:ascii="Calibri" w:hAnsi="Calibri" w:cs="Calibri"/>
+          <w:kern w:val="0"/>
+          <w:sz w:val="22"/>
         </w:rPr>
         <w:t>. (Co-first author)</w:t>
       </w:r>
@@ -5059,43 +4690,48 @@
       </w:pPr>
       <w:r>
         <w:rPr>
-          <w:rFonts w:eastAsia="Times New Roman"/>
-          <w:kern w:val="0"/>
+          <w:rFonts w:eastAsia="Calibri" w:ascii="Calibri" w:hAnsi="Calibri" w:cs="Calibri"/>
+          <w:kern w:val="0"/>
+          <w:sz w:val="22"/>
         </w:rPr>
         <w:t>Fan, J., Liu, G., </w:t>
       </w:r>
       <w:r>
         <w:rPr>
-          <w:rFonts w:eastAsia="Times New Roman"/>
-          <w:b/>
-          <w:bCs/>
-          <w:kern w:val="0"/>
+          <w:rFonts w:eastAsia="Calibri" w:ascii="Calibri" w:hAnsi="Calibri" w:cs="Calibri"/>
+          <w:b/>
+          <w:bCs/>
+          <w:kern w:val="0"/>
+          <w:sz w:val="22"/>
           <w:u w:val="single"/>
         </w:rPr>
         <w:t>Xia, Z.</w:t>
       </w:r>
       <w:r>
         <w:rPr>
-          <w:rFonts w:eastAsia="Times New Roman"/>
-          <w:kern w:val="0"/>
+          <w:rFonts w:eastAsia="Calibri" w:ascii="Calibri" w:hAnsi="Calibri" w:cs="Calibri"/>
+          <w:kern w:val="0"/>
+          <w:sz w:val="22"/>
         </w:rPr>
         <w:t> &amp; Cai, S. (2022). A bibliometric analysis of climate change risk perception: Hot spots, trends and improvements. </w:t>
       </w:r>
       <w:r>
         <w:rPr>
-          <w:rFonts w:eastAsia="Times New Roman"/>
+          <w:rFonts w:eastAsia="Calibri" w:ascii="Calibri" w:hAnsi="Calibri" w:cs="Calibri"/>
           <w:b/>
           <w:bCs/>
           <w:i/>
           <w:iCs/>
           <w:kern w:val="0"/>
+          <w:sz w:val="22"/>
         </w:rPr>
         <w:t>Frontiers in Environmental Science</w:t>
       </w:r>
       <w:r>
         <w:rPr>
-          <w:rFonts w:eastAsia="Times New Roman"/>
-          <w:kern w:val="0"/>
+          <w:rFonts w:eastAsia="Calibri" w:ascii="Calibri" w:hAnsi="Calibri" w:cs="Calibri"/>
+          <w:kern w:val="0"/>
+          <w:sz w:val="22"/>
         </w:rPr>
         <w:t>.</w:t>
       </w:r>
@@ -5116,36 +4752,40 @@
       </w:pPr>
       <w:r>
         <w:rPr>
-          <w:rFonts w:eastAsia="Times New Roman"/>
-          <w:b/>
-          <w:bCs/>
-          <w:kern w:val="0"/>
+          <w:rFonts w:eastAsia="Calibri" w:ascii="Calibri" w:hAnsi="Calibri" w:cs="Calibri"/>
+          <w:b/>
+          <w:bCs/>
+          <w:kern w:val="0"/>
+          <w:sz w:val="22"/>
           <w:u w:val="single"/>
         </w:rPr>
         <w:t>Xia, Z.</w:t>
       </w:r>
       <w:r>
         <w:rPr>
-          <w:rFonts w:eastAsia="Times New Roman"/>
-          <w:kern w:val="0"/>
+          <w:rFonts w:eastAsia="Calibri" w:ascii="Calibri" w:hAnsi="Calibri" w:cs="Calibri"/>
+          <w:kern w:val="0"/>
+          <w:sz w:val="22"/>
         </w:rPr>
         <w:t>, Zhang, S., Tian, X., &amp; Liu, Y. (2021). Understanding waste sorting behavior and key influencing factors through internet of things: Evidence from college student community. </w:t>
       </w:r>
       <w:r>
         <w:rPr>
-          <w:rFonts w:eastAsia="Times New Roman"/>
+          <w:rFonts w:eastAsia="Calibri" w:ascii="Calibri" w:hAnsi="Calibri" w:cs="Calibri"/>
           <w:b/>
           <w:bCs/>
           <w:i/>
           <w:iCs/>
           <w:kern w:val="0"/>
+          <w:sz w:val="22"/>
         </w:rPr>
         <w:t>Resources, Conservation and Recycling</w:t>
       </w:r>
       <w:r>
         <w:rPr>
-          <w:rFonts w:eastAsia="Times New Roman"/>
-          <w:kern w:val="0"/>
+          <w:rFonts w:eastAsia="Calibri" w:ascii="Calibri" w:hAnsi="Calibri" w:cs="Calibri"/>
+          <w:kern w:val="0"/>
+          <w:sz w:val="22"/>
         </w:rPr>
         <w:t>, 174, 105775.</w:t>
       </w:r>
@@ -5166,36 +4806,40 @@
       </w:pPr>
       <w:r>
         <w:rPr>
-          <w:rFonts w:eastAsia="Times New Roman"/>
-          <w:b/>
-          <w:bCs/>
-          <w:kern w:val="0"/>
+          <w:rFonts w:eastAsia="Calibri" w:ascii="Calibri" w:hAnsi="Calibri" w:cs="Calibri"/>
+          <w:b/>
+          <w:bCs/>
+          <w:kern w:val="0"/>
+          <w:sz w:val="22"/>
           <w:u w:val="single"/>
         </w:rPr>
         <w:t>Xia, Z.</w:t>
       </w:r>
       <w:r>
         <w:rPr>
-          <w:rFonts w:eastAsia="Times New Roman"/>
-          <w:kern w:val="0"/>
+          <w:rFonts w:eastAsia="Calibri" w:ascii="Calibri" w:hAnsi="Calibri" w:cs="Calibri"/>
+          <w:kern w:val="0"/>
+          <w:sz w:val="22"/>
         </w:rPr>
         <w:t>, &amp; Liu, Y. (2021). Aiding pro-environmental behavior measurement by Internet of Things. </w:t>
       </w:r>
       <w:r>
         <w:rPr>
-          <w:rFonts w:eastAsia="Times New Roman"/>
+          <w:rFonts w:eastAsia="Calibri" w:ascii="Calibri" w:hAnsi="Calibri" w:cs="Calibri"/>
           <w:b/>
           <w:bCs/>
           <w:i/>
           <w:iCs/>
           <w:kern w:val="0"/>
+          <w:sz w:val="22"/>
         </w:rPr>
         <w:t>Current Research in Behavioral Sciences</w:t>
       </w:r>
       <w:r>
         <w:rPr>
-          <w:rFonts w:eastAsia="Times New Roman"/>
-          <w:kern w:val="0"/>
+          <w:rFonts w:eastAsia="Calibri" w:ascii="Calibri" w:hAnsi="Calibri" w:cs="Calibri"/>
+          <w:kern w:val="0"/>
+          <w:sz w:val="22"/>
         </w:rPr>
         <w:t>, 2, 100055.</w:t>
       </w:r>
@@ -5203,7 +4847,7 @@
     </w:p>
     <w:p>
       <w:pPr>
-        <w:spacing w:after="0"/>
+        <w:spacing w:after="0" w:before="0" w:line="20" w:lineRule="exact"/>
         <w:rPr>
           <w:rFonts w:eastAsiaTheme="minorEastAsia"/>
           <w:b/>
@@ -5214,7 +4858,7 @@
     <w:p>
       <w:pPr>
         <w:keepNext/>
-        <w:spacing w:after="0"/>
+        <w:spacing w:after="80" w:before="160"/>
         <w:rPr>
           <w:rFonts w:eastAsiaTheme="minorEastAsia"/>
           <w:b/>
@@ -5223,32 +4867,35 @@
       </w:pPr>
       <w:r>
         <w:rPr>
-          <w:rFonts w:eastAsiaTheme="minorEastAsia"/>
-          <w:b/>
-          <w:bCs/>
+          <w:rFonts w:ascii="Calibri" w:hAnsi="Calibri" w:eastAsia="Calibri" w:cs="Calibri"/>
+          <w:b/>
+          <w:bCs/>
+          <w:sz w:val="22"/>
         </w:rPr>
         <w:t>Consortia</w:t>
       </w:r>
       <w:r>
         <w:rPr>
-          <w:rFonts w:eastAsiaTheme="minorEastAsia" w:hint="eastAsia"/>
-          <w:b/>
-          <w:bCs/>
+          <w:rFonts w:hint="eastAsia" w:ascii="Calibri" w:hAnsi="Calibri" w:eastAsia="Calibri" w:cs="Calibri"/>
+          <w:b/>
+          <w:bCs/>
+          <w:sz w:val="22"/>
         </w:rPr>
         <w:t xml:space="preserve"> </w:t>
       </w:r>
       <w:r>
         <w:rPr>
-          <w:rFonts w:eastAsiaTheme="minorEastAsia"/>
-          <w:b/>
-          <w:bCs/>
+          <w:rFonts w:ascii="Calibri" w:hAnsi="Calibri" w:eastAsia="Calibri" w:cs="Calibri"/>
+          <w:b/>
+          <w:bCs/>
+          <w:sz w:val="22"/>
         </w:rPr>
         <w:t>co-author</w:t>
       </w:r>
     </w:p>
     <w:p>
       <w:pPr>
-        <w:spacing w:after="0"/>
+        <w:spacing w:after="0" w:before="0" w:line="20" w:lineRule="exact"/>
         <w:rPr>
           <w:rFonts w:eastAsiaTheme="minorEastAsia"/>
           <w:i/>
@@ -5272,70 +4919,70 @@
       </w:pPr>
       <w:r>
         <w:rPr>
-          <w:rFonts w:ascii="Arial" w:hAnsi="Arial"/>
+          <w:rFonts w:ascii="Calibri" w:hAnsi="Calibri" w:eastAsia="Calibri" w:cs="Calibri"/>
           <w:b w:val="0"/>
           <w:i w:val="0"/>
-          <w:sz w:val="20"/>
+          <w:sz w:val="22"/>
           <w:u w:val="none"/>
         </w:rPr>
         <w:t xml:space="preserve">Peters, K., Jeftić, A., Ballard, T., Zhou, S., Steffens, N. K., Inceoglu, I., Ryan, M. K., ..., </w:t>
       </w:r>
       <w:r>
         <w:rPr>
-          <w:rFonts w:ascii="Arial" w:hAnsi="Arial"/>
+          <w:rFonts w:ascii="Calibri" w:hAnsi="Calibri" w:eastAsia="Calibri" w:cs="Calibri"/>
           <w:b/>
           <w:i w:val="0"/>
-          <w:sz w:val="20"/>
+          <w:sz w:val="22"/>
           <w:u w:val="single"/>
         </w:rPr>
         <w:t>Xia, Z.</w:t>
       </w:r>
       <w:r>
         <w:rPr>
-          <w:rFonts w:ascii="Arial" w:hAnsi="Arial"/>
+          <w:rFonts w:ascii="Calibri" w:hAnsi="Calibri" w:eastAsia="Calibri" w:cs="Calibri"/>
           <w:b w:val="0"/>
           <w:i w:val="0"/>
-          <w:sz w:val="20"/>
+          <w:sz w:val="22"/>
           <w:u w:val="none"/>
         </w:rPr>
         <w:t>, ... &amp; Ziółkowski, A.</w:t>
       </w:r>
       <w:r>
         <w:rPr>
-          <w:rFonts w:ascii="Arial" w:hAnsi="Arial"/>
+          <w:rFonts w:ascii="Calibri" w:hAnsi="Calibri" w:eastAsia="Calibri" w:cs="Calibri"/>
           <w:b w:val="0"/>
           <w:i w:val="0"/>
-          <w:sz w:val="20"/>
+          <w:sz w:val="22"/>
           <w:u w:val="none"/>
         </w:rPr>
         <w:t xml:space="preserve"> (2026). </w:t>
       </w:r>
       <w:r>
         <w:rPr>
-          <w:rFonts w:ascii="Arial" w:hAnsi="Arial"/>
+          <w:rFonts w:ascii="Calibri" w:hAnsi="Calibri" w:eastAsia="Calibri" w:cs="Calibri"/>
           <w:b w:val="0"/>
           <w:i w:val="0"/>
-          <w:sz w:val="20"/>
+          <w:sz w:val="22"/>
           <w:u w:val="none"/>
         </w:rPr>
         <w:t xml:space="preserve">Think political leader - think he or she? A multi-country test of a gender-fair language intervention to reduce gendered leadership stereotypes. </w:t>
       </w:r>
       <w:r>
         <w:rPr>
-          <w:rFonts w:ascii="Arial" w:hAnsi="Arial"/>
+          <w:rFonts w:ascii="Calibri" w:hAnsi="Calibri" w:eastAsia="Calibri" w:cs="Calibri"/>
           <w:b/>
           <w:i/>
-          <w:sz w:val="20"/>
+          <w:sz w:val="22"/>
           <w:u w:val="none"/>
         </w:rPr>
         <w:t>The Leadership Quarterly</w:t>
       </w:r>
       <w:r>
         <w:rPr>
-          <w:rFonts w:ascii="Arial" w:hAnsi="Arial"/>
+          <w:rFonts w:ascii="Calibri" w:hAnsi="Calibri" w:eastAsia="Calibri" w:cs="Calibri"/>
           <w:b w:val="0"/>
           <w:i w:val="0"/>
-          <w:sz w:val="20"/>
+          <w:sz w:val="22"/>
           <w:u w:val="none"/>
         </w:rPr>
         <w:t>, 37(6), 101991.</w:t>
@@ -5357,26 +5004,29 @@
       </w:pPr>
       <w:r>
         <w:rPr>
-          <w:rFonts w:eastAsia="Times New Roman"/>
-          <w:kern w:val="0"/>
+          <w:rFonts w:eastAsia="Calibri" w:ascii="Calibri" w:hAnsi="Calibri" w:cs="Calibri"/>
+          <w:kern w:val="0"/>
+          <w:sz w:val="22"/>
         </w:rPr>
         <w:t xml:space="preserve">Cologna, V., Meiler, S., Kropf, C. M., Lüthi, S., Mede, N. G., Bresch, D. N., ... &amp; Linden, S. V. D. (2025). Extreme weather event attribution predicts climate policy support across the world. </w:t>
       </w:r>
       <w:r>
         <w:rPr>
-          <w:rFonts w:eastAsia="Times New Roman"/>
+          <w:rFonts w:eastAsia="Calibri" w:ascii="Calibri" w:hAnsi="Calibri" w:cs="Calibri"/>
           <w:b/>
           <w:bCs/>
           <w:i/>
           <w:iCs/>
           <w:kern w:val="0"/>
+          <w:sz w:val="22"/>
         </w:rPr>
         <w:t>Nature Climate Change</w:t>
       </w:r>
       <w:r>
         <w:rPr>
-          <w:rFonts w:eastAsia="Times New Roman"/>
-          <w:kern w:val="0"/>
+          <w:rFonts w:eastAsia="Calibri" w:ascii="Calibri" w:hAnsi="Calibri" w:cs="Calibri"/>
+          <w:kern w:val="0"/>
+          <w:sz w:val="22"/>
         </w:rPr>
         <w:t>, 1-11.</w:t>
       </w:r>
@@ -5397,15 +5047,17 @@
       </w:pPr>
       <w:r>
         <w:rPr>
-          <w:rFonts w:eastAsia="Times New Roman"/>
-          <w:kern w:val="0"/>
+          <w:rFonts w:eastAsia="Calibri" w:ascii="Calibri" w:hAnsi="Calibri" w:cs="Calibri"/>
+          <w:kern w:val="0"/>
+          <w:sz w:val="22"/>
         </w:rPr>
         <w:t>Public communication about science across 68 countries: Global evidence on how people get information and communicate about science-related matters</w:t>
       </w:r>
       <w:r>
         <w:rPr>
-          <w:rFonts w:eastAsia="Times New Roman" w:hint="eastAsia"/>
-          <w:kern w:val="0"/>
+          <w:rFonts w:eastAsia="Calibri" w:hint="eastAsia" w:ascii="Calibri" w:hAnsi="Calibri" w:cs="Calibri"/>
+          <w:kern w:val="0"/>
+          <w:sz w:val="22"/>
         </w:rPr>
         <w:t xml:space="preserve"> </w:t>
       </w:r>
@@ -5422,6 +5074,7 @@
     <w:p>
       <w:pPr>
         <w:pStyle w:val="Heading2"/>
+        <w:keepNext/>
         <w:tabs>
           <w:tab w:val="center" w:pos="3601"/>
           <w:tab w:val="center" w:pos="8155"/>
@@ -5433,7 +5086,9 @@
       </w:pPr>
       <w:r>
         <w:rPr>
-          <w:rFonts w:asciiTheme="minorEastAsia" w:eastAsiaTheme="minorEastAsia" w:hAnsiTheme="minorEastAsia"/>
+          <w:rFonts w:ascii="Trebuchet MS" w:hAnsi="Trebuchet MS" w:eastAsia="Trebuchet MS" w:cs="Trebuchet MS"/>
+          <w:b/>
+          <w:sz w:val="24"/>
         </w:rPr>
         <w:t>SERVICE</w:t>
       </w:r>
@@ -5441,144 +5096,11 @@
     <w:p>
       <w:pPr>
         <w:spacing w:after="96"/>
-      </w:pPr>
-      <w:r>
-        <w:rPr>
-          <w:noProof/>
-        </w:rPr>
-        <mc:AlternateContent>
-          <mc:Choice Requires="wpg">
-            <w:drawing>
-              <wp:inline distT="0" distB="0" distL="0" distR="0" wp14:anchorId="4D9C9A71" wp14:editId="0BDDC130">
-                <wp:extent cx="6857988" cy="13716"/>
-                <wp:effectExtent l="0" t="0" r="0" b="0"/>
-                <wp:docPr id="16" name="Group 9747"/>
-                <wp:cNvGraphicFramePr/>
-                <a:graphic xmlns:a="http://schemas.openxmlformats.org/drawingml/2006/main">
-                  <a:graphicData uri="http://schemas.microsoft.com/office/word/2010/wordprocessingGroup">
-                    <wpg:wgp>
-                      <wpg:cNvGrpSpPr/>
-                      <wpg:grpSpPr>
-                        <a:xfrm>
-                          <a:off x="0" y="0"/>
-                          <a:ext cx="6857988" cy="13716"/>
-                          <a:chOff x="0" y="0"/>
-                          <a:chExt cx="6857988" cy="13716"/>
-                        </a:xfrm>
-                      </wpg:grpSpPr>
-                      <wps:wsp>
-                        <wps:cNvPr id="17" name="Shape 11124"/>
-                        <wps:cNvSpPr/>
-                        <wps:spPr>
-                          <a:xfrm>
-                            <a:off x="0" y="0"/>
-                            <a:ext cx="5177790" cy="13716"/>
-                          </a:xfrm>
-                          <a:custGeom>
-                            <a:avLst/>
-                            <a:gdLst/>
-                            <a:ahLst/>
-                            <a:cxnLst/>
-                            <a:rect l="0" t="0" r="0" b="0"/>
-                            <a:pathLst>
-                              <a:path w="5177790" h="13716">
-                                <a:moveTo>
-                                  <a:pt x="0" y="0"/>
-                                </a:moveTo>
-                                <a:lnTo>
-                                  <a:pt x="5177790" y="0"/>
-                                </a:lnTo>
-                                <a:lnTo>
-                                  <a:pt x="5177790" y="13716"/>
-                                </a:lnTo>
-                                <a:lnTo>
-                                  <a:pt x="0" y="13716"/>
-                                </a:lnTo>
-                                <a:lnTo>
-                                  <a:pt x="0" y="0"/>
-                                </a:lnTo>
-                              </a:path>
-                            </a:pathLst>
-                          </a:custGeom>
-                          <a:solidFill>
-                            <a:srgbClr val="000000"/>
-                          </a:solidFill>
-                          <a:ln w="0" cap="flat">
-                            <a:noFill/>
-                            <a:miter lim="127000"/>
-                          </a:ln>
-                          <a:effectLst/>
-                        </wps:spPr>
-                        <wps:bodyPr/>
-                      </wps:wsp>
-                      <wps:wsp>
-                        <wps:cNvPr id="18" name="Shape 11125"/>
-                        <wps:cNvSpPr/>
-                        <wps:spPr>
-                          <a:xfrm>
-                            <a:off x="5177778" y="0"/>
-                            <a:ext cx="1680210" cy="13716"/>
-                          </a:xfrm>
-                          <a:custGeom>
-                            <a:avLst/>
-                            <a:gdLst/>
-                            <a:ahLst/>
-                            <a:cxnLst/>
-                            <a:rect l="0" t="0" r="0" b="0"/>
-                            <a:pathLst>
-                              <a:path w="1680210" h="13716">
-                                <a:moveTo>
-                                  <a:pt x="0" y="0"/>
-                                </a:moveTo>
-                                <a:lnTo>
-                                  <a:pt x="1680210" y="0"/>
-                                </a:lnTo>
-                                <a:lnTo>
-                                  <a:pt x="1680210" y="13716"/>
-                                </a:lnTo>
-                                <a:lnTo>
-                                  <a:pt x="0" y="13716"/>
-                                </a:lnTo>
-                                <a:lnTo>
-                                  <a:pt x="0" y="0"/>
-                                </a:lnTo>
-                              </a:path>
-                            </a:pathLst>
-                          </a:custGeom>
-                          <a:solidFill>
-                            <a:srgbClr val="000000"/>
-                          </a:solidFill>
-                          <a:ln w="0" cap="flat">
-                            <a:noFill/>
-                            <a:miter lim="127000"/>
-                          </a:ln>
-                          <a:effectLst/>
-                        </wps:spPr>
-                        <wps:bodyPr/>
-                      </wps:wsp>
-                    </wpg:wgp>
-                  </a:graphicData>
-                </a:graphic>
-              </wp:inline>
-            </w:drawing>
-          </mc:Choice>
-          <mc:Fallback>
-            <w:pict>
-              <v:group w14:anchorId="08E87D56" id="Group 9747" o:spid="_x0000_s1026" style="width:540pt;height:1.1pt;mso-position-horizontal-relative:char;mso-position-vertical-relative:line" coordsize="68579,137" o:gfxdata="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">
-                <v:shape id="Shape 11124" o:spid="_x0000_s1027" style="position:absolute;width:51777;height:137;visibility:visible;mso-wrap-style:square;v-text-anchor:top" coordsize="5177790,13716" o:gfxdata="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" path="m,l5177790,r,13716l,13716,,e" fillcolor="black" stroked="f" strokeweight="0">
-                  <v:stroke miterlimit="83231f" joinstyle="miter"/>
-                  <v:path arrowok="t" textboxrect="0,0,5177790,13716"/>
-                </v:shape>
-                <v:shape id="Shape 11125" o:spid="_x0000_s1028" style="position:absolute;left:51777;width:16802;height:137;visibility:visible;mso-wrap-style:square;v-text-anchor:top" coordsize="1680210,13716" o:gfxdata="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" path="m,l1680210,r,13716l,13716,,e" fillcolor="black" stroked="f" strokeweight="0">
-                  <v:stroke miterlimit="83231f" joinstyle="miter"/>
-                  <v:path arrowok="t" textboxrect="0,0,1680210,13716"/>
-                </v:shape>
-                <w10:anchorlock/>
-              </v:group>
-            </w:pict>
-          </mc:Fallback>
-        </mc:AlternateContent>
-      </w:r>
+        <w:keepNext/>
+        <w:pBdr>
+          <w:bottom w:val="single" w:sz="8" w:space="0" w:color="000000"/>
+        </w:pBdr>
+      </w:pPr>
     </w:p>
     <w:p>
       <w:pPr>
@@ -6219,7 +5741,7 @@
       </w:pPr>
       <w:r>
         <w:rPr>
-          <w:rFonts w:ascii="Times New Roman" w:hAnsi="Times New Roman"/>
+          <w:rFonts w:ascii="Trebuchet MS" w:hAnsi="Trebuchet MS"/>
           <w:i/>
           <w:sz w:val="20"/>
         </w:rPr>
@@ -6239,7 +5761,7 @@
       </w:pPr>
       <w:r>
         <w:rPr>
-          <w:rFonts w:ascii="Times New Roman" w:hAnsi="Times New Roman"/>
+          <w:rFonts w:ascii="Trebuchet MS" w:hAnsi="Trebuchet MS"/>
           <w:i/>
           <w:sz w:val="20"/>
         </w:rPr>
@@ -6491,6 +6013,7 @@
     <w:p>
       <w:pPr>
         <w:pStyle w:val="Heading2"/>
+        <w:keepNext/>
         <w:tabs>
           <w:tab w:val="center" w:pos="3601"/>
           <w:tab w:val="center" w:pos="8155"/>
@@ -6498,156 +6021,38 @@
         <w:ind w:left="-15" w:firstLine="0"/>
       </w:pPr>
       <w:r>
+        <w:rPr>
+          <w:rFonts w:ascii="Trebuchet MS" w:hAnsi="Trebuchet MS" w:eastAsia="Trebuchet MS" w:cs="Trebuchet MS"/>
+          <w:b/>
+          <w:sz w:val="24"/>
+        </w:rPr>
         <w:t xml:space="preserve">SOCIETY </w:t>
       </w:r>
       <w:r>
+        <w:rPr>
+          <w:rFonts w:ascii="Trebuchet MS" w:hAnsi="Trebuchet MS" w:eastAsia="Trebuchet MS" w:cs="Trebuchet MS"/>
+          <w:b/>
+          <w:sz w:val="24"/>
+        </w:rPr>
         <w:t>M</w:t>
       </w:r>
       <w:r>
+        <w:rPr>
+          <w:rFonts w:ascii="Trebuchet MS" w:hAnsi="Trebuchet MS" w:eastAsia="Trebuchet MS" w:cs="Trebuchet MS"/>
+          <w:b/>
+          <w:sz w:val="24"/>
+        </w:rPr>
         <w:t>EMBERSHIPS</w:t>
       </w:r>
     </w:p>
     <w:p>
       <w:pPr>
         <w:spacing w:after="96"/>
-      </w:pPr>
-      <w:r>
-        <w:rPr>
-          <w:noProof/>
-        </w:rPr>
-        <mc:AlternateContent>
-          <mc:Choice Requires="wpg">
-            <w:drawing>
-              <wp:inline distT="0" distB="0" distL="0" distR="0" wp14:anchorId="4B45AA91" wp14:editId="4AAD5744">
-                <wp:extent cx="6857988" cy="13716"/>
-                <wp:effectExtent l="0" t="0" r="0" b="0"/>
-                <wp:docPr id="8" name="Group 9747"/>
-                <wp:cNvGraphicFramePr/>
-                <a:graphic xmlns:a="http://schemas.openxmlformats.org/drawingml/2006/main">
-                  <a:graphicData uri="http://schemas.microsoft.com/office/word/2010/wordprocessingGroup">
-                    <wpg:wgp>
-                      <wpg:cNvGrpSpPr/>
-                      <wpg:grpSpPr>
-                        <a:xfrm>
-                          <a:off x="0" y="0"/>
-                          <a:ext cx="6857988" cy="13716"/>
-                          <a:chOff x="0" y="0"/>
-                          <a:chExt cx="6857988" cy="13716"/>
-                        </a:xfrm>
-                      </wpg:grpSpPr>
-                      <wps:wsp>
-                        <wps:cNvPr id="14" name="Shape 11124"/>
-                        <wps:cNvSpPr/>
-                        <wps:spPr>
-                          <a:xfrm>
-                            <a:off x="0" y="0"/>
-                            <a:ext cx="5177790" cy="13716"/>
-                          </a:xfrm>
-                          <a:custGeom>
-                            <a:avLst/>
-                            <a:gdLst/>
-                            <a:ahLst/>
-                            <a:cxnLst/>
-                            <a:rect l="0" t="0" r="0" b="0"/>
-                            <a:pathLst>
-                              <a:path w="5177790" h="13716">
-                                <a:moveTo>
-                                  <a:pt x="0" y="0"/>
-                                </a:moveTo>
-                                <a:lnTo>
-                                  <a:pt x="5177790" y="0"/>
-                                </a:lnTo>
-                                <a:lnTo>
-                                  <a:pt x="5177790" y="13716"/>
-                                </a:lnTo>
-                                <a:lnTo>
-                                  <a:pt x="0" y="13716"/>
-                                </a:lnTo>
-                                <a:lnTo>
-                                  <a:pt x="0" y="0"/>
-                                </a:lnTo>
-                              </a:path>
-                            </a:pathLst>
-                          </a:custGeom>
-                          <a:solidFill>
-                            <a:srgbClr val="000000"/>
-                          </a:solidFill>
-                          <a:ln w="0" cap="flat">
-                            <a:noFill/>
-                            <a:miter lim="127000"/>
-                          </a:ln>
-                          <a:effectLst/>
-                        </wps:spPr>
-                        <wps:bodyPr/>
-                      </wps:wsp>
-                      <wps:wsp>
-                        <wps:cNvPr id="15" name="Shape 11125"/>
-                        <wps:cNvSpPr/>
-                        <wps:spPr>
-                          <a:xfrm>
-                            <a:off x="5177778" y="0"/>
-                            <a:ext cx="1680210" cy="13716"/>
-                          </a:xfrm>
-                          <a:custGeom>
-                            <a:avLst/>
-                            <a:gdLst/>
-                            <a:ahLst/>
-                            <a:cxnLst/>
-                            <a:rect l="0" t="0" r="0" b="0"/>
-                            <a:pathLst>
-                              <a:path w="1680210" h="13716">
-                                <a:moveTo>
-                                  <a:pt x="0" y="0"/>
-                                </a:moveTo>
-                                <a:lnTo>
-                                  <a:pt x="1680210" y="0"/>
-                                </a:lnTo>
-                                <a:lnTo>
-                                  <a:pt x="1680210" y="13716"/>
-                                </a:lnTo>
-                                <a:lnTo>
-                                  <a:pt x="0" y="13716"/>
-                                </a:lnTo>
-                                <a:lnTo>
-                                  <a:pt x="0" y="0"/>
-                                </a:lnTo>
-                              </a:path>
-                            </a:pathLst>
-                          </a:custGeom>
-                          <a:solidFill>
-                            <a:srgbClr val="000000"/>
-                          </a:solidFill>
-                          <a:ln w="0" cap="flat">
-                            <a:noFill/>
-                            <a:miter lim="127000"/>
-                          </a:ln>
-                          <a:effectLst/>
-                        </wps:spPr>
-                        <wps:bodyPr/>
-                      </wps:wsp>
-                    </wpg:wgp>
-                  </a:graphicData>
-                </a:graphic>
-              </wp:inline>
-            </w:drawing>
-          </mc:Choice>
-          <mc:Fallback>
-            <w:pict>
-              <v:group w14:anchorId="7F4D2C80" id="Group 9747" o:spid="_x0000_s1026" style="width:540pt;height:1.1pt;mso-position-horizontal-relative:char;mso-position-vertical-relative:line" coordsize="68579,137" o:gfxdata="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">
-                <v:shape id="Shape 11124" o:spid="_x0000_s1027" style="position:absolute;width:51777;height:137;visibility:visible;mso-wrap-style:square;v-text-anchor:top" coordsize="5177790,13716" o:gfxdata="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" path="m,l5177790,r,13716l,13716,,e" fillcolor="black" stroked="f" strokeweight="0">
-                  <v:stroke miterlimit="83231f" joinstyle="miter"/>
-                  <v:path arrowok="t" textboxrect="0,0,5177790,13716"/>
-                </v:shape>
-                <v:shape id="Shape 11125" o:spid="_x0000_s1028" style="position:absolute;left:51777;width:16802;height:137;visibility:visible;mso-wrap-style:square;v-text-anchor:top" coordsize="1680210,13716" o:gfxdata="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" path="m,l1680210,r,13716l,13716,,e" fillcolor="black" stroked="f" strokeweight="0">
-                  <v:stroke miterlimit="83231f" joinstyle="miter"/>
-                  <v:path arrowok="t" textboxrect="0,0,1680210,13716"/>
-                </v:shape>
-                <w10:anchorlock/>
-              </v:group>
-            </w:pict>
-          </mc:Fallback>
-        </mc:AlternateContent>
-      </w:r>
+        <w:keepNext/>
+        <w:pBdr>
+          <w:bottom w:val="single" w:sz="8" w:space="0" w:color="000000"/>
+        </w:pBdr>
+      </w:pPr>
     </w:p>
     <w:p>
       <w:pPr>
@@ -6761,28 +6166,46 @@
     <w:p>
       <w:pPr>
         <w:pStyle w:val="Heading2"/>
+        <w:keepNext/>
         <w:ind w:left="-5"/>
       </w:pPr>
       <w:r>
+        <w:rPr>
+          <w:rFonts w:ascii="Trebuchet MS" w:hAnsi="Trebuchet MS" w:eastAsia="Trebuchet MS" w:cs="Trebuchet MS"/>
+          <w:b/>
+          <w:sz w:val="24"/>
+        </w:rPr>
         <w:t xml:space="preserve">SELECTED </w:t>
       </w:r>
       <w:r>
+        <w:rPr>
+          <w:rFonts w:ascii="Trebuchet MS" w:hAnsi="Trebuchet MS" w:eastAsia="Trebuchet MS" w:cs="Trebuchet MS"/>
+          <w:b/>
+          <w:sz w:val="24"/>
+        </w:rPr>
         <w:t>HONORS AND AWARDS</w:t>
       </w:r>
       <w:r>
+        <w:rPr>
+          <w:rFonts w:ascii="Trebuchet MS" w:hAnsi="Trebuchet MS" w:eastAsia="Trebuchet MS" w:cs="Trebuchet MS"/>
+          <w:b/>
+          <w:sz w:val="24"/>
+        </w:rPr>
         <w:tab/>
       </w:r>
       <w:r>
         <w:rPr>
-          <w:b w:val="0"/>
-          <w:sz w:val="20"/>
+          <w:rFonts w:ascii="Trebuchet MS" w:hAnsi="Trebuchet MS" w:eastAsia="Trebuchet MS" w:cs="Trebuchet MS"/>
+          <w:b/>
+          <w:sz w:val="24"/>
         </w:rPr>
         <w:t xml:space="preserve"> </w:t>
       </w:r>
       <w:r>
         <w:rPr>
-          <w:b w:val="0"/>
-          <w:sz w:val="20"/>
+          <w:rFonts w:ascii="Trebuchet MS" w:hAnsi="Trebuchet MS" w:eastAsia="Trebuchet MS" w:cs="Trebuchet MS"/>
+          <w:b/>
+          <w:sz w:val="24"/>
         </w:rPr>
         <w:tab/>
         <w:t xml:space="preserve"> </w:t>
@@ -6794,144 +6217,11 @@
         <w:rPr>
           <w:rFonts w:eastAsiaTheme="minorEastAsia"/>
         </w:rPr>
-      </w:pPr>
-      <w:r>
-        <w:rPr>
-          <w:noProof/>
-        </w:rPr>
-        <mc:AlternateContent>
-          <mc:Choice Requires="wpg">
-            <w:drawing>
-              <wp:inline distT="0" distB="0" distL="0" distR="0" wp14:anchorId="219D3785" wp14:editId="2767AAE1">
-                <wp:extent cx="6857988" cy="13716"/>
-                <wp:effectExtent l="0" t="0" r="0" b="0"/>
-                <wp:docPr id="7" name="Group 9747"/>
-                <wp:cNvGraphicFramePr/>
-                <a:graphic xmlns:a="http://schemas.openxmlformats.org/drawingml/2006/main">
-                  <a:graphicData uri="http://schemas.microsoft.com/office/word/2010/wordprocessingGroup">
-                    <wpg:wgp>
-                      <wpg:cNvGrpSpPr/>
-                      <wpg:grpSpPr>
-                        <a:xfrm>
-                          <a:off x="0" y="0"/>
-                          <a:ext cx="6857988" cy="13716"/>
-                          <a:chOff x="0" y="0"/>
-                          <a:chExt cx="6857988" cy="13716"/>
-                        </a:xfrm>
-                      </wpg:grpSpPr>
-                      <wps:wsp>
-                        <wps:cNvPr id="9" name="Shape 11124"/>
-                        <wps:cNvSpPr/>
-                        <wps:spPr>
-                          <a:xfrm>
-                            <a:off x="0" y="0"/>
-                            <a:ext cx="5177790" cy="13716"/>
-                          </a:xfrm>
-                          <a:custGeom>
-                            <a:avLst/>
-                            <a:gdLst/>
-                            <a:ahLst/>
-                            <a:cxnLst/>
-                            <a:rect l="0" t="0" r="0" b="0"/>
-                            <a:pathLst>
-                              <a:path w="5177790" h="13716">
-                                <a:moveTo>
-                                  <a:pt x="0" y="0"/>
-                                </a:moveTo>
-                                <a:lnTo>
-                                  <a:pt x="5177790" y="0"/>
-                                </a:lnTo>
-                                <a:lnTo>
-                                  <a:pt x="5177790" y="13716"/>
-                                </a:lnTo>
-                                <a:lnTo>
-                                  <a:pt x="0" y="13716"/>
-                                </a:lnTo>
-                                <a:lnTo>
-                                  <a:pt x="0" y="0"/>
-                                </a:lnTo>
-                              </a:path>
-                            </a:pathLst>
-                          </a:custGeom>
-                          <a:solidFill>
-                            <a:srgbClr val="000000"/>
-                          </a:solidFill>
-                          <a:ln w="0" cap="flat">
-                            <a:noFill/>
-                            <a:miter lim="127000"/>
-                          </a:ln>
-                          <a:effectLst/>
-                        </wps:spPr>
-                        <wps:bodyPr/>
-                      </wps:wsp>
-                      <wps:wsp>
-                        <wps:cNvPr id="10" name="Shape 11125"/>
-                        <wps:cNvSpPr/>
-                        <wps:spPr>
-                          <a:xfrm>
-                            <a:off x="5177778" y="0"/>
-                            <a:ext cx="1680210" cy="13716"/>
-                          </a:xfrm>
-                          <a:custGeom>
-                            <a:avLst/>
-                            <a:gdLst/>
-                            <a:ahLst/>
-                            <a:cxnLst/>
-                            <a:rect l="0" t="0" r="0" b="0"/>
-                            <a:pathLst>
-                              <a:path w="1680210" h="13716">
-                                <a:moveTo>
-                                  <a:pt x="0" y="0"/>
-                                </a:moveTo>
-                                <a:lnTo>
-                                  <a:pt x="1680210" y="0"/>
-                                </a:lnTo>
-                                <a:lnTo>
-                                  <a:pt x="1680210" y="13716"/>
-                                </a:lnTo>
-                                <a:lnTo>
-                                  <a:pt x="0" y="13716"/>
-                                </a:lnTo>
-                                <a:lnTo>
-                                  <a:pt x="0" y="0"/>
-                                </a:lnTo>
-                              </a:path>
-                            </a:pathLst>
-                          </a:custGeom>
-                          <a:solidFill>
-                            <a:srgbClr val="000000"/>
-                          </a:solidFill>
-                          <a:ln w="0" cap="flat">
-                            <a:noFill/>
-                            <a:miter lim="127000"/>
-                          </a:ln>
-                          <a:effectLst/>
-                        </wps:spPr>
-                        <wps:bodyPr/>
-                      </wps:wsp>
-                    </wpg:wgp>
-                  </a:graphicData>
-                </a:graphic>
-              </wp:inline>
-            </w:drawing>
-          </mc:Choice>
-          <mc:Fallback>
-            <w:pict>
-              <v:group w14:anchorId="17162D13" id="Group 9747" o:spid="_x0000_s1026" style="width:540pt;height:1.1pt;mso-position-horizontal-relative:char;mso-position-vertical-relative:line" coordsize="68579,137" o:gfxdata="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">
-                <v:shape id="Shape 11124" o:spid="_x0000_s1027" style="position:absolute;width:51777;height:137;visibility:visible;mso-wrap-style:square;v-text-anchor:top" coordsize="5177790,13716" o:gfxdata="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" path="m,l5177790,r,13716l,13716,,e" fillcolor="black" stroked="f" strokeweight="0">
-                  <v:stroke miterlimit="83231f" joinstyle="miter"/>
-                  <v:path arrowok="t" textboxrect="0,0,5177790,13716"/>
-                </v:shape>
-                <v:shape id="Shape 11125" o:spid="_x0000_s1028" style="position:absolute;left:51777;width:16802;height:137;visibility:visible;mso-wrap-style:square;v-text-anchor:top" coordsize="1680210,13716" o:gfxdata="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" path="m,l1680210,r,13716l,13716,,e" fillcolor="black" stroked="f" strokeweight="0">
-                  <v:stroke miterlimit="83231f" joinstyle="miter"/>
-                  <v:path arrowok="t" textboxrect="0,0,1680210,13716"/>
-                </v:shape>
-                <w10:anchorlock/>
-              </v:group>
-            </w:pict>
-          </mc:Fallback>
-        </mc:AlternateContent>
-      </w:r>
+        <w:keepNext/>
+        <w:pBdr>
+          <w:bottom w:val="single" w:sz="8" w:space="0" w:color="000000"/>
+        </w:pBdr>
+      </w:pPr>
     </w:p>
     <w:p>
       <w:pPr>
@@ -7351,9 +6641,15 @@
     <w:p>
       <w:pPr>
         <w:pStyle w:val="Heading2"/>
+        <w:keepNext/>
         <w:ind w:left="-5"/>
       </w:pPr>
       <w:r>
+        <w:rPr>
+          <w:rFonts w:ascii="Trebuchet MS" w:hAnsi="Trebuchet MS" w:eastAsia="Trebuchet MS" w:cs="Trebuchet MS"/>
+          <w:b/>
+          <w:sz w:val="24"/>
+        </w:rPr>
         <w:lastRenderedPageBreak/>
         <w:t xml:space="preserve">TECHNICAL SKILLS </w:t>
       </w:r>
@@ -7364,161 +6660,11 @@
         <w:rPr>
           <w:rFonts w:eastAsiaTheme="minorEastAsia"/>
         </w:rPr>
-      </w:pPr>
-      <w:r>
-        <w:rPr>
-          <w:noProof/>
-        </w:rPr>
-        <mc:AlternateContent>
-          <mc:Choice Requires="wpg">
-            <w:drawing>
-              <wp:inline distT="0" distB="0" distL="0" distR="0" wp14:anchorId="7CB0551F" wp14:editId="13BE78FB">
-                <wp:extent cx="6857988" cy="13716"/>
-                <wp:effectExtent l="0" t="0" r="0" b="0"/>
-                <wp:docPr id="9541" name="Group 9541"/>
-                <wp:cNvGraphicFramePr/>
-                <a:graphic xmlns:a="http://schemas.openxmlformats.org/drawingml/2006/main">
-                  <a:graphicData uri="http://schemas.microsoft.com/office/word/2010/wordprocessingGroup">
-                    <wpg:wgp>
-                      <wpg:cNvGrpSpPr/>
-                      <wpg:grpSpPr>
-                        <a:xfrm>
-                          <a:off x="0" y="0"/>
-                          <a:ext cx="6857988" cy="13716"/>
-                          <a:chOff x="0" y="0"/>
-                          <a:chExt cx="6857988" cy="13716"/>
-                        </a:xfrm>
-                      </wpg:grpSpPr>
-                      <wps:wsp>
-                        <wps:cNvPr id="11140" name="Shape 11140"/>
-                        <wps:cNvSpPr/>
-                        <wps:spPr>
-                          <a:xfrm>
-                            <a:off x="0" y="0"/>
-                            <a:ext cx="5177790" cy="13716"/>
-                          </a:xfrm>
-                          <a:custGeom>
-                            <a:avLst/>
-                            <a:gdLst/>
-                            <a:ahLst/>
-                            <a:cxnLst/>
-                            <a:rect l="0" t="0" r="0" b="0"/>
-                            <a:pathLst>
-                              <a:path w="5177790" h="13716">
-                                <a:moveTo>
-                                  <a:pt x="0" y="0"/>
-                                </a:moveTo>
-                                <a:lnTo>
-                                  <a:pt x="5177790" y="0"/>
-                                </a:lnTo>
-                                <a:lnTo>
-                                  <a:pt x="5177790" y="13716"/>
-                                </a:lnTo>
-                                <a:lnTo>
-                                  <a:pt x="0" y="13716"/>
-                                </a:lnTo>
-                                <a:lnTo>
-                                  <a:pt x="0" y="0"/>
-                                </a:lnTo>
-                              </a:path>
-                            </a:pathLst>
-                          </a:custGeom>
-                          <a:ln w="0" cap="flat">
-                            <a:miter lim="127000"/>
-                          </a:ln>
-                        </wps:spPr>
-                        <wps:style>
-                          <a:lnRef idx="0">
-                            <a:srgbClr val="000000">
-                              <a:alpha val="0"/>
-                            </a:srgbClr>
-                          </a:lnRef>
-                          <a:fillRef idx="1">
-                            <a:srgbClr val="000000"/>
-                          </a:fillRef>
-                          <a:effectRef idx="0">
-                            <a:scrgbClr r="0" g="0" b="0"/>
-                          </a:effectRef>
-                          <a:fontRef idx="none"/>
-                        </wps:style>
-                        <wps:bodyPr/>
-                      </wps:wsp>
-                      <wps:wsp>
-                        <wps:cNvPr id="11141" name="Shape 11141"/>
-                        <wps:cNvSpPr/>
-                        <wps:spPr>
-                          <a:xfrm>
-                            <a:off x="5177778" y="0"/>
-                            <a:ext cx="1680210" cy="13716"/>
-                          </a:xfrm>
-                          <a:custGeom>
-                            <a:avLst/>
-                            <a:gdLst/>
-                            <a:ahLst/>
-                            <a:cxnLst/>
-                            <a:rect l="0" t="0" r="0" b="0"/>
-                            <a:pathLst>
-                              <a:path w="1680210" h="13716">
-                                <a:moveTo>
-                                  <a:pt x="0" y="0"/>
-                                </a:moveTo>
-                                <a:lnTo>
-                                  <a:pt x="1680210" y="0"/>
-                                </a:lnTo>
-                                <a:lnTo>
-                                  <a:pt x="1680210" y="13716"/>
-                                </a:lnTo>
-                                <a:lnTo>
-                                  <a:pt x="0" y="13716"/>
-                                </a:lnTo>
-                                <a:lnTo>
-                                  <a:pt x="0" y="0"/>
-                                </a:lnTo>
-                              </a:path>
-                            </a:pathLst>
-                          </a:custGeom>
-                          <a:ln w="0" cap="flat">
-                            <a:miter lim="127000"/>
-                          </a:ln>
-                        </wps:spPr>
-                        <wps:style>
-                          <a:lnRef idx="0">
-                            <a:srgbClr val="000000">
-                              <a:alpha val="0"/>
-                            </a:srgbClr>
-                          </a:lnRef>
-                          <a:fillRef idx="1">
-                            <a:srgbClr val="000000"/>
-                          </a:fillRef>
-                          <a:effectRef idx="0">
-                            <a:scrgbClr r="0" g="0" b="0"/>
-                          </a:effectRef>
-                          <a:fontRef idx="none"/>
-                        </wps:style>
-                        <wps:bodyPr/>
-                      </wps:wsp>
-                    </wpg:wgp>
-                  </a:graphicData>
-                </a:graphic>
-              </wp:inline>
-            </w:drawing>
-          </mc:Choice>
-          <mc:Fallback xmlns:a="http://schemas.openxmlformats.org/drawingml/2006/main">
-            <w:pict>
-              <v:group id="Group 9541" style="width:539.999pt;height:1.08002pt;mso-position-horizontal-relative:char;mso-position-vertical-relative:line" coordsize="68579,137">
-                <v:shape id="Shape 11142" style="position:absolute;width:51777;height:137;left:0;top:0;" coordsize="5177790,13716" path="m0,0l5177790,0l5177790,13716l0,13716l0,0">
-                  <v:stroke weight="0pt" endcap="flat" joinstyle="miter" miterlimit="10" on="false" color="#000000" opacity="0"/>
-                  <v:fill on="true" color="#000000"/>
-                </v:shape>
-                <v:shape id="Shape 11143" style="position:absolute;width:16802;height:137;left:51777;top:0;" coordsize="1680210,13716" path="m0,0l1680210,0l1680210,13716l0,13716l0,0">
-                  <v:stroke weight="0pt" endcap="flat" joinstyle="miter" miterlimit="10" on="false" color="#000000" opacity="0"/>
-                  <v:fill on="true" color="#000000"/>
-                </v:shape>
-              </v:group>
-            </w:pict>
-          </mc:Fallback>
-        </mc:AlternateContent>
-      </w:r>
+        <w:keepNext/>
+        <w:pBdr>
+          <w:bottom w:val="single" w:sz="8" w:space="0" w:color="000000"/>
+        </w:pBdr>
+      </w:pPr>
     </w:p>
     <w:p>
       <w:pPr>
@@ -7777,170 +6923,26 @@
     <w:p>
       <w:pPr>
         <w:pStyle w:val="Heading2"/>
+        <w:keepNext/>
         <w:ind w:left="-5"/>
       </w:pPr>
       <w:r>
+        <w:rPr>
+          <w:rFonts w:ascii="Trebuchet MS" w:hAnsi="Trebuchet MS" w:eastAsia="Trebuchet MS" w:cs="Trebuchet MS"/>
+          <w:b/>
+          <w:sz w:val="24"/>
+        </w:rPr>
         <w:t xml:space="preserve">LANGUAGES </w:t>
       </w:r>
     </w:p>
     <w:p>
       <w:pPr>
         <w:spacing w:after="108"/>
-      </w:pPr>
-      <w:r>
-        <w:rPr>
-          <w:noProof/>
-        </w:rPr>
-        <mc:AlternateContent>
-          <mc:Choice Requires="wpg">
-            <w:drawing>
-              <wp:inline distT="0" distB="0" distL="0" distR="0" wp14:anchorId="0D33EC42" wp14:editId="1BFB66DC">
-                <wp:extent cx="6857988" cy="13716"/>
-                <wp:effectExtent l="0" t="0" r="0" b="0"/>
-                <wp:docPr id="9542" name="Group 9542"/>
-                <wp:cNvGraphicFramePr/>
-                <a:graphic xmlns:a="http://schemas.openxmlformats.org/drawingml/2006/main">
-                  <a:graphicData uri="http://schemas.microsoft.com/office/word/2010/wordprocessingGroup">
-                    <wpg:wgp>
-                      <wpg:cNvGrpSpPr/>
-                      <wpg:grpSpPr>
-                        <a:xfrm>
-                          <a:off x="0" y="0"/>
-                          <a:ext cx="6857988" cy="13716"/>
-                          <a:chOff x="0" y="0"/>
-                          <a:chExt cx="6857988" cy="13716"/>
-                        </a:xfrm>
-                      </wpg:grpSpPr>
-                      <wps:wsp>
-                        <wps:cNvPr id="11144" name="Shape 11144"/>
-                        <wps:cNvSpPr/>
-                        <wps:spPr>
-                          <a:xfrm>
-                            <a:off x="0" y="0"/>
-                            <a:ext cx="5177790" cy="13716"/>
-                          </a:xfrm>
-                          <a:custGeom>
-                            <a:avLst/>
-                            <a:gdLst/>
-                            <a:ahLst/>
-                            <a:cxnLst/>
-                            <a:rect l="0" t="0" r="0" b="0"/>
-                            <a:pathLst>
-                              <a:path w="5177790" h="13716">
-                                <a:moveTo>
-                                  <a:pt x="0" y="0"/>
-                                </a:moveTo>
-                                <a:lnTo>
-                                  <a:pt x="5177790" y="0"/>
-                                </a:lnTo>
-                                <a:lnTo>
-                                  <a:pt x="5177790" y="13716"/>
-                                </a:lnTo>
-                                <a:lnTo>
-                                  <a:pt x="0" y="13716"/>
-                                </a:lnTo>
-                                <a:lnTo>
-                                  <a:pt x="0" y="0"/>
-                                </a:lnTo>
-                              </a:path>
-                            </a:pathLst>
-                          </a:custGeom>
-                          <a:ln w="0" cap="flat">
-                            <a:miter lim="127000"/>
-                          </a:ln>
-                        </wps:spPr>
-                        <wps:style>
-                          <a:lnRef idx="0">
-                            <a:srgbClr val="000000">
-                              <a:alpha val="0"/>
-                            </a:srgbClr>
-                          </a:lnRef>
-                          <a:fillRef idx="1">
-                            <a:srgbClr val="000000"/>
-                          </a:fillRef>
-                          <a:effectRef idx="0">
-                            <a:scrgbClr r="0" g="0" b="0"/>
-                          </a:effectRef>
-                          <a:fontRef idx="none"/>
-                        </wps:style>
-                        <wps:bodyPr/>
-                      </wps:wsp>
-                      <wps:wsp>
-                        <wps:cNvPr id="11145" name="Shape 11145"/>
-                        <wps:cNvSpPr/>
-                        <wps:spPr>
-                          <a:xfrm>
-                            <a:off x="5177778" y="0"/>
-                            <a:ext cx="1680210" cy="13716"/>
-                          </a:xfrm>
-                          <a:custGeom>
-                            <a:avLst/>
-                            <a:gdLst/>
-                            <a:ahLst/>
-                            <a:cxnLst/>
-                            <a:rect l="0" t="0" r="0" b="0"/>
-                            <a:pathLst>
-                              <a:path w="1680210" h="13716">
-                                <a:moveTo>
-                                  <a:pt x="0" y="0"/>
-                                </a:moveTo>
-                                <a:lnTo>
-                                  <a:pt x="1680210" y="0"/>
-                                </a:lnTo>
-                                <a:lnTo>
-                                  <a:pt x="1680210" y="13716"/>
-                                </a:lnTo>
-                                <a:lnTo>
-                                  <a:pt x="0" y="13716"/>
-                                </a:lnTo>
-                                <a:lnTo>
-                                  <a:pt x="0" y="0"/>
-                                </a:lnTo>
-                              </a:path>
-                            </a:pathLst>
-                          </a:custGeom>
-                          <a:ln w="0" cap="flat">
-                            <a:miter lim="127000"/>
-                          </a:ln>
-                        </wps:spPr>
-                        <wps:style>
-                          <a:lnRef idx="0">
-                            <a:srgbClr val="000000">
-                              <a:alpha val="0"/>
-                            </a:srgbClr>
-                          </a:lnRef>
-                          <a:fillRef idx="1">
-                            <a:srgbClr val="000000"/>
-                          </a:fillRef>
-                          <a:effectRef idx="0">
-                            <a:scrgbClr r="0" g="0" b="0"/>
-                          </a:effectRef>
-                          <a:fontRef idx="none"/>
-                        </wps:style>
-                        <wps:bodyPr/>
-                      </wps:wsp>
-                    </wpg:wgp>
-                  </a:graphicData>
-                </a:graphic>
-              </wp:inline>
-            </w:drawing>
-          </mc:Choice>
-          <mc:Fallback xmlns:a="http://schemas.openxmlformats.org/drawingml/2006/main">
-            <w:pict>
-              <v:group id="Group 9542" style="width:539.999pt;height:1.08002pt;mso-position-horizontal-relative:char;mso-position-vertical-relative:line" coordsize="68579,137">
-                <v:shape id="Shape 11146" style="position:absolute;width:51777;height:137;left:0;top:0;" coordsize="5177790,13716" path="m0,0l5177790,0l5177790,13716l0,13716l0,0">
-                  <v:stroke weight="0pt" endcap="flat" joinstyle="miter" miterlimit="10" on="false" color="#000000" opacity="0"/>
-                  <v:fill on="true" color="#000000"/>
-                </v:shape>
-                <v:shape id="Shape 11147" style="position:absolute;width:16802;height:137;left:51777;top:0;" coordsize="1680210,13716" path="m0,0l1680210,0l1680210,13716l0,13716l0,0">
-                  <v:stroke weight="0pt" endcap="flat" joinstyle="miter" miterlimit="10" on="false" color="#000000" opacity="0"/>
-                  <v:fill on="true" color="#000000"/>
-                </v:shape>
-              </v:group>
-            </w:pict>
-          </mc:Fallback>
-        </mc:AlternateContent>
-      </w:r>
+        <w:keepNext/>
+        <w:pBdr>
+          <w:bottom w:val="single" w:sz="8" w:space="0" w:color="000000"/>
+        </w:pBdr>
+      </w:pPr>
     </w:p>
     <w:p>
       <w:pPr>

</xml_diff>

<commit_message>
Tidy CV reviewer list spacing and alignment
</commit_message>
<xml_diff>
--- a/files/CV-Ziqian.docx
+++ b/files/CV-Ziqian.docx
@@ -4512,10 +4512,11 @@
     </w:p>
     <w:tbl>
       <w:tblPr>
-        <w:tblW w:type="dxa" w:w="9432"/>
+        <w:tblW w:type="dxa" w:w="10867"/>
         <w:tblLayout w:type="fixed"/>
         <w:tblLook w:firstColumn="1" w:firstRow="1" w:lastColumn="0" w:lastRow="0" w:noHBand="0" w:noVBand="1" w:val="04A0"/>
-        <w:tblInd w:w="648" w:type="dxa"/>
+        <w:jc w:val="left"/>
+        <w:tblInd w:w="0" w:type="dxa"/>
         <w:tblBorders>
           <w:top w:val="nil"/>
           <w:left w:val="nil"/>
@@ -4526,34 +4527,38 @@
         </w:tblBorders>
       </w:tblPr>
       <w:tblGrid>
-        <w:gridCol w:w="4392"/>
-        <w:gridCol w:w="360"/>
-        <w:gridCol w:w="4680"/>
+        <w:gridCol w:w="5433"/>
+        <w:gridCol w:w="5434"/>
       </w:tblGrid>
       <w:tr>
         <w:trPr>
           <w:tblHeader w:val="true"/>
+          <w:cantSplit/>
         </w:trPr>
         <w:tc>
           <w:tcPr>
-            <w:tcW w:type="dxa" w:w="9432"/>
-            <w:gridSpan w:val="3"/>
-            <w:vAlign w:val="center"/>
+            <w:tcW w:type="dxa" w:w="10867"/>
+            <w:gridSpan w:val="2"/>
+            <w:vAlign w:val="top"/>
             <w:tcMar>
-              <w:top w:w="0" w:type="dxa"/>
+              <w:top w:w="60" w:type="dxa"/>
+              <w:bottom w:w="0" w:type="dxa"/>
               <w:start w:w="0" w:type="dxa"/>
-              <w:bottom w:w="45" w:type="dxa"/>
               <w:end w:w="0" w:type="dxa"/>
             </w:tcMar>
           </w:tcPr>
           <w:p>
             <w:pPr>
-              <w:spacing w:before="0" w:after="40"/>
+              <w:keepNext/>
+              <w:keepLines/>
+              <w:spacing w:before="0" w:after="80" w:line="252" w:lineRule="auto"/>
+              <w:ind w:left="0" w:right="0" w:firstLine="0"/>
             </w:pPr>
             <w:r>
               <w:rPr>
                 <w:rFonts w:ascii="Trebuchet MS" w:hAnsi="Trebuchet MS" w:eastAsia="Trebuchet MS" w:cs="Trebuchet MS"/>
                 <w:b/>
+                <w:i w:val="0"/>
                 <w:sz w:val="20"/>
               </w:rPr>
               <w:t>Selected Ad Hoc Reviewer for</w:t>
@@ -4562,24 +4567,31 @@
         </w:tc>
       </w:tr>
       <w:tr>
+        <w:trPr>
+          <w:cantSplit/>
+        </w:trPr>
         <w:tc>
           <w:tcPr>
-            <w:tcW w:type="dxa" w:w="4392"/>
-            <w:vAlign w:val="center"/>
+            <w:tcW w:type="dxa" w:w="5433"/>
+            <w:vAlign w:val="top"/>
             <w:tcMar>
-              <w:top w:w="20" w:type="dxa"/>
+              <w:top w:w="0" w:type="dxa"/>
+              <w:bottom w:w="0" w:type="dxa"/>
               <w:start w:w="0" w:type="dxa"/>
-              <w:bottom w:w="20" w:type="dxa"/>
-              <w:end w:w="80" w:type="dxa"/>
+              <w:end w:w="120" w:type="dxa"/>
             </w:tcMar>
           </w:tcPr>
           <w:p>
             <w:pPr>
-              <w:spacing w:before="0" w:after="16" w:line="240" w:lineRule="auto"/>
+              <w:keepNext w:val="0"/>
+              <w:keepLines/>
+              <w:spacing w:before="0" w:after="40" w:line="252" w:lineRule="auto"/>
+              <w:ind w:left="0" w:right="0" w:firstLine="0"/>
             </w:pPr>
             <w:r>
               <w:rPr>
                 <w:rFonts w:ascii="Trebuchet MS" w:hAnsi="Trebuchet MS" w:eastAsia="Trebuchet MS" w:cs="Trebuchet MS"/>
+                <w:b w:val="0"/>
                 <w:i/>
                 <w:sz w:val="19"/>
               </w:rPr>
@@ -4589,35 +4601,26 @@
         </w:tc>
         <w:tc>
           <w:tcPr>
-            <w:tcW w:type="dxa" w:w="360"/>
-            <w:vAlign w:val="center"/>
+            <w:tcW w:type="dxa" w:w="5434"/>
+            <w:vAlign w:val="top"/>
             <w:tcMar>
               <w:top w:w="0" w:type="dxa"/>
-              <w:start w:w="0" w:type="dxa"/>
               <w:bottom w:w="0" w:type="dxa"/>
+              <w:start w:w="120" w:type="dxa"/>
               <w:end w:w="0" w:type="dxa"/>
-            </w:tcMar>
-          </w:tcPr>
-          <w:p/>
-        </w:tc>
-        <w:tc>
-          <w:tcPr>
-            <w:tcW w:type="dxa" w:w="4680"/>
-            <w:vAlign w:val="center"/>
-            <w:tcMar>
-              <w:top w:w="20" w:type="dxa"/>
-              <w:start w:w="0" w:type="dxa"/>
-              <w:bottom w:w="20" w:type="dxa"/>
-              <w:end w:w="80" w:type="dxa"/>
             </w:tcMar>
           </w:tcPr>
           <w:p>
             <w:pPr>
-              <w:spacing w:before="0" w:after="16" w:line="240" w:lineRule="auto"/>
+              <w:keepNext w:val="0"/>
+              <w:keepLines/>
+              <w:spacing w:before="0" w:after="40" w:line="252" w:lineRule="auto"/>
+              <w:ind w:left="0" w:right="0" w:firstLine="0"/>
             </w:pPr>
             <w:r>
               <w:rPr>
                 <w:rFonts w:ascii="Trebuchet MS" w:hAnsi="Trebuchet MS" w:eastAsia="Trebuchet MS" w:cs="Trebuchet MS"/>
+                <w:b w:val="0"/>
                 <w:i/>
                 <w:sz w:val="19"/>
               </w:rPr>
@@ -4627,24 +4630,31 @@
         </w:tc>
       </w:tr>
       <w:tr>
+        <w:trPr>
+          <w:cantSplit/>
+        </w:trPr>
         <w:tc>
           <w:tcPr>
-            <w:tcW w:type="dxa" w:w="4392"/>
-            <w:vAlign w:val="center"/>
+            <w:tcW w:type="dxa" w:w="5433"/>
+            <w:vAlign w:val="top"/>
             <w:tcMar>
-              <w:top w:w="20" w:type="dxa"/>
+              <w:top w:w="0" w:type="dxa"/>
+              <w:bottom w:w="0" w:type="dxa"/>
               <w:start w:w="0" w:type="dxa"/>
-              <w:bottom w:w="20" w:type="dxa"/>
-              <w:end w:w="80" w:type="dxa"/>
+              <w:end w:w="120" w:type="dxa"/>
             </w:tcMar>
           </w:tcPr>
           <w:p>
             <w:pPr>
-              <w:spacing w:before="0" w:after="16" w:line="240" w:lineRule="auto"/>
+              <w:keepNext w:val="0"/>
+              <w:keepLines/>
+              <w:spacing w:before="0" w:after="40" w:line="252" w:lineRule="auto"/>
+              <w:ind w:left="0" w:right="0" w:firstLine="0"/>
             </w:pPr>
             <w:r>
               <w:rPr>
                 <w:rFonts w:ascii="Trebuchet MS" w:hAnsi="Trebuchet MS" w:eastAsia="Trebuchet MS" w:cs="Trebuchet MS"/>
+                <w:b w:val="0"/>
                 <w:i/>
                 <w:sz w:val="19"/>
               </w:rPr>
@@ -4654,35 +4664,26 @@
         </w:tc>
         <w:tc>
           <w:tcPr>
-            <w:tcW w:type="dxa" w:w="360"/>
-            <w:vAlign w:val="center"/>
+            <w:tcW w:type="dxa" w:w="5434"/>
+            <w:vAlign w:val="top"/>
             <w:tcMar>
               <w:top w:w="0" w:type="dxa"/>
-              <w:start w:w="0" w:type="dxa"/>
               <w:bottom w:w="0" w:type="dxa"/>
+              <w:start w:w="120" w:type="dxa"/>
               <w:end w:w="0" w:type="dxa"/>
-            </w:tcMar>
-          </w:tcPr>
-          <w:p/>
-        </w:tc>
-        <w:tc>
-          <w:tcPr>
-            <w:tcW w:type="dxa" w:w="4680"/>
-            <w:vAlign w:val="center"/>
-            <w:tcMar>
-              <w:top w:w="20" w:type="dxa"/>
-              <w:start w:w="0" w:type="dxa"/>
-              <w:bottom w:w="20" w:type="dxa"/>
-              <w:end w:w="80" w:type="dxa"/>
             </w:tcMar>
           </w:tcPr>
           <w:p>
             <w:pPr>
-              <w:spacing w:before="0" w:after="16" w:line="240" w:lineRule="auto"/>
+              <w:keepNext w:val="0"/>
+              <w:keepLines/>
+              <w:spacing w:before="0" w:after="40" w:line="252" w:lineRule="auto"/>
+              <w:ind w:left="0" w:right="0" w:firstLine="0"/>
             </w:pPr>
             <w:r>
               <w:rPr>
                 <w:rFonts w:ascii="Trebuchet MS" w:hAnsi="Trebuchet MS" w:eastAsia="Trebuchet MS" w:cs="Trebuchet MS"/>
+                <w:b w:val="0"/>
                 <w:i/>
                 <w:sz w:val="19"/>
               </w:rPr>
@@ -4692,24 +4693,31 @@
         </w:tc>
       </w:tr>
       <w:tr>
+        <w:trPr>
+          <w:cantSplit/>
+        </w:trPr>
         <w:tc>
           <w:tcPr>
-            <w:tcW w:type="dxa" w:w="4392"/>
-            <w:vAlign w:val="center"/>
+            <w:tcW w:type="dxa" w:w="5433"/>
+            <w:vAlign w:val="top"/>
             <w:tcMar>
-              <w:top w:w="20" w:type="dxa"/>
+              <w:top w:w="0" w:type="dxa"/>
+              <w:bottom w:w="0" w:type="dxa"/>
               <w:start w:w="0" w:type="dxa"/>
-              <w:bottom w:w="20" w:type="dxa"/>
-              <w:end w:w="80" w:type="dxa"/>
+              <w:end w:w="120" w:type="dxa"/>
             </w:tcMar>
           </w:tcPr>
           <w:p>
             <w:pPr>
-              <w:spacing w:before="0" w:after="16" w:line="240" w:lineRule="auto"/>
+              <w:keepNext w:val="0"/>
+              <w:keepLines/>
+              <w:spacing w:before="0" w:after="40" w:line="252" w:lineRule="auto"/>
+              <w:ind w:left="0" w:right="0" w:firstLine="0"/>
             </w:pPr>
             <w:r>
               <w:rPr>
                 <w:rFonts w:ascii="Trebuchet MS" w:hAnsi="Trebuchet MS" w:eastAsia="Trebuchet MS" w:cs="Trebuchet MS"/>
+                <w:b w:val="0"/>
                 <w:i/>
                 <w:sz w:val="19"/>
               </w:rPr>
@@ -4719,35 +4727,26 @@
         </w:tc>
         <w:tc>
           <w:tcPr>
-            <w:tcW w:type="dxa" w:w="360"/>
-            <w:vAlign w:val="center"/>
+            <w:tcW w:type="dxa" w:w="5434"/>
+            <w:vAlign w:val="top"/>
             <w:tcMar>
               <w:top w:w="0" w:type="dxa"/>
-              <w:start w:w="0" w:type="dxa"/>
               <w:bottom w:w="0" w:type="dxa"/>
+              <w:start w:w="120" w:type="dxa"/>
               <w:end w:w="0" w:type="dxa"/>
-            </w:tcMar>
-          </w:tcPr>
-          <w:p/>
-        </w:tc>
-        <w:tc>
-          <w:tcPr>
-            <w:tcW w:type="dxa" w:w="4680"/>
-            <w:vAlign w:val="center"/>
-            <w:tcMar>
-              <w:top w:w="20" w:type="dxa"/>
-              <w:start w:w="0" w:type="dxa"/>
-              <w:bottom w:w="20" w:type="dxa"/>
-              <w:end w:w="80" w:type="dxa"/>
             </w:tcMar>
           </w:tcPr>
           <w:p>
             <w:pPr>
-              <w:spacing w:before="0" w:after="16" w:line="240" w:lineRule="auto"/>
+              <w:keepNext w:val="0"/>
+              <w:keepLines/>
+              <w:spacing w:before="0" w:after="40" w:line="252" w:lineRule="auto"/>
+              <w:ind w:left="0" w:right="0" w:firstLine="0"/>
             </w:pPr>
             <w:r>
               <w:rPr>
                 <w:rFonts w:ascii="Trebuchet MS" w:hAnsi="Trebuchet MS" w:eastAsia="Trebuchet MS" w:cs="Trebuchet MS"/>
+                <w:b w:val="0"/>
                 <w:i/>
                 <w:sz w:val="19"/>
               </w:rPr>
@@ -4757,24 +4756,31 @@
         </w:tc>
       </w:tr>
       <w:tr>
+        <w:trPr>
+          <w:cantSplit/>
+        </w:trPr>
         <w:tc>
           <w:tcPr>
-            <w:tcW w:type="dxa" w:w="4392"/>
-            <w:vAlign w:val="center"/>
+            <w:tcW w:type="dxa" w:w="5433"/>
+            <w:vAlign w:val="top"/>
             <w:tcMar>
-              <w:top w:w="20" w:type="dxa"/>
+              <w:top w:w="0" w:type="dxa"/>
+              <w:bottom w:w="0" w:type="dxa"/>
               <w:start w:w="0" w:type="dxa"/>
-              <w:bottom w:w="20" w:type="dxa"/>
-              <w:end w:w="80" w:type="dxa"/>
+              <w:end w:w="120" w:type="dxa"/>
             </w:tcMar>
           </w:tcPr>
           <w:p>
             <w:pPr>
-              <w:spacing w:before="0" w:after="16" w:line="240" w:lineRule="auto"/>
+              <w:keepNext w:val="0"/>
+              <w:keepLines/>
+              <w:spacing w:before="0" w:after="40" w:line="252" w:lineRule="auto"/>
+              <w:ind w:left="0" w:right="0" w:firstLine="0"/>
             </w:pPr>
             <w:r>
               <w:rPr>
                 <w:rFonts w:ascii="Trebuchet MS" w:hAnsi="Trebuchet MS" w:eastAsia="Trebuchet MS" w:cs="Trebuchet MS"/>
+                <w:b w:val="0"/>
                 <w:i/>
                 <w:sz w:val="19"/>
               </w:rPr>
@@ -4784,35 +4790,26 @@
         </w:tc>
         <w:tc>
           <w:tcPr>
-            <w:tcW w:type="dxa" w:w="360"/>
-            <w:vAlign w:val="center"/>
+            <w:tcW w:type="dxa" w:w="5434"/>
+            <w:vAlign w:val="top"/>
             <w:tcMar>
               <w:top w:w="0" w:type="dxa"/>
-              <w:start w:w="0" w:type="dxa"/>
               <w:bottom w:w="0" w:type="dxa"/>
+              <w:start w:w="120" w:type="dxa"/>
               <w:end w:w="0" w:type="dxa"/>
-            </w:tcMar>
-          </w:tcPr>
-          <w:p/>
-        </w:tc>
-        <w:tc>
-          <w:tcPr>
-            <w:tcW w:type="dxa" w:w="4680"/>
-            <w:vAlign w:val="center"/>
-            <w:tcMar>
-              <w:top w:w="20" w:type="dxa"/>
-              <w:start w:w="0" w:type="dxa"/>
-              <w:bottom w:w="20" w:type="dxa"/>
-              <w:end w:w="80" w:type="dxa"/>
             </w:tcMar>
           </w:tcPr>
           <w:p>
             <w:pPr>
-              <w:spacing w:before="0" w:after="16" w:line="240" w:lineRule="auto"/>
+              <w:keepNext w:val="0"/>
+              <w:keepLines/>
+              <w:spacing w:before="0" w:after="40" w:line="252" w:lineRule="auto"/>
+              <w:ind w:left="0" w:right="0" w:firstLine="0"/>
             </w:pPr>
             <w:r>
               <w:rPr>
                 <w:rFonts w:ascii="Trebuchet MS" w:hAnsi="Trebuchet MS" w:eastAsia="Trebuchet MS" w:cs="Trebuchet MS"/>
+                <w:b w:val="0"/>
                 <w:i/>
                 <w:sz w:val="19"/>
               </w:rPr>
@@ -4822,24 +4819,31 @@
         </w:tc>
       </w:tr>
       <w:tr>
+        <w:trPr>
+          <w:cantSplit/>
+        </w:trPr>
         <w:tc>
           <w:tcPr>
-            <w:tcW w:type="dxa" w:w="4392"/>
-            <w:vAlign w:val="center"/>
+            <w:tcW w:type="dxa" w:w="5433"/>
+            <w:vAlign w:val="top"/>
             <w:tcMar>
-              <w:top w:w="20" w:type="dxa"/>
+              <w:top w:w="0" w:type="dxa"/>
+              <w:bottom w:w="0" w:type="dxa"/>
               <w:start w:w="0" w:type="dxa"/>
-              <w:bottom w:w="20" w:type="dxa"/>
-              <w:end w:w="80" w:type="dxa"/>
+              <w:end w:w="120" w:type="dxa"/>
             </w:tcMar>
           </w:tcPr>
           <w:p>
             <w:pPr>
-              <w:spacing w:before="0" w:after="16" w:line="240" w:lineRule="auto"/>
+              <w:keepNext w:val="0"/>
+              <w:keepLines/>
+              <w:spacing w:before="0" w:after="40" w:line="252" w:lineRule="auto"/>
+              <w:ind w:left="0" w:right="0" w:firstLine="0"/>
             </w:pPr>
             <w:r>
               <w:rPr>
                 <w:rFonts w:ascii="Trebuchet MS" w:hAnsi="Trebuchet MS" w:eastAsia="Trebuchet MS" w:cs="Trebuchet MS"/>
+                <w:b w:val="0"/>
                 <w:i/>
                 <w:sz w:val="19"/>
               </w:rPr>
@@ -4849,35 +4853,26 @@
         </w:tc>
         <w:tc>
           <w:tcPr>
-            <w:tcW w:type="dxa" w:w="360"/>
-            <w:vAlign w:val="center"/>
+            <w:tcW w:type="dxa" w:w="5434"/>
+            <w:vAlign w:val="top"/>
             <w:tcMar>
               <w:top w:w="0" w:type="dxa"/>
-              <w:start w:w="0" w:type="dxa"/>
               <w:bottom w:w="0" w:type="dxa"/>
+              <w:start w:w="120" w:type="dxa"/>
               <w:end w:w="0" w:type="dxa"/>
-            </w:tcMar>
-          </w:tcPr>
-          <w:p/>
-        </w:tc>
-        <w:tc>
-          <w:tcPr>
-            <w:tcW w:type="dxa" w:w="4680"/>
-            <w:vAlign w:val="center"/>
-            <w:tcMar>
-              <w:top w:w="20" w:type="dxa"/>
-              <w:start w:w="0" w:type="dxa"/>
-              <w:bottom w:w="20" w:type="dxa"/>
-              <w:end w:w="80" w:type="dxa"/>
             </w:tcMar>
           </w:tcPr>
           <w:p>
             <w:pPr>
-              <w:spacing w:before="0" w:after="16" w:line="240" w:lineRule="auto"/>
+              <w:keepNext w:val="0"/>
+              <w:keepLines/>
+              <w:spacing w:before="0" w:after="40" w:line="252" w:lineRule="auto"/>
+              <w:ind w:left="0" w:right="0" w:firstLine="0"/>
             </w:pPr>
             <w:r>
               <w:rPr>
                 <w:rFonts w:ascii="Trebuchet MS" w:hAnsi="Trebuchet MS" w:eastAsia="Trebuchet MS" w:cs="Trebuchet MS"/>
+                <w:b w:val="0"/>
                 <w:i/>
                 <w:sz w:val="19"/>
               </w:rPr>
@@ -4887,24 +4882,31 @@
         </w:tc>
       </w:tr>
       <w:tr>
+        <w:trPr>
+          <w:cantSplit/>
+        </w:trPr>
         <w:tc>
           <w:tcPr>
-            <w:tcW w:type="dxa" w:w="4392"/>
-            <w:vAlign w:val="center"/>
+            <w:tcW w:type="dxa" w:w="5433"/>
+            <w:vAlign w:val="top"/>
             <w:tcMar>
-              <w:top w:w="20" w:type="dxa"/>
+              <w:top w:w="0" w:type="dxa"/>
+              <w:bottom w:w="0" w:type="dxa"/>
               <w:start w:w="0" w:type="dxa"/>
-              <w:bottom w:w="20" w:type="dxa"/>
-              <w:end w:w="80" w:type="dxa"/>
+              <w:end w:w="120" w:type="dxa"/>
             </w:tcMar>
           </w:tcPr>
           <w:p>
             <w:pPr>
-              <w:spacing w:before="0" w:after="16" w:line="240" w:lineRule="auto"/>
+              <w:keepNext w:val="0"/>
+              <w:keepLines/>
+              <w:spacing w:before="0" w:after="40" w:line="252" w:lineRule="auto"/>
+              <w:ind w:left="0" w:right="0" w:firstLine="0"/>
             </w:pPr>
             <w:r>
               <w:rPr>
                 <w:rFonts w:ascii="Trebuchet MS" w:hAnsi="Trebuchet MS" w:eastAsia="Trebuchet MS" w:cs="Trebuchet MS"/>
+                <w:b w:val="0"/>
                 <w:i/>
                 <w:sz w:val="19"/>
               </w:rPr>
@@ -4914,35 +4916,26 @@
         </w:tc>
         <w:tc>
           <w:tcPr>
-            <w:tcW w:type="dxa" w:w="360"/>
-            <w:vAlign w:val="center"/>
+            <w:tcW w:type="dxa" w:w="5434"/>
+            <w:vAlign w:val="top"/>
             <w:tcMar>
               <w:top w:w="0" w:type="dxa"/>
-              <w:start w:w="0" w:type="dxa"/>
               <w:bottom w:w="0" w:type="dxa"/>
+              <w:start w:w="120" w:type="dxa"/>
               <w:end w:w="0" w:type="dxa"/>
-            </w:tcMar>
-          </w:tcPr>
-          <w:p/>
-        </w:tc>
-        <w:tc>
-          <w:tcPr>
-            <w:tcW w:type="dxa" w:w="4680"/>
-            <w:vAlign w:val="center"/>
-            <w:tcMar>
-              <w:top w:w="20" w:type="dxa"/>
-              <w:start w:w="0" w:type="dxa"/>
-              <w:bottom w:w="20" w:type="dxa"/>
-              <w:end w:w="80" w:type="dxa"/>
             </w:tcMar>
           </w:tcPr>
           <w:p>
             <w:pPr>
-              <w:spacing w:before="0" w:after="16" w:line="240" w:lineRule="auto"/>
+              <w:keepNext w:val="0"/>
+              <w:keepLines/>
+              <w:spacing w:before="0" w:after="40" w:line="252" w:lineRule="auto"/>
+              <w:ind w:left="0" w:right="0" w:firstLine="0"/>
             </w:pPr>
             <w:r>
               <w:rPr>
                 <w:rFonts w:ascii="Trebuchet MS" w:hAnsi="Trebuchet MS" w:eastAsia="Trebuchet MS" w:cs="Trebuchet MS"/>
+                <w:b w:val="0"/>
                 <w:i/>
                 <w:sz w:val="19"/>
               </w:rPr>
@@ -4952,24 +4945,31 @@
         </w:tc>
       </w:tr>
       <w:tr>
+        <w:trPr>
+          <w:cantSplit/>
+        </w:trPr>
         <w:tc>
           <w:tcPr>
-            <w:tcW w:type="dxa" w:w="4392"/>
-            <w:vAlign w:val="center"/>
+            <w:tcW w:type="dxa" w:w="5433"/>
+            <w:vAlign w:val="top"/>
             <w:tcMar>
-              <w:top w:w="20" w:type="dxa"/>
+              <w:top w:w="0" w:type="dxa"/>
+              <w:bottom w:w="0" w:type="dxa"/>
               <w:start w:w="0" w:type="dxa"/>
-              <w:bottom w:w="20" w:type="dxa"/>
-              <w:end w:w="80" w:type="dxa"/>
+              <w:end w:w="120" w:type="dxa"/>
             </w:tcMar>
           </w:tcPr>
           <w:p>
             <w:pPr>
-              <w:spacing w:before="0" w:after="16" w:line="240" w:lineRule="auto"/>
+              <w:keepNext w:val="0"/>
+              <w:keepLines/>
+              <w:spacing w:before="0" w:after="40" w:line="252" w:lineRule="auto"/>
+              <w:ind w:left="0" w:right="0" w:firstLine="0"/>
             </w:pPr>
             <w:r>
               <w:rPr>
                 <w:rFonts w:ascii="Trebuchet MS" w:hAnsi="Trebuchet MS" w:eastAsia="Trebuchet MS" w:cs="Trebuchet MS"/>
+                <w:b w:val="0"/>
                 <w:i/>
                 <w:sz w:val="19"/>
               </w:rPr>
@@ -4979,35 +4979,26 @@
         </w:tc>
         <w:tc>
           <w:tcPr>
-            <w:tcW w:type="dxa" w:w="360"/>
-            <w:vAlign w:val="center"/>
+            <w:tcW w:type="dxa" w:w="5434"/>
+            <w:vAlign w:val="top"/>
             <w:tcMar>
               <w:top w:w="0" w:type="dxa"/>
-              <w:start w:w="0" w:type="dxa"/>
               <w:bottom w:w="0" w:type="dxa"/>
+              <w:start w:w="120" w:type="dxa"/>
               <w:end w:w="0" w:type="dxa"/>
-            </w:tcMar>
-          </w:tcPr>
-          <w:p/>
-        </w:tc>
-        <w:tc>
-          <w:tcPr>
-            <w:tcW w:type="dxa" w:w="4680"/>
-            <w:vAlign w:val="center"/>
-            <w:tcMar>
-              <w:top w:w="20" w:type="dxa"/>
-              <w:start w:w="0" w:type="dxa"/>
-              <w:bottom w:w="20" w:type="dxa"/>
-              <w:end w:w="80" w:type="dxa"/>
             </w:tcMar>
           </w:tcPr>
           <w:p>
             <w:pPr>
-              <w:spacing w:before="0" w:after="16" w:line="240" w:lineRule="auto"/>
+              <w:keepNext w:val="0"/>
+              <w:keepLines/>
+              <w:spacing w:before="0" w:after="40" w:line="252" w:lineRule="auto"/>
+              <w:ind w:left="0" w:right="0" w:firstLine="0"/>
             </w:pPr>
             <w:r>
               <w:rPr>
                 <w:rFonts w:ascii="Trebuchet MS" w:hAnsi="Trebuchet MS" w:eastAsia="Trebuchet MS" w:cs="Trebuchet MS"/>
+                <w:b w:val="0"/>
                 <w:i/>
                 <w:sz w:val="19"/>
               </w:rPr>
@@ -5017,24 +5008,31 @@
         </w:tc>
       </w:tr>
       <w:tr>
+        <w:trPr>
+          <w:cantSplit/>
+        </w:trPr>
         <w:tc>
           <w:tcPr>
-            <w:tcW w:type="dxa" w:w="4392"/>
-            <w:vAlign w:val="center"/>
+            <w:tcW w:type="dxa" w:w="5433"/>
+            <w:vAlign w:val="top"/>
             <w:tcMar>
-              <w:top w:w="20" w:type="dxa"/>
+              <w:top w:w="0" w:type="dxa"/>
+              <w:bottom w:w="0" w:type="dxa"/>
               <w:start w:w="0" w:type="dxa"/>
-              <w:bottom w:w="20" w:type="dxa"/>
-              <w:end w:w="80" w:type="dxa"/>
+              <w:end w:w="120" w:type="dxa"/>
             </w:tcMar>
           </w:tcPr>
           <w:p>
             <w:pPr>
-              <w:spacing w:before="0" w:after="16" w:line="240" w:lineRule="auto"/>
+              <w:keepNext w:val="0"/>
+              <w:keepLines/>
+              <w:spacing w:before="0" w:after="40" w:line="252" w:lineRule="auto"/>
+              <w:ind w:left="0" w:right="0" w:firstLine="0"/>
             </w:pPr>
             <w:r>
               <w:rPr>
                 <w:rFonts w:ascii="Trebuchet MS" w:hAnsi="Trebuchet MS" w:eastAsia="Trebuchet MS" w:cs="Trebuchet MS"/>
+                <w:b w:val="0"/>
                 <w:i/>
                 <w:sz w:val="19"/>
               </w:rPr>
@@ -5044,35 +5042,26 @@
         </w:tc>
         <w:tc>
           <w:tcPr>
-            <w:tcW w:type="dxa" w:w="360"/>
-            <w:vAlign w:val="center"/>
+            <w:tcW w:type="dxa" w:w="5434"/>
+            <w:vAlign w:val="top"/>
             <w:tcMar>
               <w:top w:w="0" w:type="dxa"/>
-              <w:start w:w="0" w:type="dxa"/>
               <w:bottom w:w="0" w:type="dxa"/>
+              <w:start w:w="120" w:type="dxa"/>
               <w:end w:w="0" w:type="dxa"/>
-            </w:tcMar>
-          </w:tcPr>
-          <w:p/>
-        </w:tc>
-        <w:tc>
-          <w:tcPr>
-            <w:tcW w:type="dxa" w:w="4680"/>
-            <w:vAlign w:val="center"/>
-            <w:tcMar>
-              <w:top w:w="20" w:type="dxa"/>
-              <w:start w:w="0" w:type="dxa"/>
-              <w:bottom w:w="20" w:type="dxa"/>
-              <w:end w:w="80" w:type="dxa"/>
             </w:tcMar>
           </w:tcPr>
           <w:p>
             <w:pPr>
-              <w:spacing w:before="0" w:after="16" w:line="240" w:lineRule="auto"/>
+              <w:keepNext w:val="0"/>
+              <w:keepLines/>
+              <w:spacing w:before="0" w:after="40" w:line="252" w:lineRule="auto"/>
+              <w:ind w:left="0" w:right="0" w:firstLine="0"/>
             </w:pPr>
             <w:r>
               <w:rPr>
                 <w:rFonts w:ascii="Trebuchet MS" w:hAnsi="Trebuchet MS" w:eastAsia="Trebuchet MS" w:cs="Trebuchet MS"/>
+                <w:b w:val="0"/>
                 <w:i/>
                 <w:sz w:val="19"/>
               </w:rPr>
@@ -5082,24 +5071,31 @@
         </w:tc>
       </w:tr>
       <w:tr>
+        <w:trPr>
+          <w:cantSplit/>
+        </w:trPr>
         <w:tc>
           <w:tcPr>
-            <w:tcW w:type="dxa" w:w="4392"/>
-            <w:vAlign w:val="center"/>
+            <w:tcW w:type="dxa" w:w="5433"/>
+            <w:vAlign w:val="top"/>
             <w:tcMar>
-              <w:top w:w="20" w:type="dxa"/>
+              <w:top w:w="0" w:type="dxa"/>
+              <w:bottom w:w="0" w:type="dxa"/>
               <w:start w:w="0" w:type="dxa"/>
-              <w:bottom w:w="20" w:type="dxa"/>
-              <w:end w:w="80" w:type="dxa"/>
+              <w:end w:w="120" w:type="dxa"/>
             </w:tcMar>
           </w:tcPr>
           <w:p>
             <w:pPr>
-              <w:spacing w:before="0" w:after="16" w:line="240" w:lineRule="auto"/>
+              <w:keepNext w:val="0"/>
+              <w:keepLines/>
+              <w:spacing w:before="0" w:after="40" w:line="252" w:lineRule="auto"/>
+              <w:ind w:left="0" w:right="0" w:firstLine="0"/>
             </w:pPr>
             <w:r>
               <w:rPr>
                 <w:rFonts w:ascii="Trebuchet MS" w:hAnsi="Trebuchet MS" w:eastAsia="Trebuchet MS" w:cs="Trebuchet MS"/>
+                <w:b w:val="0"/>
                 <w:i/>
                 <w:sz w:val="19"/>
               </w:rPr>
@@ -5109,35 +5105,26 @@
         </w:tc>
         <w:tc>
           <w:tcPr>
-            <w:tcW w:type="dxa" w:w="360"/>
-            <w:vAlign w:val="center"/>
+            <w:tcW w:type="dxa" w:w="5434"/>
+            <w:vAlign w:val="top"/>
             <w:tcMar>
               <w:top w:w="0" w:type="dxa"/>
-              <w:start w:w="0" w:type="dxa"/>
               <w:bottom w:w="0" w:type="dxa"/>
+              <w:start w:w="120" w:type="dxa"/>
               <w:end w:w="0" w:type="dxa"/>
-            </w:tcMar>
-          </w:tcPr>
-          <w:p/>
-        </w:tc>
-        <w:tc>
-          <w:tcPr>
-            <w:tcW w:type="dxa" w:w="4680"/>
-            <w:vAlign w:val="center"/>
-            <w:tcMar>
-              <w:top w:w="20" w:type="dxa"/>
-              <w:start w:w="0" w:type="dxa"/>
-              <w:bottom w:w="20" w:type="dxa"/>
-              <w:end w:w="80" w:type="dxa"/>
             </w:tcMar>
           </w:tcPr>
           <w:p>
             <w:pPr>
-              <w:spacing w:before="0" w:after="16" w:line="240" w:lineRule="auto"/>
+              <w:keepNext w:val="0"/>
+              <w:keepLines/>
+              <w:spacing w:before="0" w:after="40" w:line="252" w:lineRule="auto"/>
+              <w:ind w:left="0" w:right="0" w:firstLine="0"/>
             </w:pPr>
             <w:r>
               <w:rPr>
                 <w:rFonts w:ascii="Trebuchet MS" w:hAnsi="Trebuchet MS" w:eastAsia="Trebuchet MS" w:cs="Trebuchet MS"/>
+                <w:b w:val="0"/>
                 <w:i/>
                 <w:sz w:val="19"/>
               </w:rPr>
@@ -5147,24 +5134,31 @@
         </w:tc>
       </w:tr>
       <w:tr>
+        <w:trPr>
+          <w:cantSplit/>
+        </w:trPr>
         <w:tc>
           <w:tcPr>
-            <w:tcW w:type="dxa" w:w="4392"/>
-            <w:vAlign w:val="center"/>
+            <w:tcW w:type="dxa" w:w="5433"/>
+            <w:vAlign w:val="top"/>
             <w:tcMar>
-              <w:top w:w="20" w:type="dxa"/>
+              <w:top w:w="0" w:type="dxa"/>
+              <w:bottom w:w="0" w:type="dxa"/>
               <w:start w:w="0" w:type="dxa"/>
-              <w:bottom w:w="20" w:type="dxa"/>
-              <w:end w:w="80" w:type="dxa"/>
+              <w:end w:w="120" w:type="dxa"/>
             </w:tcMar>
           </w:tcPr>
           <w:p>
             <w:pPr>
-              <w:spacing w:before="0" w:after="16" w:line="240" w:lineRule="auto"/>
+              <w:keepNext w:val="0"/>
+              <w:keepLines/>
+              <w:spacing w:before="0" w:after="40" w:line="252" w:lineRule="auto"/>
+              <w:ind w:left="0" w:right="0" w:firstLine="0"/>
             </w:pPr>
             <w:r>
               <w:rPr>
                 <w:rFonts w:ascii="Trebuchet MS" w:hAnsi="Trebuchet MS" w:eastAsia="Trebuchet MS" w:cs="Trebuchet MS"/>
+                <w:b w:val="0"/>
                 <w:i/>
                 <w:sz w:val="19"/>
               </w:rPr>
@@ -5174,35 +5168,26 @@
         </w:tc>
         <w:tc>
           <w:tcPr>
-            <w:tcW w:type="dxa" w:w="360"/>
-            <w:vAlign w:val="center"/>
+            <w:tcW w:type="dxa" w:w="5434"/>
+            <w:vAlign w:val="top"/>
             <w:tcMar>
               <w:top w:w="0" w:type="dxa"/>
-              <w:start w:w="0" w:type="dxa"/>
               <w:bottom w:w="0" w:type="dxa"/>
+              <w:start w:w="120" w:type="dxa"/>
               <w:end w:w="0" w:type="dxa"/>
-            </w:tcMar>
-          </w:tcPr>
-          <w:p/>
-        </w:tc>
-        <w:tc>
-          <w:tcPr>
-            <w:tcW w:type="dxa" w:w="4680"/>
-            <w:vAlign w:val="center"/>
-            <w:tcMar>
-              <w:top w:w="20" w:type="dxa"/>
-              <w:start w:w="0" w:type="dxa"/>
-              <w:bottom w:w="20" w:type="dxa"/>
-              <w:end w:w="80" w:type="dxa"/>
             </w:tcMar>
           </w:tcPr>
           <w:p>
             <w:pPr>
-              <w:spacing w:before="0" w:after="16" w:line="240" w:lineRule="auto"/>
+              <w:keepNext w:val="0"/>
+              <w:keepLines/>
+              <w:spacing w:before="0" w:after="40" w:line="252" w:lineRule="auto"/>
+              <w:ind w:left="0" w:right="0" w:firstLine="0"/>
             </w:pPr>
             <w:r>
               <w:rPr>
                 <w:rFonts w:ascii="Trebuchet MS" w:hAnsi="Trebuchet MS" w:eastAsia="Trebuchet MS" w:cs="Trebuchet MS"/>
+                <w:b w:val="0"/>
                 <w:i/>
                 <w:sz w:val="19"/>
               </w:rPr>
@@ -5212,24 +5197,31 @@
         </w:tc>
       </w:tr>
       <w:tr>
+        <w:trPr>
+          <w:cantSplit/>
+        </w:trPr>
         <w:tc>
           <w:tcPr>
-            <w:tcW w:type="dxa" w:w="4392"/>
-            <w:vAlign w:val="center"/>
+            <w:tcW w:type="dxa" w:w="5433"/>
+            <w:vAlign w:val="top"/>
             <w:tcMar>
-              <w:top w:w="20" w:type="dxa"/>
+              <w:top w:w="0" w:type="dxa"/>
+              <w:bottom w:w="0" w:type="dxa"/>
               <w:start w:w="0" w:type="dxa"/>
-              <w:bottom w:w="20" w:type="dxa"/>
-              <w:end w:w="80" w:type="dxa"/>
+              <w:end w:w="120" w:type="dxa"/>
             </w:tcMar>
           </w:tcPr>
           <w:p>
             <w:pPr>
-              <w:spacing w:before="0" w:after="16" w:line="240" w:lineRule="auto"/>
+              <w:keepNext w:val="0"/>
+              <w:keepLines/>
+              <w:spacing w:before="0" w:after="40" w:line="252" w:lineRule="auto"/>
+              <w:ind w:left="0" w:right="0" w:firstLine="0"/>
             </w:pPr>
             <w:r>
               <w:rPr>
                 <w:rFonts w:ascii="Trebuchet MS" w:hAnsi="Trebuchet MS" w:eastAsia="Trebuchet MS" w:cs="Trebuchet MS"/>
+                <w:b w:val="0"/>
                 <w:i/>
                 <w:sz w:val="19"/>
               </w:rPr>
@@ -5239,35 +5231,26 @@
         </w:tc>
         <w:tc>
           <w:tcPr>
-            <w:tcW w:type="dxa" w:w="360"/>
-            <w:vAlign w:val="center"/>
+            <w:tcW w:type="dxa" w:w="5434"/>
+            <w:vAlign w:val="top"/>
             <w:tcMar>
               <w:top w:w="0" w:type="dxa"/>
-              <w:start w:w="0" w:type="dxa"/>
               <w:bottom w:w="0" w:type="dxa"/>
+              <w:start w:w="120" w:type="dxa"/>
               <w:end w:w="0" w:type="dxa"/>
-            </w:tcMar>
-          </w:tcPr>
-          <w:p/>
-        </w:tc>
-        <w:tc>
-          <w:tcPr>
-            <w:tcW w:type="dxa" w:w="4680"/>
-            <w:vAlign w:val="center"/>
-            <w:tcMar>
-              <w:top w:w="20" w:type="dxa"/>
-              <w:start w:w="0" w:type="dxa"/>
-              <w:bottom w:w="20" w:type="dxa"/>
-              <w:end w:w="80" w:type="dxa"/>
             </w:tcMar>
           </w:tcPr>
           <w:p>
             <w:pPr>
-              <w:spacing w:before="0" w:after="16" w:line="240" w:lineRule="auto"/>
+              <w:keepNext w:val="0"/>
+              <w:keepLines/>
+              <w:spacing w:before="0" w:after="40" w:line="252" w:lineRule="auto"/>
+              <w:ind w:left="0" w:right="0" w:firstLine="0"/>
             </w:pPr>
             <w:r>
               <w:rPr>
                 <w:rFonts w:ascii="Trebuchet MS" w:hAnsi="Trebuchet MS" w:eastAsia="Trebuchet MS" w:cs="Trebuchet MS"/>
+                <w:b w:val="0"/>
                 <w:i/>
                 <w:sz w:val="19"/>
               </w:rPr>
@@ -5277,24 +5260,31 @@
         </w:tc>
       </w:tr>
       <w:tr>
+        <w:trPr>
+          <w:cantSplit/>
+        </w:trPr>
         <w:tc>
           <w:tcPr>
-            <w:tcW w:type="dxa" w:w="4392"/>
-            <w:vAlign w:val="center"/>
+            <w:tcW w:type="dxa" w:w="5433"/>
+            <w:vAlign w:val="top"/>
             <w:tcMar>
-              <w:top w:w="20" w:type="dxa"/>
+              <w:top w:w="0" w:type="dxa"/>
+              <w:bottom w:w="0" w:type="dxa"/>
               <w:start w:w="0" w:type="dxa"/>
-              <w:bottom w:w="20" w:type="dxa"/>
-              <w:end w:w="80" w:type="dxa"/>
+              <w:end w:w="120" w:type="dxa"/>
             </w:tcMar>
           </w:tcPr>
           <w:p>
             <w:pPr>
-              <w:spacing w:before="0" w:after="16" w:line="240" w:lineRule="auto"/>
+              <w:keepNext w:val="0"/>
+              <w:keepLines/>
+              <w:spacing w:before="0" w:after="40" w:line="252" w:lineRule="auto"/>
+              <w:ind w:left="0" w:right="0" w:firstLine="0"/>
             </w:pPr>
             <w:r>
               <w:rPr>
                 <w:rFonts w:ascii="Trebuchet MS" w:hAnsi="Trebuchet MS" w:eastAsia="Trebuchet MS" w:cs="Trebuchet MS"/>
+                <w:b w:val="0"/>
                 <w:i/>
                 <w:sz w:val="19"/>
               </w:rPr>
@@ -5304,35 +5294,26 @@
         </w:tc>
         <w:tc>
           <w:tcPr>
-            <w:tcW w:type="dxa" w:w="360"/>
-            <w:vAlign w:val="center"/>
+            <w:tcW w:type="dxa" w:w="5434"/>
+            <w:vAlign w:val="top"/>
             <w:tcMar>
               <w:top w:w="0" w:type="dxa"/>
-              <w:start w:w="0" w:type="dxa"/>
               <w:bottom w:w="0" w:type="dxa"/>
+              <w:start w:w="120" w:type="dxa"/>
               <w:end w:w="0" w:type="dxa"/>
-            </w:tcMar>
-          </w:tcPr>
-          <w:p/>
-        </w:tc>
-        <w:tc>
-          <w:tcPr>
-            <w:tcW w:type="dxa" w:w="4680"/>
-            <w:vAlign w:val="center"/>
-            <w:tcMar>
-              <w:top w:w="20" w:type="dxa"/>
-              <w:start w:w="0" w:type="dxa"/>
-              <w:bottom w:w="20" w:type="dxa"/>
-              <w:end w:w="80" w:type="dxa"/>
             </w:tcMar>
           </w:tcPr>
           <w:p>
             <w:pPr>
-              <w:spacing w:before="0" w:after="16" w:line="240" w:lineRule="auto"/>
+              <w:keepNext w:val="0"/>
+              <w:keepLines/>
+              <w:spacing w:before="0" w:after="40" w:line="252" w:lineRule="auto"/>
+              <w:ind w:left="0" w:right="0" w:firstLine="0"/>
             </w:pPr>
             <w:r>
               <w:rPr>
                 <w:rFonts w:ascii="Trebuchet MS" w:hAnsi="Trebuchet MS" w:eastAsia="Trebuchet MS" w:cs="Trebuchet MS"/>
+                <w:b w:val="0"/>
                 <w:i/>
                 <w:sz w:val="19"/>
               </w:rPr>
@@ -5342,24 +5323,31 @@
         </w:tc>
       </w:tr>
       <w:tr>
+        <w:trPr>
+          <w:cantSplit/>
+        </w:trPr>
         <w:tc>
           <w:tcPr>
-            <w:tcW w:type="dxa" w:w="4392"/>
-            <w:vAlign w:val="center"/>
+            <w:tcW w:type="dxa" w:w="5433"/>
+            <w:vAlign w:val="top"/>
             <w:tcMar>
-              <w:top w:w="20" w:type="dxa"/>
+              <w:top w:w="0" w:type="dxa"/>
+              <w:bottom w:w="0" w:type="dxa"/>
               <w:start w:w="0" w:type="dxa"/>
-              <w:bottom w:w="20" w:type="dxa"/>
-              <w:end w:w="80" w:type="dxa"/>
+              <w:end w:w="120" w:type="dxa"/>
             </w:tcMar>
           </w:tcPr>
           <w:p>
             <w:pPr>
-              <w:spacing w:before="0" w:after="16" w:line="240" w:lineRule="auto"/>
+              <w:keepNext w:val="0"/>
+              <w:keepLines/>
+              <w:spacing w:before="0" w:after="40" w:line="252" w:lineRule="auto"/>
+              <w:ind w:left="0" w:right="0" w:firstLine="0"/>
             </w:pPr>
             <w:r>
               <w:rPr>
                 <w:rFonts w:ascii="Trebuchet MS" w:hAnsi="Trebuchet MS" w:eastAsia="Trebuchet MS" w:cs="Trebuchet MS"/>
+                <w:b w:val="0"/>
                 <w:i/>
                 <w:sz w:val="19"/>
               </w:rPr>
@@ -5369,35 +5357,26 @@
         </w:tc>
         <w:tc>
           <w:tcPr>
-            <w:tcW w:type="dxa" w:w="360"/>
-            <w:vAlign w:val="center"/>
+            <w:tcW w:type="dxa" w:w="5434"/>
+            <w:vAlign w:val="top"/>
             <w:tcMar>
               <w:top w:w="0" w:type="dxa"/>
-              <w:start w:w="0" w:type="dxa"/>
               <w:bottom w:w="0" w:type="dxa"/>
+              <w:start w:w="120" w:type="dxa"/>
               <w:end w:w="0" w:type="dxa"/>
-            </w:tcMar>
-          </w:tcPr>
-          <w:p/>
-        </w:tc>
-        <w:tc>
-          <w:tcPr>
-            <w:tcW w:type="dxa" w:w="4680"/>
-            <w:vAlign w:val="center"/>
-            <w:tcMar>
-              <w:top w:w="20" w:type="dxa"/>
-              <w:start w:w="0" w:type="dxa"/>
-              <w:bottom w:w="20" w:type="dxa"/>
-              <w:end w:w="80" w:type="dxa"/>
             </w:tcMar>
           </w:tcPr>
           <w:p>
             <w:pPr>
-              <w:spacing w:before="0" w:after="16" w:line="240" w:lineRule="auto"/>
+              <w:keepNext w:val="0"/>
+              <w:keepLines/>
+              <w:spacing w:before="0" w:after="40" w:line="252" w:lineRule="auto"/>
+              <w:ind w:left="0" w:right="0" w:firstLine="0"/>
             </w:pPr>
             <w:r>
               <w:rPr>
                 <w:rFonts w:ascii="Trebuchet MS" w:hAnsi="Trebuchet MS" w:eastAsia="Trebuchet MS" w:cs="Trebuchet MS"/>
+                <w:b w:val="0"/>
                 <w:i/>
                 <w:sz w:val="19"/>
               </w:rPr>

</xml_diff>